<commit_message>
Exemple de rapport refait avec les seules données réelles de la BAB
Co-Authored-By: Claude Opus 5.5 <noreply@anthropic.com>
Claude-Session: https://claude.ai/code/session_01SWrbG3FCmCSmsWcz6vtx2N
</commit_message>
<xml_diff>
--- a/donnees/Exemple_rapport_BAB.docx
+++ b/donnees/Exemple_rapport_BAB.docx
@@ -7,7 +7,7 @@
         <w:pStyle w:val="Title"/>
       </w:pPr>
       <w:r>
-        <w:t xml:space="preserve">Analyse BAB</w:t>
+        <w:t xml:space="preserve">Analyse financière de Banque Atlantique Bénin</w:t>
       </w:r>
     </w:p>
     <w:p>
@@ -16,14 +16,6 @@
           <w:color w:val="45524B"/>
         </w:rPr>
         <w:t xml:space="preserve">Bénin · Exercices 2021 à 2023 · Montants en millions FCFA</w:t>
-      </w:r>
-    </w:p>
-    <w:p>
-      <w:r>
-        <w:rPr>
-          <w:color w:val="45524B"/>
-        </w:rPr>
-        <w:t xml:space="preserve">Réalisé par Isaac</w:t>
       </w:r>
     </w:p>
     <w:p>
@@ -339,7 +331,7 @@
                 <w:sz w:val="18"/>
                 <w:szCs w:val="18"/>
               </w:rPr>
-              <w:t xml:space="preserve">19 620</w:t>
+              <w:t xml:space="preserve">—</w:t>
             </w:r>
           </w:p>
         </w:tc>
@@ -357,7 +349,7 @@
                 <w:sz w:val="18"/>
                 <w:szCs w:val="18"/>
               </w:rPr>
-              <w:t xml:space="preserve">+12,3 %</w:t>
+              <w:t xml:space="preserve">—</w:t>
             </w:r>
           </w:p>
         </w:tc>
@@ -649,7 +641,7 @@
                 <w:sz w:val="18"/>
                 <w:szCs w:val="18"/>
               </w:rPr>
-              <w:t xml:space="preserve">12,15 %</w:t>
+              <w:t xml:space="preserve">14,16 %</w:t>
             </w:r>
           </w:p>
         </w:tc>
@@ -667,7 +659,7 @@
                 <w:sz w:val="18"/>
                 <w:szCs w:val="18"/>
               </w:rPr>
-              <w:t xml:space="preserve">+0,69 pt</w:t>
+              <w:t xml:space="preserve">+0,80 pt</w:t>
             </w:r>
           </w:p>
         </w:tc>
@@ -682,11 +674,11 @@
             </w:pPr>
             <w:r>
               <w:rPr>
-                <w:color w:val="8F5500"/>
-                <w:sz w:val="18"/>
-                <w:szCs w:val="18"/>
-              </w:rPr>
-              <w:t xml:space="preserve">! Marge faible</w:t>
+                <w:color w:val="1A7642"/>
+                <w:sz w:val="18"/>
+                <w:szCs w:val="18"/>
+              </w:rPr>
+              <w:t xml:space="preserve">✓ Conforme</w:t>
             </w:r>
           </w:p>
         </w:tc>
@@ -961,7 +953,7 @@
                 <w:sz w:val="18"/>
                 <w:szCs w:val="18"/>
               </w:rPr>
-              <w:t xml:space="preserve">58,61 %</w:t>
+              <w:t xml:space="preserve">—</w:t>
             </w:r>
           </w:p>
         </w:tc>
@@ -979,7 +971,7 @@
                 <w:sz w:val="18"/>
                 <w:szCs w:val="18"/>
               </w:rPr>
-              <w:t xml:space="preserve">−3,78 pt</w:t>
+              <w:t xml:space="preserve">—</w:t>
             </w:r>
           </w:p>
         </w:tc>
@@ -994,11 +986,11 @@
             </w:pPr>
             <w:r>
               <w:rPr>
-                <w:color w:val="8F5500"/>
-                <w:sz w:val="18"/>
-                <w:szCs w:val="18"/>
-              </w:rPr>
-              <w:t xml:space="preserve">! Marge faible</w:t>
+                <w:color w:val="6B7770"/>
+                <w:sz w:val="18"/>
+                <w:szCs w:val="18"/>
+              </w:rPr>
+              <w:t xml:space="preserve">Non calculé</w:t>
             </w:r>
           </w:p>
         </w:tc>
@@ -1016,6 +1008,23 @@
       </w:pPr>
       <w:r>
         <w:t xml:space="preserve">Points forts</w:t>
+      </w:r>
+    </w:p>
+    <w:p>
+      <w:pPr>
+        <w:ind w:left="360" w:hanging="220"/>
+      </w:pPr>
+      <w:r>
+        <w:t xml:space="preserve">•  </w:t>
+      </w:r>
+      <w:r>
+        <w:rPr>
+          <w:b/>
+        </w:rPr>
+        <w:t xml:space="preserve">Ratio de solvabilité global</w:t>
+      </w:r>
+      <w:r>
+        <w:t xml:space="preserve"> à 14,16 % (+0,80 pt sur un an), en amélioration.</w:t>
       </w:r>
     </w:p>
     <w:p>
@@ -1032,7 +1041,7 @@
         <w:t xml:space="preserve">Ratio CET1</w:t>
       </w:r>
       <w:r>
-        <w:t xml:space="preserve"> à 11,48 % (+0,72 pt sur un an), en amélioration.</w:t>
+        <w:t xml:space="preserve"> à 13,38 % (+0,84 pt sur un an), en amélioration.</w:t>
       </w:r>
     </w:p>
     <w:p>
@@ -1123,23 +1132,6 @@
         <w:rPr>
           <w:b/>
         </w:rPr>
-        <w:t xml:space="preserve">Ratio de solvabilité global</w:t>
-      </w:r>
-      <w:r>
-        <w:t xml:space="preserve"> à 12,15 % (+0,69 pt sur un an) : proche du seuil.</w:t>
-      </w:r>
-    </w:p>
-    <w:p>
-      <w:pPr>
-        <w:ind w:left="360" w:hanging="220"/>
-      </w:pPr>
-      <w:r>
-        <w:t xml:space="preserve">•  </w:t>
-      </w:r>
-      <w:r>
-        <w:rPr>
-          <w:b/>
-        </w:rPr>
         <w:t xml:space="preserve">Ratio de transformation</w:t>
       </w:r>
       <w:r>
@@ -1191,63 +1183,10 @@
         <w:rPr>
           <w:b/>
         </w:rPr>
-        <w:t xml:space="preserve">Coefficient d'exploitation</w:t>
-      </w:r>
-      <w:r>
-        <w:t xml:space="preserve"> à 58,61 % (−3,78 pt sur un an) : proche du seuil.</w:t>
-      </w:r>
-    </w:p>
-    <w:p>
-      <w:pPr>
-        <w:ind w:left="360" w:hanging="220"/>
-      </w:pPr>
-      <w:r>
-        <w:t xml:space="preserve">•  </w:t>
-      </w:r>
-      <w:r>
-        <w:rPr>
-          <w:b/>
-        </w:rPr>
-        <w:t xml:space="preserve">Coût du risque / crédits</w:t>
-      </w:r>
-      <w:r>
-        <w:t xml:space="preserve"> à 1,39 % (+0,70 pt sur un an) : dégradation marquée.</w:t>
-      </w:r>
-    </w:p>
-    <w:p>
-      <w:pPr>
-        <w:ind w:left="360" w:hanging="220"/>
-      </w:pPr>
-      <w:r>
-        <w:t xml:space="preserve">•  </w:t>
-      </w:r>
-      <w:r>
-        <w:rPr>
-          <w:b/>
-        </w:rPr>
         <w:t xml:space="preserve">Capital réduit</w:t>
       </w:r>
       <w:r>
         <w:t xml:space="preserve"> de 28 000 à 20 563 M en 2023 : opération probable d’apurement des pertes (réduction de capital).</w:t>
-      </w:r>
-    </w:p>
-    <w:p>
-      <w:pPr>
-        <w:pStyle w:val="Heading2"/>
-        <w:keepNext/>
-      </w:pPr>
-      <w:r>
-        <w:t xml:space="preserve">Commentaire de l’analyste</w:t>
-      </w:r>
-    </w:p>
-    <w:p>
-      <w:r>
-        <w:t xml:space="preserve">Banque en redressement.</w:t>
-      </w:r>
-    </w:p>
-    <w:p>
-      <w:r>
-        <w:t xml:space="preserve">À suivre.</w:t>
       </w:r>
     </w:p>
     <w:p>
@@ -5715,7 +5654,7 @@
                 <w:sz w:val="18"/>
                 <w:szCs w:val="18"/>
               </w:rPr>
-              <w:t xml:space="preserve">20 000</w:t>
+              <w:t xml:space="preserve">—</w:t>
             </w:r>
           </w:p>
         </w:tc>
@@ -5733,7 +5672,7 @@
                 <w:sz w:val="18"/>
                 <w:szCs w:val="18"/>
               </w:rPr>
-              <w:t xml:space="preserve">21 000</w:t>
+              <w:t xml:space="preserve">—</w:t>
             </w:r>
           </w:p>
         </w:tc>
@@ -5751,7 +5690,7 @@
                 <w:sz w:val="18"/>
                 <w:szCs w:val="18"/>
               </w:rPr>
-              <w:t xml:space="preserve">23 000</w:t>
+              <w:t xml:space="preserve">—</w:t>
             </w:r>
           </w:p>
         </w:tc>
@@ -5769,7 +5708,7 @@
                 <w:sz w:val="18"/>
                 <w:szCs w:val="18"/>
               </w:rPr>
-              <w:t xml:space="preserve">+5,0 %</w:t>
+              <w:t xml:space="preserve">—</w:t>
             </w:r>
           </w:p>
         </w:tc>
@@ -5787,7 +5726,7 @@
                 <w:sz w:val="18"/>
                 <w:szCs w:val="18"/>
               </w:rPr>
-              <w:t xml:space="preserve">+9,5 %</w:t>
+              <w:t xml:space="preserve">—</w:t>
             </w:r>
           </w:p>
         </w:tc>
@@ -5828,7 +5767,7 @@
                 <w:sz w:val="18"/>
                 <w:szCs w:val="18"/>
               </w:rPr>
-              <w:t xml:space="preserve">8 000</w:t>
+              <w:t xml:space="preserve">—</w:t>
             </w:r>
           </w:p>
         </w:tc>
@@ -5846,7 +5785,7 @@
                 <w:sz w:val="18"/>
                 <w:szCs w:val="18"/>
               </w:rPr>
-              <w:t xml:space="preserve">8 200</w:t>
+              <w:t xml:space="preserve">—</w:t>
             </w:r>
           </w:p>
         </w:tc>
@@ -5864,7 +5803,7 @@
                 <w:sz w:val="18"/>
                 <w:szCs w:val="18"/>
               </w:rPr>
-              <w:t xml:space="preserve">9 000</w:t>
+              <w:t xml:space="preserve">—</w:t>
             </w:r>
           </w:p>
         </w:tc>
@@ -5882,7 +5821,7 @@
                 <w:sz w:val="18"/>
                 <w:szCs w:val="18"/>
               </w:rPr>
-              <w:t xml:space="preserve">+2,5 %</w:t>
+              <w:t xml:space="preserve">—</w:t>
             </w:r>
           </w:p>
         </w:tc>
@@ -5900,7 +5839,7 @@
                 <w:sz w:val="18"/>
                 <w:szCs w:val="18"/>
               </w:rPr>
-              <w:t xml:space="preserve">+9,8 %</w:t>
+              <w:t xml:space="preserve">—</w:t>
             </w:r>
           </w:p>
         </w:tc>
@@ -5945,7 +5884,7 @@
                 <w:sz w:val="18"/>
                 <w:szCs w:val="18"/>
               </w:rPr>
-              <w:t xml:space="preserve">12 000</w:t>
+              <w:t xml:space="preserve">—</w:t>
             </w:r>
           </w:p>
         </w:tc>
@@ -5965,7 +5904,7 @@
                 <w:sz w:val="18"/>
                 <w:szCs w:val="18"/>
               </w:rPr>
-              <w:t xml:space="preserve">12 800</w:t>
+              <w:t xml:space="preserve">—</w:t>
             </w:r>
           </w:p>
         </w:tc>
@@ -5985,7 +5924,7 @@
                 <w:sz w:val="18"/>
                 <w:szCs w:val="18"/>
               </w:rPr>
-              <w:t xml:space="preserve">14 000</w:t>
+              <w:t xml:space="preserve">—</w:t>
             </w:r>
           </w:p>
         </w:tc>
@@ -6005,7 +5944,7 @@
                 <w:sz w:val="18"/>
                 <w:szCs w:val="18"/>
               </w:rPr>
-              <w:t xml:space="preserve">+6,7 %</w:t>
+              <w:t xml:space="preserve">—</w:t>
             </w:r>
           </w:p>
         </w:tc>
@@ -6025,7 +5964,7 @@
                 <w:sz w:val="18"/>
                 <w:szCs w:val="18"/>
               </w:rPr>
-              <w:t xml:space="preserve">+9,4 %</w:t>
+              <w:t xml:space="preserve">—</w:t>
             </w:r>
           </w:p>
         </w:tc>
@@ -6066,7 +6005,7 @@
                 <w:sz w:val="18"/>
                 <w:szCs w:val="18"/>
               </w:rPr>
-              <w:t xml:space="preserve">100</w:t>
+              <w:t xml:space="preserve">—</w:t>
             </w:r>
           </w:p>
         </w:tc>
@@ -6084,7 +6023,7 @@
                 <w:sz w:val="18"/>
                 <w:szCs w:val="18"/>
               </w:rPr>
-              <w:t xml:space="preserve">120</w:t>
+              <w:t xml:space="preserve">—</w:t>
             </w:r>
           </w:p>
         </w:tc>
@@ -6102,7 +6041,7 @@
                 <w:sz w:val="18"/>
                 <w:szCs w:val="18"/>
               </w:rPr>
-              <w:t xml:space="preserve">90</w:t>
+              <w:t xml:space="preserve">—</w:t>
             </w:r>
           </w:p>
         </w:tc>
@@ -6120,7 +6059,7 @@
                 <w:sz w:val="18"/>
                 <w:szCs w:val="18"/>
               </w:rPr>
-              <w:t xml:space="preserve">+20,0 %</w:t>
+              <w:t xml:space="preserve">—</w:t>
             </w:r>
           </w:p>
         </w:tc>
@@ -6138,7 +6077,7 @@
                 <w:sz w:val="18"/>
                 <w:szCs w:val="18"/>
               </w:rPr>
-              <w:t xml:space="preserve">−25,0 %</w:t>
+              <w:t xml:space="preserve">—</w:t>
             </w:r>
           </w:p>
         </w:tc>
@@ -6292,7 +6231,7 @@
                 <w:sz w:val="18"/>
                 <w:szCs w:val="18"/>
               </w:rPr>
-              <w:t xml:space="preserve">500</w:t>
+              <w:t xml:space="preserve">—</w:t>
             </w:r>
           </w:p>
         </w:tc>
@@ -6310,7 +6249,7 @@
                 <w:sz w:val="18"/>
                 <w:szCs w:val="18"/>
               </w:rPr>
-              <w:t xml:space="preserve">520</w:t>
+              <w:t xml:space="preserve">—</w:t>
             </w:r>
           </w:p>
         </w:tc>
@@ -6328,7 +6267,7 @@
                 <w:sz w:val="18"/>
                 <w:szCs w:val="18"/>
               </w:rPr>
-              <w:t xml:space="preserve">600</w:t>
+              <w:t xml:space="preserve">—</w:t>
             </w:r>
           </w:p>
         </w:tc>
@@ -6346,7 +6285,7 @@
                 <w:sz w:val="18"/>
                 <w:szCs w:val="18"/>
               </w:rPr>
-              <w:t xml:space="preserve">+4,0 %</w:t>
+              <w:t xml:space="preserve">—</w:t>
             </w:r>
           </w:p>
         </w:tc>
@@ -6364,7 +6303,7 @@
                 <w:sz w:val="18"/>
                 <w:szCs w:val="18"/>
               </w:rPr>
-              <w:t xml:space="preserve">+15,4 %</w:t>
+              <w:t xml:space="preserve">—</w:t>
             </w:r>
           </w:p>
         </w:tc>
@@ -6405,7 +6344,7 @@
                 <w:sz w:val="18"/>
                 <w:szCs w:val="18"/>
               </w:rPr>
-              <w:t xml:space="preserve">200</w:t>
+              <w:t xml:space="preserve">—</w:t>
             </w:r>
           </w:p>
         </w:tc>
@@ -6423,7 +6362,7 @@
                 <w:sz w:val="18"/>
                 <w:szCs w:val="18"/>
               </w:rPr>
-              <w:t xml:space="preserve">−50</w:t>
+              <w:t xml:space="preserve">—</w:t>
             </w:r>
           </w:p>
         </w:tc>
@@ -6441,7 +6380,7 @@
                 <w:sz w:val="18"/>
                 <w:szCs w:val="18"/>
               </w:rPr>
-              <w:t xml:space="preserve">300</w:t>
+              <w:t xml:space="preserve">—</w:t>
             </w:r>
           </w:p>
         </w:tc>
@@ -6459,7 +6398,7 @@
                 <w:sz w:val="18"/>
                 <w:szCs w:val="18"/>
               </w:rPr>
-              <w:t xml:space="preserve">−125,0 %</w:t>
+              <w:t xml:space="preserve">—</w:t>
             </w:r>
           </w:p>
         </w:tc>
@@ -6477,7 +6416,7 @@
                 <w:sz w:val="18"/>
                 <w:szCs w:val="18"/>
               </w:rPr>
-              <w:t xml:space="preserve">+700,0 %</w:t>
+              <w:t xml:space="preserve">—</w:t>
             </w:r>
           </w:p>
         </w:tc>
@@ -6518,7 +6457,7 @@
                 <w:sz w:val="18"/>
                 <w:szCs w:val="18"/>
               </w:rPr>
-              <w:t xml:space="preserve">100</w:t>
+              <w:t xml:space="preserve">—</w:t>
             </w:r>
           </w:p>
         </w:tc>
@@ -6536,7 +6475,7 @@
                 <w:sz w:val="18"/>
                 <w:szCs w:val="18"/>
               </w:rPr>
-              <w:t xml:space="preserve">100</w:t>
+              <w:t xml:space="preserve">—</w:t>
             </w:r>
           </w:p>
         </w:tc>
@@ -6554,7 +6493,7 @@
                 <w:sz w:val="18"/>
                 <w:szCs w:val="18"/>
               </w:rPr>
-              <w:t xml:space="preserve">100</w:t>
+              <w:t xml:space="preserve">—</w:t>
             </w:r>
           </w:p>
         </w:tc>
@@ -6572,7 +6511,7 @@
                 <w:sz w:val="18"/>
                 <w:szCs w:val="18"/>
               </w:rPr>
-              <w:t xml:space="preserve">+0,0 %</w:t>
+              <w:t xml:space="preserve">—</w:t>
             </w:r>
           </w:p>
         </w:tc>
@@ -6590,7 +6529,7 @@
                 <w:sz w:val="18"/>
                 <w:szCs w:val="18"/>
               </w:rPr>
-              <w:t xml:space="preserve">+0,0 %</w:t>
+              <w:t xml:space="preserve">—</w:t>
             </w:r>
           </w:p>
         </w:tc>
@@ -6631,7 +6570,7 @@
                 <w:sz w:val="18"/>
                 <w:szCs w:val="18"/>
               </w:rPr>
-              <w:t xml:space="preserve">300</w:t>
+              <w:t xml:space="preserve">—</w:t>
             </w:r>
           </w:p>
         </w:tc>
@@ -6649,7 +6588,7 @@
                 <w:sz w:val="18"/>
                 <w:szCs w:val="18"/>
               </w:rPr>
-              <w:t xml:space="preserve">350</w:t>
+              <w:t xml:space="preserve">—</w:t>
             </w:r>
           </w:p>
         </w:tc>
@@ -6667,7 +6606,7 @@
                 <w:sz w:val="18"/>
                 <w:szCs w:val="18"/>
               </w:rPr>
-              <w:t xml:space="preserve">400</w:t>
+              <w:t xml:space="preserve">—</w:t>
             </w:r>
           </w:p>
         </w:tc>
@@ -6685,7 +6624,7 @@
                 <w:sz w:val="18"/>
                 <w:szCs w:val="18"/>
               </w:rPr>
-              <w:t xml:space="preserve">+16,7 %</w:t>
+              <w:t xml:space="preserve">—</w:t>
             </w:r>
           </w:p>
         </w:tc>
@@ -6703,7 +6642,7 @@
                 <w:sz w:val="18"/>
                 <w:szCs w:val="18"/>
               </w:rPr>
-              <w:t xml:space="preserve">+14,3 %</w:t>
+              <w:t xml:space="preserve">—</w:t>
             </w:r>
           </w:p>
         </w:tc>
@@ -6744,7 +6683,7 @@
                 <w:sz w:val="18"/>
                 <w:szCs w:val="18"/>
               </w:rPr>
-              <w:t xml:space="preserve">200</w:t>
+              <w:t xml:space="preserve">—</w:t>
             </w:r>
           </w:p>
         </w:tc>
@@ -6762,7 +6701,7 @@
                 <w:sz w:val="18"/>
                 <w:szCs w:val="18"/>
               </w:rPr>
-              <w:t xml:space="preserve">220</w:t>
+              <w:t xml:space="preserve">—</w:t>
             </w:r>
           </w:p>
         </w:tc>
@@ -6780,7 +6719,7 @@
                 <w:sz w:val="18"/>
                 <w:szCs w:val="18"/>
               </w:rPr>
-              <w:t xml:space="preserve">240</w:t>
+              <w:t xml:space="preserve">—</w:t>
             </w:r>
           </w:p>
         </w:tc>
@@ -6798,7 +6737,7 @@
                 <w:sz w:val="18"/>
                 <w:szCs w:val="18"/>
               </w:rPr>
-              <w:t xml:space="preserve">+10,0 %</w:t>
+              <w:t xml:space="preserve">—</w:t>
             </w:r>
           </w:p>
         </w:tc>
@@ -6816,7 +6755,7 @@
                 <w:sz w:val="18"/>
                 <w:szCs w:val="18"/>
               </w:rPr>
-              <w:t xml:space="preserve">+9,1 %</w:t>
+              <w:t xml:space="preserve">—</w:t>
             </w:r>
           </w:p>
         </w:tc>
@@ -6861,7 +6800,7 @@
                 <w:sz w:val="18"/>
                 <w:szCs w:val="18"/>
               </w:rPr>
-              <w:t xml:space="preserve">16 822</w:t>
+              <w:t xml:space="preserve">—</w:t>
             </w:r>
           </w:p>
         </w:tc>
@@ -6881,7 +6820,7 @@
                 <w:sz w:val="18"/>
                 <w:szCs w:val="18"/>
               </w:rPr>
-              <w:t xml:space="preserve">17 469</w:t>
+              <w:t xml:space="preserve">—</w:t>
             </w:r>
           </w:p>
         </w:tc>
@@ -6901,7 +6840,7 @@
                 <w:sz w:val="18"/>
                 <w:szCs w:val="18"/>
               </w:rPr>
-              <w:t xml:space="preserve">19 620</w:t>
+              <w:t xml:space="preserve">—</w:t>
             </w:r>
           </w:p>
         </w:tc>
@@ -6921,7 +6860,7 @@
                 <w:sz w:val="18"/>
                 <w:szCs w:val="18"/>
               </w:rPr>
-              <w:t xml:space="preserve">+3,8 %</w:t>
+              <w:t xml:space="preserve">—</w:t>
             </w:r>
           </w:p>
         </w:tc>
@@ -6941,7 +6880,7 @@
                 <w:sz w:val="18"/>
                 <w:szCs w:val="18"/>
               </w:rPr>
-              <w:t xml:space="preserve">+12,3 %</w:t>
+              <w:t xml:space="preserve">—</w:t>
             </w:r>
           </w:p>
         </w:tc>
@@ -6982,7 +6921,7 @@
                 <w:sz w:val="18"/>
                 <w:szCs w:val="18"/>
               </w:rPr>
-              <w:t xml:space="preserve">0</w:t>
+              <w:t xml:space="preserve">—</w:t>
             </w:r>
           </w:p>
         </w:tc>
@@ -7000,7 +6939,7 @@
                 <w:sz w:val="18"/>
                 <w:szCs w:val="18"/>
               </w:rPr>
-              <w:t xml:space="preserve">0</w:t>
+              <w:t xml:space="preserve">—</w:t>
             </w:r>
           </w:p>
         </w:tc>
@@ -7018,7 +6957,7 @@
                 <w:sz w:val="18"/>
                 <w:szCs w:val="18"/>
               </w:rPr>
-              <w:t xml:space="preserve">0</w:t>
+              <w:t xml:space="preserve">—</w:t>
             </w:r>
           </w:p>
         </w:tc>
@@ -7095,7 +7034,7 @@
                 <w:sz w:val="18"/>
                 <w:szCs w:val="18"/>
               </w:rPr>
-              <w:t xml:space="preserve">9 000</w:t>
+              <w:t xml:space="preserve">—</w:t>
             </w:r>
           </w:p>
         </w:tc>
@@ -7113,7 +7052,7 @@
                 <w:sz w:val="18"/>
                 <w:szCs w:val="18"/>
               </w:rPr>
-              <w:t xml:space="preserve">9 300</w:t>
+              <w:t xml:space="preserve">—</w:t>
             </w:r>
           </w:p>
         </w:tc>
@@ -7131,7 +7070,7 @@
                 <w:sz w:val="18"/>
                 <w:szCs w:val="18"/>
               </w:rPr>
-              <w:t xml:space="preserve">9 800</w:t>
+              <w:t xml:space="preserve">—</w:t>
             </w:r>
           </w:p>
         </w:tc>
@@ -7149,7 +7088,7 @@
                 <w:sz w:val="18"/>
                 <w:szCs w:val="18"/>
               </w:rPr>
-              <w:t xml:space="preserve">+3,3 %</w:t>
+              <w:t xml:space="preserve">—</w:t>
             </w:r>
           </w:p>
         </w:tc>
@@ -7167,7 +7106,7 @@
                 <w:sz w:val="18"/>
                 <w:szCs w:val="18"/>
               </w:rPr>
-              <w:t xml:space="preserve">+5,4 %</w:t>
+              <w:t xml:space="preserve">—</w:t>
             </w:r>
           </w:p>
         </w:tc>
@@ -7208,7 +7147,7 @@
                 <w:sz w:val="18"/>
                 <w:szCs w:val="18"/>
               </w:rPr>
-              <w:t xml:space="preserve">1 500</w:t>
+              <w:t xml:space="preserve">—</w:t>
             </w:r>
           </w:p>
         </w:tc>
@@ -7226,7 +7165,7 @@
                 <w:sz w:val="18"/>
                 <w:szCs w:val="18"/>
               </w:rPr>
-              <w:t xml:space="preserve">1 600</w:t>
+              <w:t xml:space="preserve">—</w:t>
             </w:r>
           </w:p>
         </w:tc>
@@ -7244,7 +7183,7 @@
                 <w:sz w:val="18"/>
                 <w:szCs w:val="18"/>
               </w:rPr>
-              <w:t xml:space="preserve">1 700</w:t>
+              <w:t xml:space="preserve">—</w:t>
             </w:r>
           </w:p>
         </w:tc>
@@ -7262,7 +7201,7 @@
                 <w:sz w:val="18"/>
                 <w:szCs w:val="18"/>
               </w:rPr>
-              <w:t xml:space="preserve">+6,7 %</w:t>
+              <w:t xml:space="preserve">—</w:t>
             </w:r>
           </w:p>
         </w:tc>
@@ -7280,7 +7219,7 @@
                 <w:sz w:val="18"/>
                 <w:szCs w:val="18"/>
               </w:rPr>
-              <w:t xml:space="preserve">+6,3 %</w:t>
+              <w:t xml:space="preserve">—</w:t>
             </w:r>
           </w:p>
         </w:tc>
@@ -7325,7 +7264,7 @@
                 <w:sz w:val="18"/>
                 <w:szCs w:val="18"/>
               </w:rPr>
-              <w:t xml:space="preserve">6 322</w:t>
+              <w:t xml:space="preserve">—</w:t>
             </w:r>
           </w:p>
         </w:tc>
@@ -7345,7 +7284,7 @@
                 <w:sz w:val="18"/>
                 <w:szCs w:val="18"/>
               </w:rPr>
-              <w:t xml:space="preserve">6 569</w:t>
+              <w:t xml:space="preserve">—</w:t>
             </w:r>
           </w:p>
         </w:tc>
@@ -7365,7 +7304,7 @@
                 <w:sz w:val="18"/>
                 <w:szCs w:val="18"/>
               </w:rPr>
-              <w:t xml:space="preserve">8 120</w:t>
+              <w:t xml:space="preserve">—</w:t>
             </w:r>
           </w:p>
         </w:tc>
@@ -7385,7 +7324,7 @@
                 <w:sz w:val="18"/>
                 <w:szCs w:val="18"/>
               </w:rPr>
-              <w:t xml:space="preserve">+3,9 %</w:t>
+              <w:t xml:space="preserve">—</w:t>
             </w:r>
           </w:p>
         </w:tc>
@@ -7405,7 +7344,7 @@
                 <w:sz w:val="18"/>
                 <w:szCs w:val="18"/>
               </w:rPr>
-              <w:t xml:space="preserve">+23,6 %</w:t>
+              <w:t xml:space="preserve">—</w:t>
             </w:r>
           </w:p>
         </w:tc>
@@ -7446,7 +7385,7 @@
                 <w:sz w:val="18"/>
                 <w:szCs w:val="18"/>
               </w:rPr>
-              <w:t xml:space="preserve">1 200</w:t>
+              <w:t xml:space="preserve">—</w:t>
             </w:r>
           </w:p>
         </w:tc>
@@ -7464,7 +7403,7 @@
                 <w:sz w:val="18"/>
                 <w:szCs w:val="18"/>
               </w:rPr>
-              <w:t xml:space="preserve">900</w:t>
+              <w:t xml:space="preserve">—</w:t>
             </w:r>
           </w:p>
         </w:tc>
@@ -7482,7 +7421,7 @@
                 <w:sz w:val="18"/>
                 <w:szCs w:val="18"/>
               </w:rPr>
-              <w:t xml:space="preserve">2 100</w:t>
+              <w:t xml:space="preserve">—</w:t>
             </w:r>
           </w:p>
         </w:tc>
@@ -7500,7 +7439,7 @@
                 <w:sz w:val="18"/>
                 <w:szCs w:val="18"/>
               </w:rPr>
-              <w:t xml:space="preserve">−25,0 %</w:t>
+              <w:t xml:space="preserve">—</w:t>
             </w:r>
           </w:p>
         </w:tc>
@@ -7518,7 +7457,7 @@
                 <w:sz w:val="18"/>
                 <w:szCs w:val="18"/>
               </w:rPr>
-              <w:t xml:space="preserve">+133,3 %</w:t>
+              <w:t xml:space="preserve">—</w:t>
             </w:r>
           </w:p>
         </w:tc>
@@ -7563,7 +7502,7 @@
                 <w:sz w:val="18"/>
                 <w:szCs w:val="18"/>
               </w:rPr>
-              <w:t xml:space="preserve">5 122</w:t>
+              <w:t xml:space="preserve">—</w:t>
             </w:r>
           </w:p>
         </w:tc>
@@ -7583,7 +7522,7 @@
                 <w:sz w:val="18"/>
                 <w:szCs w:val="18"/>
               </w:rPr>
-              <w:t xml:space="preserve">5 669</w:t>
+              <w:t xml:space="preserve">—</w:t>
             </w:r>
           </w:p>
         </w:tc>
@@ -7603,7 +7542,7 @@
                 <w:sz w:val="18"/>
                 <w:szCs w:val="18"/>
               </w:rPr>
-              <w:t xml:space="preserve">6 020</w:t>
+              <w:t xml:space="preserve">—</w:t>
             </w:r>
           </w:p>
         </w:tc>
@@ -7623,7 +7562,7 @@
                 <w:sz w:val="18"/>
                 <w:szCs w:val="18"/>
               </w:rPr>
-              <w:t xml:space="preserve">+10,7 %</w:t>
+              <w:t xml:space="preserve">—</w:t>
             </w:r>
           </w:p>
         </w:tc>
@@ -7643,7 +7582,7 @@
                 <w:sz w:val="18"/>
                 <w:szCs w:val="18"/>
               </w:rPr>
-              <w:t xml:space="preserve">+6,2 %</w:t>
+              <w:t xml:space="preserve">—</w:t>
             </w:r>
           </w:p>
         </w:tc>
@@ -7684,7 +7623,7 @@
                 <w:sz w:val="18"/>
                 <w:szCs w:val="18"/>
               </w:rPr>
-              <w:t xml:space="preserve">10</w:t>
+              <w:t xml:space="preserve">—</w:t>
             </w:r>
           </w:p>
         </w:tc>
@@ -7702,7 +7641,7 @@
                 <w:sz w:val="18"/>
                 <w:szCs w:val="18"/>
               </w:rPr>
-              <w:t xml:space="preserve">0</w:t>
+              <w:t xml:space="preserve">—</w:t>
             </w:r>
           </w:p>
         </w:tc>
@@ -7720,7 +7659,7 @@
                 <w:sz w:val="18"/>
                 <w:szCs w:val="18"/>
               </w:rPr>
-              <w:t xml:space="preserve">−20</w:t>
+              <w:t xml:space="preserve">—</w:t>
             </w:r>
           </w:p>
         </w:tc>
@@ -7738,7 +7677,7 @@
                 <w:sz w:val="18"/>
                 <w:szCs w:val="18"/>
               </w:rPr>
-              <w:t xml:space="preserve">−100,0 %</w:t>
+              <w:t xml:space="preserve">—</w:t>
             </w:r>
           </w:p>
         </w:tc>
@@ -7801,7 +7740,7 @@
                 <w:sz w:val="18"/>
                 <w:szCs w:val="18"/>
               </w:rPr>
-              <w:t xml:space="preserve">5 132</w:t>
+              <w:t xml:space="preserve">—</w:t>
             </w:r>
           </w:p>
         </w:tc>
@@ -7821,7 +7760,7 @@
                 <w:sz w:val="18"/>
                 <w:szCs w:val="18"/>
               </w:rPr>
-              <w:t xml:space="preserve">5 669</w:t>
+              <w:t xml:space="preserve">—</w:t>
             </w:r>
           </w:p>
         </w:tc>
@@ -7841,7 +7780,7 @@
                 <w:sz w:val="18"/>
                 <w:szCs w:val="18"/>
               </w:rPr>
-              <w:t xml:space="preserve">6 000</w:t>
+              <w:t xml:space="preserve">—</w:t>
             </w:r>
           </w:p>
         </w:tc>
@@ -7861,7 +7800,7 @@
                 <w:sz w:val="18"/>
                 <w:szCs w:val="18"/>
               </w:rPr>
-              <w:t xml:space="preserve">+10,5 %</w:t>
+              <w:t xml:space="preserve">—</w:t>
             </w:r>
           </w:p>
         </w:tc>
@@ -7881,7 +7820,7 @@
                 <w:sz w:val="18"/>
                 <w:szCs w:val="18"/>
               </w:rPr>
-              <w:t xml:space="preserve">+5,8 %</w:t>
+              <w:t xml:space="preserve">—</w:t>
             </w:r>
           </w:p>
         </w:tc>
@@ -7922,7 +7861,7 @@
                 <w:sz w:val="18"/>
                 <w:szCs w:val="18"/>
               </w:rPr>
-              <w:t xml:space="preserve">400</w:t>
+              <w:t xml:space="preserve">—</w:t>
             </w:r>
           </w:p>
         </w:tc>
@@ -7940,7 +7879,7 @@
                 <w:sz w:val="18"/>
                 <w:szCs w:val="18"/>
               </w:rPr>
-              <w:t xml:space="preserve">500</w:t>
+              <w:t xml:space="preserve">—</w:t>
             </w:r>
           </w:p>
         </w:tc>
@@ -7958,7 +7897,7 @@
                 <w:sz w:val="18"/>
                 <w:szCs w:val="18"/>
               </w:rPr>
-              <w:t xml:space="preserve">600</w:t>
+              <w:t xml:space="preserve">—</w:t>
             </w:r>
           </w:p>
         </w:tc>
@@ -7976,7 +7915,7 @@
                 <w:sz w:val="18"/>
                 <w:szCs w:val="18"/>
               </w:rPr>
-              <w:t xml:space="preserve">+25,0 %</w:t>
+              <w:t xml:space="preserve">—</w:t>
             </w:r>
           </w:p>
         </w:tc>
@@ -7994,7 +7933,7 @@
                 <w:sz w:val="18"/>
                 <w:szCs w:val="18"/>
               </w:rPr>
-              <w:t xml:space="preserve">+20,0 %</w:t>
+              <w:t xml:space="preserve">—</w:t>
             </w:r>
           </w:p>
         </w:tc>
@@ -8039,7 +7978,7 @@
                 <w:sz w:val="18"/>
                 <w:szCs w:val="18"/>
               </w:rPr>
-              <w:t xml:space="preserve">4 732</w:t>
+              <w:t xml:space="preserve">—</w:t>
             </w:r>
           </w:p>
         </w:tc>
@@ -8059,7 +7998,7 @@
                 <w:sz w:val="18"/>
                 <w:szCs w:val="18"/>
               </w:rPr>
-              <w:t xml:space="preserve">5 169</w:t>
+              <w:t xml:space="preserve">—</w:t>
             </w:r>
           </w:p>
         </w:tc>
@@ -8079,7 +8018,7 @@
                 <w:sz w:val="18"/>
                 <w:szCs w:val="18"/>
               </w:rPr>
-              <w:t xml:space="preserve">5 400</w:t>
+              <w:t xml:space="preserve">—</w:t>
             </w:r>
           </w:p>
         </w:tc>
@@ -8099,7 +8038,7 @@
                 <w:sz w:val="18"/>
                 <w:szCs w:val="18"/>
               </w:rPr>
-              <w:t xml:space="preserve">+9,2 %</w:t>
+              <w:t xml:space="preserve">—</w:t>
             </w:r>
           </w:p>
         </w:tc>
@@ -8119,7 +8058,7 @@
                 <w:sz w:val="18"/>
                 <w:szCs w:val="18"/>
               </w:rPr>
-              <w:t xml:space="preserve">+4,5 %</w:t>
+              <w:t xml:space="preserve">—</w:t>
             </w:r>
           </w:p>
         </w:tc>
@@ -8132,67 +8071,7 @@
     </w:p>
     <w:p>
       <w:r>
-        <w:t xml:space="preserve">Le PNB progresse de </w:t>
-      </w:r>
-      <w:r>
-        <w:rPr>
-          <w:b/>
-        </w:rPr>
-        <w:t xml:space="preserve">12,3 %</w:t>
-      </w:r>
-      <w:r>
-        <w:t xml:space="preserve"> en 2023 (+2 151 M). Principaux mouvements :</w:t>
-      </w:r>
-    </w:p>
-    <w:p>
-      <w:pPr>
-        <w:ind w:left="360" w:hanging="220"/>
-      </w:pPr>
-      <w:r>
-        <w:t xml:space="preserve">•  </w:t>
-      </w:r>
-      <w:r>
-        <w:rPr>
-          <w:b/>
-        </w:rPr>
-        <w:t xml:space="preserve">Intérêts reçus</w:t>
-      </w:r>
-      <w:r>
-        <w:t xml:space="preserve"> : +2 000 M (+9,5 %)</w:t>
-      </w:r>
-    </w:p>
-    <w:p>
-      <w:pPr>
-        <w:ind w:left="360" w:hanging="220"/>
-      </w:pPr>
-      <w:r>
-        <w:t xml:space="preserve">•  </w:t>
-      </w:r>
-      <w:r>
-        <w:rPr>
-          <w:b/>
-        </w:rPr>
-        <w:t xml:space="preserve">Coût du risque</w:t>
-      </w:r>
-      <w:r>
-        <w:t xml:space="preserve"> : +1 200 M (+133,3 %)</w:t>
-      </w:r>
-    </w:p>
-    <w:p>
-      <w:pPr>
-        <w:ind w:left="360" w:hanging="220"/>
-      </w:pPr>
-      <w:r>
-        <w:t xml:space="preserve">•  </w:t>
-      </w:r>
-      <w:r>
-        <w:rPr>
-          <w:b/>
-        </w:rPr>
-        <w:t xml:space="preserve">Intérêts versés</w:t>
-      </w:r>
-      <w:r>
-        <w:t xml:space="preserve"> : +800 M (+9,8 %)</w:t>
+        <w:t xml:space="preserve">Principaux mouvements en 2023 :</w:t>
       </w:r>
     </w:p>
     <w:p>
@@ -12348,7 +12227,7 @@
                 <w:rPr>
                   <w:rFonts w:ascii="Cambria Math" w:hAnsi="Cambria Math"/>
                 </w:rPr>
-                <m:t xml:space="preserve">232 664</m:t>
+                <m:t xml:space="preserve">201 123</m:t>
               </m:r>
             </m:den>
           </m:f>
@@ -12359,7 +12238,7 @@
             <w:rPr>
               <w:rFonts w:ascii="Cambria Math" w:hAnsi="Cambria Math"/>
             </w:rPr>
-            <m:t xml:space="preserve"> = 9,61 %</m:t>
+            <m:t xml:space="preserve"> = 11,12 %</m:t>
           </m:r>
         </m:oMath>
       </m:oMathPara>
@@ -12417,7 +12296,7 @@
                 <w:rPr>
                   <w:rFonts w:ascii="Cambria Math" w:hAnsi="Cambria Math"/>
                 </w:rPr>
-                <m:t xml:space="preserve">226 068</m:t>
+                <m:t xml:space="preserve">193 920</m:t>
               </m:r>
             </m:den>
           </m:f>
@@ -12428,7 +12307,7 @@
             <w:rPr>
               <w:rFonts w:ascii="Cambria Math" w:hAnsi="Cambria Math"/>
             </w:rPr>
-            <m:t xml:space="preserve"> = 11,46 %</m:t>
+            <m:t xml:space="preserve"> = 13,36 %</m:t>
           </m:r>
         </m:oMath>
       </m:oMathPara>
@@ -12486,7 +12365,7 @@
                 <w:rPr>
                   <w:rFonts w:ascii="Cambria Math" w:hAnsi="Cambria Math"/>
                 </w:rPr>
-                <m:t xml:space="preserve">237 172</m:t>
+                <m:t xml:space="preserve">203 478</m:t>
               </m:r>
             </m:den>
           </m:f>
@@ -12497,7 +12376,7 @@
             <w:rPr>
               <w:rFonts w:ascii="Cambria Math" w:hAnsi="Cambria Math"/>
             </w:rPr>
-            <m:t xml:space="preserve"> = 12,15 %</m:t>
+            <m:t xml:space="preserve"> = 14,16 %</m:t>
           </m:r>
         </m:oMath>
       </m:oMathPara>
@@ -12636,7 +12515,7 @@
                 <w:sz w:val="18"/>
                 <w:szCs w:val="18"/>
               </w:rPr>
-              <w:t xml:space="preserve">9,61 %</w:t>
+              <w:t xml:space="preserve">11,12 %</w:t>
             </w:r>
           </w:p>
         </w:tc>
@@ -12654,7 +12533,7 @@
                 <w:sz w:val="18"/>
                 <w:szCs w:val="18"/>
               </w:rPr>
-              <w:t xml:space="preserve">11,46 %</w:t>
+              <w:t xml:space="preserve">13,36 %</w:t>
             </w:r>
           </w:p>
         </w:tc>
@@ -12672,7 +12551,7 @@
                 <w:sz w:val="18"/>
                 <w:szCs w:val="18"/>
               </w:rPr>
-              <w:t xml:space="preserve">12,15 %</w:t>
+              <w:t xml:space="preserve">14,16 %</w:t>
             </w:r>
           </w:p>
         </w:tc>
@@ -12729,11 +12608,11 @@
             </w:pPr>
             <w:r>
               <w:rPr>
-                <w:color w:val="B3302A"/>
-                <w:sz w:val="18"/>
-                <w:szCs w:val="18"/>
-              </w:rPr>
-              <w:t xml:space="preserve">✕ Non conforme</w:t>
+                <w:color w:val="1A7642"/>
+                <w:sz w:val="18"/>
+                <w:szCs w:val="18"/>
+              </w:rPr>
+              <w:t xml:space="preserve">✓ Conforme</w:t>
             </w:r>
           </w:p>
         </w:tc>
@@ -12748,11 +12627,11 @@
             </w:pPr>
             <w:r>
               <w:rPr>
-                <w:color w:val="8F5500"/>
-                <w:sz w:val="18"/>
-                <w:szCs w:val="18"/>
-              </w:rPr>
-              <w:t xml:space="preserve">! Marge faible</w:t>
+                <w:color w:val="1A7642"/>
+                <w:sz w:val="18"/>
+                <w:szCs w:val="18"/>
+              </w:rPr>
+              <w:t xml:space="preserve">✓ Conforme</w:t>
             </w:r>
           </w:p>
         </w:tc>
@@ -12827,7 +12706,7 @@
         <w:rPr>
           <w:b/>
         </w:rPr>
-        <w:t xml:space="preserve">9,61 %</w:t>
+        <w:t xml:space="preserve">11,12 %</w:t>
       </w:r>
       <w:r>
         <w:t xml:space="preserve"> en 2021 à </w:t>
@@ -12836,10 +12715,10 @@
         <w:rPr>
           <w:b/>
         </w:rPr>
-        <w:t xml:space="preserve">12,15 %</w:t>
-      </w:r>
-      <w:r>
-        <w:t xml:space="preserve"> en 2023 (+2,53 pt), hausse continue sur la période. La solvabilité réglementaire s’améliore. Au-dessus de le minimum réglementaire de 11,5 % mais avec une marge faible (+0,65 pt).</w:t>
+        <w:t xml:space="preserve">14,16 %</w:t>
+      </w:r>
+      <w:r>
+        <w:t xml:space="preserve"> en 2023 (+3,04 pt), hausse continue sur la période. La solvabilité réglementaire s’améliore. Confortablement au-dessus de le minimum réglementaire de 11,5 % (marge +2,66 pt).</w:t>
       </w:r>
     </w:p>
     <w:p>
@@ -12987,7 +12866,7 @@
                 <w:rPr>
                   <w:rFonts w:ascii="Cambria Math" w:hAnsi="Cambria Math"/>
                 </w:rPr>
-                <m:t xml:space="preserve">232 664</m:t>
+                <m:t xml:space="preserve">201 123</m:t>
               </m:r>
             </m:den>
           </m:f>
@@ -12998,7 +12877,7 @@
             <w:rPr>
               <w:rFonts w:ascii="Cambria Math" w:hAnsi="Cambria Math"/>
             </w:rPr>
-            <m:t xml:space="preserve"> = 8,93 %</m:t>
+            <m:t xml:space="preserve"> = 10,33 %</m:t>
           </m:r>
         </m:oMath>
       </m:oMathPara>
@@ -13056,7 +12935,7 @@
                 <w:rPr>
                   <w:rFonts w:ascii="Cambria Math" w:hAnsi="Cambria Math"/>
                 </w:rPr>
-                <m:t xml:space="preserve">226 068</m:t>
+                <m:t xml:space="preserve">193 920</m:t>
               </m:r>
             </m:den>
           </m:f>
@@ -13067,7 +12946,7 @@
             <w:rPr>
               <w:rFonts w:ascii="Cambria Math" w:hAnsi="Cambria Math"/>
             </w:rPr>
-            <m:t xml:space="preserve"> = 10,76 %</m:t>
+            <m:t xml:space="preserve"> = 12,54 %</m:t>
           </m:r>
         </m:oMath>
       </m:oMathPara>
@@ -13125,7 +13004,7 @@
                 <w:rPr>
                   <w:rFonts w:ascii="Cambria Math" w:hAnsi="Cambria Math"/>
                 </w:rPr>
-                <m:t xml:space="preserve">237 172</m:t>
+                <m:t xml:space="preserve">203 478</m:t>
               </m:r>
             </m:den>
           </m:f>
@@ -13136,7 +13015,7 @@
             <w:rPr>
               <w:rFonts w:ascii="Cambria Math" w:hAnsi="Cambria Math"/>
             </w:rPr>
-            <m:t xml:space="preserve"> = 11,48 %</m:t>
+            <m:t xml:space="preserve"> = 13,38 %</m:t>
           </m:r>
         </m:oMath>
       </m:oMathPara>
@@ -13275,7 +13154,7 @@
                 <w:sz w:val="18"/>
                 <w:szCs w:val="18"/>
               </w:rPr>
-              <w:t xml:space="preserve">8,93 %</w:t>
+              <w:t xml:space="preserve">10,33 %</w:t>
             </w:r>
           </w:p>
         </w:tc>
@@ -13293,7 +13172,7 @@
                 <w:sz w:val="18"/>
                 <w:szCs w:val="18"/>
               </w:rPr>
-              <w:t xml:space="preserve">10,76 %</w:t>
+              <w:t xml:space="preserve">12,54 %</w:t>
             </w:r>
           </w:p>
         </w:tc>
@@ -13311,7 +13190,7 @@
                 <w:sz w:val="18"/>
                 <w:szCs w:val="18"/>
               </w:rPr>
-              <w:t xml:space="preserve">11,48 %</w:t>
+              <w:t xml:space="preserve">13,38 %</w:t>
             </w:r>
           </w:p>
         </w:tc>
@@ -13466,7 +13345,7 @@
         <w:rPr>
           <w:b/>
         </w:rPr>
-        <w:t xml:space="preserve">8,93 %</w:t>
+        <w:t xml:space="preserve">10,33 %</w:t>
       </w:r>
       <w:r>
         <w:t xml:space="preserve"> en 2021 à </w:t>
@@ -13475,10 +13354,10 @@
         <w:rPr>
           <w:b/>
         </w:rPr>
-        <w:t xml:space="preserve">11,48 %</w:t>
-      </w:r>
-      <w:r>
-        <w:t xml:space="preserve"> en 2023 (+2,55 pt), hausse continue sur la période. Le noyau dur de solvabilité se renforce. Confortablement au-dessus de le minimum réglementaire de 7,5 % (marge +3,98 pt).</w:t>
+        <w:t xml:space="preserve">13,38 %</w:t>
+      </w:r>
+      <w:r>
+        <w:t xml:space="preserve"> en 2023 (+3,05 pt), hausse continue sur la période. Le noyau dur de solvabilité se renforce. Confortablement au-dessus de le minimum réglementaire de 7,5 % (marge +5,88 pt).</w:t>
       </w:r>
     </w:p>
     <w:p>
@@ -13626,7 +13505,7 @@
                 <w:rPr>
                   <w:rFonts w:ascii="Cambria Math" w:hAnsi="Cambria Math"/>
                 </w:rPr>
-                <m:t xml:space="preserve">232 664</m:t>
+                <m:t xml:space="preserve">201 123</m:t>
               </m:r>
             </m:den>
           </m:f>
@@ -13637,7 +13516,7 @@
             <w:rPr>
               <w:rFonts w:ascii="Cambria Math" w:hAnsi="Cambria Math"/>
             </w:rPr>
-            <m:t xml:space="preserve"> = 8,93 %</m:t>
+            <m:t xml:space="preserve"> = 10,33 %</m:t>
           </m:r>
         </m:oMath>
       </m:oMathPara>
@@ -13695,7 +13574,7 @@
                 <w:rPr>
                   <w:rFonts w:ascii="Cambria Math" w:hAnsi="Cambria Math"/>
                 </w:rPr>
-                <m:t xml:space="preserve">226 068</m:t>
+                <m:t xml:space="preserve">193 920</m:t>
               </m:r>
             </m:den>
           </m:f>
@@ -13706,7 +13585,7 @@
             <w:rPr>
               <w:rFonts w:ascii="Cambria Math" w:hAnsi="Cambria Math"/>
             </w:rPr>
-            <m:t xml:space="preserve"> = 10,76 %</m:t>
+            <m:t xml:space="preserve"> = 12,54 %</m:t>
           </m:r>
         </m:oMath>
       </m:oMathPara>
@@ -13764,7 +13643,7 @@
                 <w:rPr>
                   <w:rFonts w:ascii="Cambria Math" w:hAnsi="Cambria Math"/>
                 </w:rPr>
-                <m:t xml:space="preserve">237 172</m:t>
+                <m:t xml:space="preserve">203 478</m:t>
               </m:r>
             </m:den>
           </m:f>
@@ -13775,7 +13654,7 @@
             <w:rPr>
               <w:rFonts w:ascii="Cambria Math" w:hAnsi="Cambria Math"/>
             </w:rPr>
-            <m:t xml:space="preserve"> = 11,48 %</m:t>
+            <m:t xml:space="preserve"> = 13,38 %</m:t>
           </m:r>
         </m:oMath>
       </m:oMathPara>
@@ -13914,7 +13793,7 @@
                 <w:sz w:val="18"/>
                 <w:szCs w:val="18"/>
               </w:rPr>
-              <w:t xml:space="preserve">8,93 %</w:t>
+              <w:t xml:space="preserve">10,33 %</w:t>
             </w:r>
           </w:p>
         </w:tc>
@@ -13932,7 +13811,7 @@
                 <w:sz w:val="18"/>
                 <w:szCs w:val="18"/>
               </w:rPr>
-              <w:t xml:space="preserve">10,76 %</w:t>
+              <w:t xml:space="preserve">12,54 %</w:t>
             </w:r>
           </w:p>
         </w:tc>
@@ -13950,7 +13829,7 @@
                 <w:sz w:val="18"/>
                 <w:szCs w:val="18"/>
               </w:rPr>
-              <w:t xml:space="preserve">11,48 %</w:t>
+              <w:t xml:space="preserve">13,38 %</w:t>
             </w:r>
           </w:p>
         </w:tc>
@@ -13988,11 +13867,11 @@
             </w:pPr>
             <w:r>
               <w:rPr>
-                <w:color w:val="8F5500"/>
-                <w:sz w:val="18"/>
-                <w:szCs w:val="18"/>
-              </w:rPr>
-              <w:t xml:space="preserve">! Marge faible</w:t>
+                <w:color w:val="1A7642"/>
+                <w:sz w:val="18"/>
+                <w:szCs w:val="18"/>
+              </w:rPr>
+              <w:t xml:space="preserve">✓ Conforme</w:t>
             </w:r>
           </w:p>
         </w:tc>
@@ -14105,7 +13984,7 @@
         <w:rPr>
           <w:b/>
         </w:rPr>
-        <w:t xml:space="preserve">8,93 %</w:t>
+        <w:t xml:space="preserve">10,33 %</w:t>
       </w:r>
       <w:r>
         <w:t xml:space="preserve"> en 2021 à </w:t>
@@ -14114,10 +13993,10 @@
         <w:rPr>
           <w:b/>
         </w:rPr>
-        <w:t xml:space="preserve">11,48 %</w:t>
-      </w:r>
-      <w:r>
-        <w:t xml:space="preserve"> en 2023 (+2,55 pt), hausse continue sur la période. Les fonds propres de base couvrent mieux les risques. Confortablement au-dessus de le minimum réglementaire de 8,5 % (marge +2,98 pt).</w:t>
+        <w:t xml:space="preserve">13,38 %</w:t>
+      </w:r>
+      <w:r>
+        <w:t xml:space="preserve"> en 2023 (+3,05 pt), hausse continue sur la période. Les fonds propres de base couvrent mieux les risques. Confortablement au-dessus de le minimum réglementaire de 8,5 % (marge +4,88 pt).</w:t>
       </w:r>
     </w:p>
     <w:p>
@@ -16160,7 +16039,7 @@
                 <w:rPr>
                   <w:rFonts w:ascii="Cambria Math" w:hAnsi="Cambria Math"/>
                 </w:rPr>
-                <m:t xml:space="preserve">10 500</m:t>
+                <m:t xml:space="preserve">?</m:t>
               </m:r>
             </m:num>
             <m:den>
@@ -16171,7 +16050,7 @@
                 <w:rPr>
                   <w:rFonts w:ascii="Cambria Math" w:hAnsi="Cambria Math"/>
                 </w:rPr>
-                <m:t xml:space="preserve">16 822</m:t>
+                <m:t xml:space="preserve">?</m:t>
               </m:r>
             </m:den>
           </m:f>
@@ -16182,7 +16061,7 @@
             <w:rPr>
               <w:rFonts w:ascii="Cambria Math" w:hAnsi="Cambria Math"/>
             </w:rPr>
-            <m:t xml:space="preserve"> = 62,42 %</m:t>
+            <m:t xml:space="preserve"> = —</m:t>
           </m:r>
         </m:oMath>
       </m:oMathPara>
@@ -16229,7 +16108,7 @@
                 <w:rPr>
                   <w:rFonts w:ascii="Cambria Math" w:hAnsi="Cambria Math"/>
                 </w:rPr>
-                <m:t xml:space="preserve">10 900</m:t>
+                <m:t xml:space="preserve">?</m:t>
               </m:r>
             </m:num>
             <m:den>
@@ -16240,7 +16119,7 @@
                 <w:rPr>
                   <w:rFonts w:ascii="Cambria Math" w:hAnsi="Cambria Math"/>
                 </w:rPr>
-                <m:t xml:space="preserve">17 469</m:t>
+                <m:t xml:space="preserve">?</m:t>
               </m:r>
             </m:den>
           </m:f>
@@ -16251,7 +16130,7 @@
             <w:rPr>
               <w:rFonts w:ascii="Cambria Math" w:hAnsi="Cambria Math"/>
             </w:rPr>
-            <m:t xml:space="preserve"> = 62,40 %</m:t>
+            <m:t xml:space="preserve"> = —</m:t>
           </m:r>
         </m:oMath>
       </m:oMathPara>
@@ -16298,7 +16177,7 @@
                 <w:rPr>
                   <w:rFonts w:ascii="Cambria Math" w:hAnsi="Cambria Math"/>
                 </w:rPr>
-                <m:t xml:space="preserve">11 500</m:t>
+                <m:t xml:space="preserve">?</m:t>
               </m:r>
             </m:num>
             <m:den>
@@ -16309,7 +16188,7 @@
                 <w:rPr>
                   <w:rFonts w:ascii="Cambria Math" w:hAnsi="Cambria Math"/>
                 </w:rPr>
-                <m:t xml:space="preserve">19 620</m:t>
+                <m:t xml:space="preserve">?</m:t>
               </m:r>
             </m:den>
           </m:f>
@@ -16320,10 +16199,24 @@
             <w:rPr>
               <w:rFonts w:ascii="Cambria Math" w:hAnsi="Cambria Math"/>
             </w:rPr>
-            <m:t xml:space="preserve"> = 58,61 %</m:t>
+            <m:t xml:space="preserve"> = —</m:t>
           </m:r>
         </m:oMath>
       </m:oMathPara>
+    </w:p>
+    <w:p>
+      <w:pPr>
+        <w:pStyle w:val="Note"/>
+      </w:pPr>
+      <w:r>
+        <w:rPr>
+          <w:i/>
+          <w:color w:val="6B7770"/>
+          <w:sz w:val="18"/>
+          <w:szCs w:val="18"/>
+        </w:rPr>
+        <w:t xml:space="preserve">Données manquantes pour 2023 : Charges générales d'exploitation, Dotations aux amortissements et dépréciations des immobilisations, Intérêts et produits assimilés, Intérêts et charges assimilées, Revenus des titres à revenu variable, Commissions (charges), Gains ou pertes nets sur portefeuilles de négociation, Gains ou pertes nets sur portefeuilles de placement, Autres produits d'exploitation bancaire, Autres charges d'exploitation bancaire.</w:t>
+      </w:r>
     </w:p>
     <w:tbl>
       <w:tblPr>
@@ -16459,7 +16352,7 @@
                 <w:sz w:val="18"/>
                 <w:szCs w:val="18"/>
               </w:rPr>
-              <w:t xml:space="preserve">62,42 %</w:t>
+              <w:t xml:space="preserve">—</w:t>
             </w:r>
           </w:p>
         </w:tc>
@@ -16477,7 +16370,7 @@
                 <w:sz w:val="18"/>
                 <w:szCs w:val="18"/>
               </w:rPr>
-              <w:t xml:space="preserve">62,40 %</w:t>
+              <w:t xml:space="preserve">—</w:t>
             </w:r>
           </w:p>
         </w:tc>
@@ -16495,7 +16388,7 @@
                 <w:sz w:val="18"/>
                 <w:szCs w:val="18"/>
               </w:rPr>
-              <w:t xml:space="preserve">58,61 %</w:t>
+              <w:t xml:space="preserve">—</w:t>
             </w:r>
           </w:p>
         </w:tc>
@@ -16533,11 +16426,11 @@
             </w:pPr>
             <w:r>
               <w:rPr>
-                <w:color w:val="B3302A"/>
-                <w:sz w:val="18"/>
-                <w:szCs w:val="18"/>
-              </w:rPr>
-              <w:t xml:space="preserve">✕ Hors repère</w:t>
+                <w:color w:val="6B7770"/>
+                <w:sz w:val="18"/>
+                <w:szCs w:val="18"/>
+              </w:rPr>
+              <w:t xml:space="preserve">Non calculé</w:t>
             </w:r>
           </w:p>
         </w:tc>
@@ -16552,11 +16445,11 @@
             </w:pPr>
             <w:r>
               <w:rPr>
-                <w:color w:val="B3302A"/>
-                <w:sz w:val="18"/>
-                <w:szCs w:val="18"/>
-              </w:rPr>
-              <w:t xml:space="preserve">✕ Hors repère</w:t>
+                <w:color w:val="6B7770"/>
+                <w:sz w:val="18"/>
+                <w:szCs w:val="18"/>
+              </w:rPr>
+              <w:t xml:space="preserve">Non calculé</w:t>
             </w:r>
           </w:p>
         </w:tc>
@@ -16571,11 +16464,11 @@
             </w:pPr>
             <w:r>
               <w:rPr>
-                <w:color w:val="8F5500"/>
-                <w:sz w:val="18"/>
-                <w:szCs w:val="18"/>
-              </w:rPr>
-              <w:t xml:space="preserve">! Marge faible</w:t>
+                <w:color w:val="6B7770"/>
+                <w:sz w:val="18"/>
+                <w:szCs w:val="18"/>
+              </w:rPr>
+              <w:t xml:space="preserve">Non calculé</w:t>
             </w:r>
           </w:p>
         </w:tc>
@@ -16585,85 +16478,6 @@
       <w:pPr>
         <w:spacing w:after="60"/>
       </w:pPr>
-    </w:p>
-    <w:p>
-      <w:pPr>
-        <w:keepNext/>
-        <w:spacing w:after="0"/>
-      </w:pPr>
-      <w:r>
-        <w:drawing>
-          <wp:inline distT="0" distB="0" distL="0" distR="0">
-            <wp:extent cx="5400000" cy="2227500"/>
-            <wp:docPr id="14" name="Graphique 14"/>
-            <wp:cNvGraphicFramePr>
-              <a:graphicFrameLocks xmlns:a="http://schemas.openxmlformats.org/drawingml/2006/main" noChangeAspect="1"/>
-            </wp:cNvGraphicFramePr>
-            <a:graphic xmlns:a="http://schemas.openxmlformats.org/drawingml/2006/main">
-              <a:graphicData uri="http://schemas.openxmlformats.org/drawingml/2006/picture">
-                <pic:pic xmlns:pic="http://schemas.openxmlformats.org/drawingml/2006/picture">
-                  <pic:nvPicPr>
-                    <pic:cNvPr id="14" name="graphique14.png"/>
-                    <pic:cNvPicPr/>
-                  </pic:nvPicPr>
-                  <pic:blipFill>
-                    <a:blip r:embed="rIdImg14"/>
-                    <a:stretch>
-                      <a:fillRect/>
-                    </a:stretch>
-                  </pic:blipFill>
-                  <pic:spPr>
-                    <a:xfrm>
-                      <a:off x="0" y="0"/>
-                      <a:ext cx="5400000" cy="2227500"/>
-                    </a:xfrm>
-                    <a:prstGeom prst="rect">
-                      <a:avLst/>
-                    </a:prstGeom>
-                  </pic:spPr>
-                </pic:pic>
-              </a:graphicData>
-            </a:graphic>
-          </wp:inline>
-        </w:drawing>
-      </w:r>
-    </w:p>
-    <w:p>
-      <w:pPr>
-        <w:spacing w:after="160"/>
-      </w:pPr>
-      <w:r>
-        <w:rPr>
-          <w:i/>
-          <w:color w:val="6B7770"/>
-          <w:sz w:val="17"/>
-          <w:szCs w:val="17"/>
-        </w:rPr>
-        <w:t xml:space="preserve">Figure 14 – Coefficient d'exploitation par exercice</w:t>
-      </w:r>
-    </w:p>
-    <w:p>
-      <w:r>
-        <w:t xml:space="preserve">Passe de </w:t>
-      </w:r>
-      <w:r>
-        <w:rPr>
-          <w:b/>
-        </w:rPr>
-        <w:t xml:space="preserve">62,42 %</w:t>
-      </w:r>
-      <w:r>
-        <w:t xml:space="preserve"> en 2021 à </w:t>
-      </w:r>
-      <w:r>
-        <w:rPr>
-          <w:b/>
-        </w:rPr>
-        <w:t xml:space="preserve">58,61 %</w:t>
-      </w:r>
-      <w:r>
-        <w:t xml:space="preserve"> en 2023 (−3,80 pt), baisse continue sur la période. La banque gagne en efficacité opérationnelle. Sous le plafond de 60,0 % mais proche de celui-ci.</w:t>
-      </w:r>
     </w:p>
     <w:p>
       <w:pPr>
@@ -16799,7 +16613,7 @@
                 <w:rPr>
                   <w:rFonts w:ascii="Cambria Math" w:hAnsi="Cambria Math"/>
                 </w:rPr>
-                <m:t xml:space="preserve">1 200</m:t>
+                <m:t xml:space="preserve">?</m:t>
               </m:r>
             </m:num>
             <m:den>
@@ -16821,7 +16635,7 @@
             <w:rPr>
               <w:rFonts w:ascii="Cambria Math" w:hAnsi="Cambria Math"/>
             </w:rPr>
-            <m:t xml:space="preserve"> = 0,92 %</m:t>
+            <m:t xml:space="preserve"> = —</m:t>
           </m:r>
         </m:oMath>
       </m:oMathPara>
@@ -16868,7 +16682,7 @@
                 <w:rPr>
                   <w:rFonts w:ascii="Cambria Math" w:hAnsi="Cambria Math"/>
                 </w:rPr>
-                <m:t xml:space="preserve">900</m:t>
+                <m:t xml:space="preserve">?</m:t>
               </m:r>
             </m:num>
             <m:den>
@@ -16890,7 +16704,7 @@
             <w:rPr>
               <w:rFonts w:ascii="Cambria Math" w:hAnsi="Cambria Math"/>
             </w:rPr>
-            <m:t xml:space="preserve"> = 0,69 %</m:t>
+            <m:t xml:space="preserve"> = —</m:t>
           </m:r>
         </m:oMath>
       </m:oMathPara>
@@ -16937,7 +16751,7 @@
                 <w:rPr>
                   <w:rFonts w:ascii="Cambria Math" w:hAnsi="Cambria Math"/>
                 </w:rPr>
-                <m:t xml:space="preserve">2 100</m:t>
+                <m:t xml:space="preserve">?</m:t>
               </m:r>
             </m:num>
             <m:den>
@@ -16959,10 +16773,24 @@
             <w:rPr>
               <w:rFonts w:ascii="Cambria Math" w:hAnsi="Cambria Math"/>
             </w:rPr>
-            <m:t xml:space="preserve"> = 1,39 %</m:t>
+            <m:t xml:space="preserve"> = —</m:t>
           </m:r>
         </m:oMath>
       </m:oMathPara>
+    </w:p>
+    <w:p>
+      <w:pPr>
+        <w:pStyle w:val="Note"/>
+      </w:pPr>
+      <w:r>
+        <w:rPr>
+          <w:i/>
+          <w:color w:val="6B7770"/>
+          <w:sz w:val="18"/>
+          <w:szCs w:val="18"/>
+        </w:rPr>
+        <w:t xml:space="preserve">Données manquantes pour 2023 : Coût du risque (charge nette, + = charge).</w:t>
+      </w:r>
     </w:p>
     <w:tbl>
       <w:tblPr>
@@ -17098,7 +16926,7 @@
                 <w:sz w:val="18"/>
                 <w:szCs w:val="18"/>
               </w:rPr>
-              <w:t xml:space="preserve">0,92 %</w:t>
+              <w:t xml:space="preserve">—</w:t>
             </w:r>
           </w:p>
         </w:tc>
@@ -17116,7 +16944,7 @@
                 <w:sz w:val="18"/>
                 <w:szCs w:val="18"/>
               </w:rPr>
-              <w:t xml:space="preserve">0,69 %</w:t>
+              <w:t xml:space="preserve">—</w:t>
             </w:r>
           </w:p>
         </w:tc>
@@ -17134,7 +16962,7 @@
                 <w:sz w:val="18"/>
                 <w:szCs w:val="18"/>
               </w:rPr>
-              <w:t xml:space="preserve">1,39 %</w:t>
+              <w:t xml:space="preserve">—</w:t>
             </w:r>
           </w:p>
         </w:tc>
@@ -17172,11 +17000,11 @@
             </w:pPr>
             <w:r>
               <w:rPr>
-                <w:color w:val="1A7642"/>
-                <w:sz w:val="18"/>
-                <w:szCs w:val="18"/>
-              </w:rPr>
-              <w:t xml:space="preserve">✓ Dans le repère</w:t>
+                <w:color w:val="6B7770"/>
+                <w:sz w:val="18"/>
+                <w:szCs w:val="18"/>
+              </w:rPr>
+              <w:t xml:space="preserve">Non calculé</w:t>
             </w:r>
           </w:p>
         </w:tc>
@@ -17191,11 +17019,11 @@
             </w:pPr>
             <w:r>
               <w:rPr>
-                <w:color w:val="1A7642"/>
-                <w:sz w:val="18"/>
-                <w:szCs w:val="18"/>
-              </w:rPr>
-              <w:t xml:space="preserve">✓ Dans le repère</w:t>
+                <w:color w:val="6B7770"/>
+                <w:sz w:val="18"/>
+                <w:szCs w:val="18"/>
+              </w:rPr>
+              <w:t xml:space="preserve">Non calculé</w:t>
             </w:r>
           </w:p>
         </w:tc>
@@ -17210,11 +17038,11 @@
             </w:pPr>
             <w:r>
               <w:rPr>
-                <w:color w:val="1A7642"/>
-                <w:sz w:val="18"/>
-                <w:szCs w:val="18"/>
-              </w:rPr>
-              <w:t xml:space="preserve">✓ Dans le repère</w:t>
+                <w:color w:val="6B7770"/>
+                <w:sz w:val="18"/>
+                <w:szCs w:val="18"/>
+              </w:rPr>
+              <w:t xml:space="preserve">Non calculé</w:t>
             </w:r>
           </w:p>
         </w:tc>
@@ -17224,85 +17052,6 @@
       <w:pPr>
         <w:spacing w:after="60"/>
       </w:pPr>
-    </w:p>
-    <w:p>
-      <w:pPr>
-        <w:keepNext/>
-        <w:spacing w:after="0"/>
-      </w:pPr>
-      <w:r>
-        <w:drawing>
-          <wp:inline distT="0" distB="0" distL="0" distR="0">
-            <wp:extent cx="5400000" cy="2227500"/>
-            <wp:docPr id="15" name="Graphique 15"/>
-            <wp:cNvGraphicFramePr>
-              <a:graphicFrameLocks xmlns:a="http://schemas.openxmlformats.org/drawingml/2006/main" noChangeAspect="1"/>
-            </wp:cNvGraphicFramePr>
-            <a:graphic xmlns:a="http://schemas.openxmlformats.org/drawingml/2006/main">
-              <a:graphicData uri="http://schemas.openxmlformats.org/drawingml/2006/picture">
-                <pic:pic xmlns:pic="http://schemas.openxmlformats.org/drawingml/2006/picture">
-                  <pic:nvPicPr>
-                    <pic:cNvPr id="15" name="graphique15.png"/>
-                    <pic:cNvPicPr/>
-                  </pic:nvPicPr>
-                  <pic:blipFill>
-                    <a:blip r:embed="rIdImg15"/>
-                    <a:stretch>
-                      <a:fillRect/>
-                    </a:stretch>
-                  </pic:blipFill>
-                  <pic:spPr>
-                    <a:xfrm>
-                      <a:off x="0" y="0"/>
-                      <a:ext cx="5400000" cy="2227500"/>
-                    </a:xfrm>
-                    <a:prstGeom prst="rect">
-                      <a:avLst/>
-                    </a:prstGeom>
-                  </pic:spPr>
-                </pic:pic>
-              </a:graphicData>
-            </a:graphic>
-          </wp:inline>
-        </w:drawing>
-      </w:r>
-    </w:p>
-    <w:p>
-      <w:pPr>
-        <w:spacing w:after="160"/>
-      </w:pPr>
-      <w:r>
-        <w:rPr>
-          <w:i/>
-          <w:color w:val="6B7770"/>
-          <w:sz w:val="17"/>
-          <w:szCs w:val="17"/>
-        </w:rPr>
-        <w:t xml:space="preserve">Figure 15 – Coût du risque / crédits par exercice</w:t>
-      </w:r>
-    </w:p>
-    <w:p>
-      <w:r>
-        <w:t xml:space="preserve">Passe de </w:t>
-      </w:r>
-      <w:r>
-        <w:rPr>
-          <w:b/>
-        </w:rPr>
-        <w:t xml:space="preserve">0,92 %</w:t>
-      </w:r>
-      <w:r>
-        <w:t xml:space="preserve"> en 2021 à </w:t>
-      </w:r>
-      <w:r>
-        <w:rPr>
-          <w:b/>
-        </w:rPr>
-        <w:t xml:space="preserve">1,39 %</w:t>
-      </w:r>
-      <w:r>
-        <w:t xml:space="preserve"> en 2023 (+0,48 pt), avec une baisse en 2022 puis une hausse en 2023. Le risque de crédit se matérialise davantage. Nettement sous le plafond de 2,0 %.</w:t>
-      </w:r>
     </w:p>
     <w:p>
       <w:pPr>
@@ -17449,7 +17198,7 @@
                 <w:rPr>
                   <w:rFonts w:ascii="Cambria Math" w:hAnsi="Cambria Math"/>
                 </w:rPr>
-                <m:t xml:space="preserve">16 822</m:t>
+                <m:t xml:space="preserve">?</m:t>
               </m:r>
             </m:den>
           </m:f>
@@ -17460,7 +17209,7 @@
             <w:rPr>
               <w:rFonts w:ascii="Cambria Math" w:hAnsi="Cambria Math"/>
             </w:rPr>
-            <m:t xml:space="preserve"> = 18,50 %</m:t>
+            <m:t xml:space="preserve"> = —</m:t>
           </m:r>
         </m:oMath>
       </m:oMathPara>
@@ -17518,7 +17267,7 @@
                 <w:rPr>
                   <w:rFonts w:ascii="Cambria Math" w:hAnsi="Cambria Math"/>
                 </w:rPr>
-                <m:t xml:space="preserve">17 469</m:t>
+                <m:t xml:space="preserve">?</m:t>
               </m:r>
             </m:den>
           </m:f>
@@ -17529,7 +17278,7 @@
             <w:rPr>
               <w:rFonts w:ascii="Cambria Math" w:hAnsi="Cambria Math"/>
             </w:rPr>
-            <m:t xml:space="preserve"> = 20,58 %</m:t>
+            <m:t xml:space="preserve"> = —</m:t>
           </m:r>
         </m:oMath>
       </m:oMathPara>
@@ -17587,7 +17336,7 @@
                 <w:rPr>
                   <w:rFonts w:ascii="Cambria Math" w:hAnsi="Cambria Math"/>
                 </w:rPr>
-                <m:t xml:space="preserve">19 620</m:t>
+                <m:t xml:space="preserve">?</m:t>
               </m:r>
             </m:den>
           </m:f>
@@ -17598,10 +17347,24 @@
             <w:rPr>
               <w:rFonts w:ascii="Cambria Math" w:hAnsi="Cambria Math"/>
             </w:rPr>
-            <m:t xml:space="preserve"> = 14,82 %</m:t>
+            <m:t xml:space="preserve"> = —</m:t>
           </m:r>
         </m:oMath>
       </m:oMathPara>
+    </w:p>
+    <w:p>
+      <w:pPr>
+        <w:pStyle w:val="Note"/>
+      </w:pPr>
+      <w:r>
+        <w:rPr>
+          <w:i/>
+          <w:color w:val="6B7770"/>
+          <w:sz w:val="18"/>
+          <w:szCs w:val="18"/>
+        </w:rPr>
+        <w:t xml:space="preserve">Données manquantes pour 2023 : Intérêts et produits assimilés, Intérêts et charges assimilées, Revenus des titres à revenu variable, Commissions (charges), Gains ou pertes nets sur portefeuilles de négociation, Gains ou pertes nets sur portefeuilles de placement, Autres produits d'exploitation bancaire, Autres charges d'exploitation bancaire.</w:t>
+      </w:r>
     </w:p>
     <w:tbl>
       <w:tblPr>
@@ -17737,7 +17500,7 @@
                 <w:sz w:val="18"/>
                 <w:szCs w:val="18"/>
               </w:rPr>
-              <w:t xml:space="preserve">18,50 %</w:t>
+              <w:t xml:space="preserve">—</w:t>
             </w:r>
           </w:p>
         </w:tc>
@@ -17755,7 +17518,7 @@
                 <w:sz w:val="18"/>
                 <w:szCs w:val="18"/>
               </w:rPr>
-              <w:t xml:space="preserve">20,58 %</w:t>
+              <w:t xml:space="preserve">—</w:t>
             </w:r>
           </w:p>
         </w:tc>
@@ -17773,7 +17536,7 @@
                 <w:sz w:val="18"/>
                 <w:szCs w:val="18"/>
               </w:rPr>
-              <w:t xml:space="preserve">14,82 %</w:t>
+              <w:t xml:space="preserve">—</w:t>
             </w:r>
           </w:p>
         </w:tc>
@@ -17815,7 +17578,7 @@
                 <w:sz w:val="18"/>
                 <w:szCs w:val="18"/>
               </w:rPr>
-              <w:t xml:space="preserve"/>
+              <w:t xml:space="preserve">Non calculé</w:t>
             </w:r>
           </w:p>
         </w:tc>
@@ -17834,7 +17597,7 @@
                 <w:sz w:val="18"/>
                 <w:szCs w:val="18"/>
               </w:rPr>
-              <w:t xml:space="preserve"/>
+              <w:t xml:space="preserve">Non calculé</w:t>
             </w:r>
           </w:p>
         </w:tc>
@@ -17853,7 +17616,7 @@
                 <w:sz w:val="18"/>
                 <w:szCs w:val="18"/>
               </w:rPr>
-              <w:t xml:space="preserve"/>
+              <w:t xml:space="preserve">Non calculé</w:t>
             </w:r>
           </w:p>
         </w:tc>
@@ -17863,85 +17626,6 @@
       <w:pPr>
         <w:spacing w:after="60"/>
       </w:pPr>
-    </w:p>
-    <w:p>
-      <w:pPr>
-        <w:keepNext/>
-        <w:spacing w:after="0"/>
-      </w:pPr>
-      <w:r>
-        <w:drawing>
-          <wp:inline distT="0" distB="0" distL="0" distR="0">
-            <wp:extent cx="5400000" cy="2227500"/>
-            <wp:docPr id="16" name="Graphique 16"/>
-            <wp:cNvGraphicFramePr>
-              <a:graphicFrameLocks xmlns:a="http://schemas.openxmlformats.org/drawingml/2006/main" noChangeAspect="1"/>
-            </wp:cNvGraphicFramePr>
-            <a:graphic xmlns:a="http://schemas.openxmlformats.org/drawingml/2006/main">
-              <a:graphicData uri="http://schemas.openxmlformats.org/drawingml/2006/picture">
-                <pic:pic xmlns:pic="http://schemas.openxmlformats.org/drawingml/2006/picture">
-                  <pic:nvPicPr>
-                    <pic:cNvPr id="16" name="graphique16.png"/>
-                    <pic:cNvPicPr/>
-                  </pic:nvPicPr>
-                  <pic:blipFill>
-                    <a:blip r:embed="rIdImg16"/>
-                    <a:stretch>
-                      <a:fillRect/>
-                    </a:stretch>
-                  </pic:blipFill>
-                  <pic:spPr>
-                    <a:xfrm>
-                      <a:off x="0" y="0"/>
-                      <a:ext cx="5400000" cy="2227500"/>
-                    </a:xfrm>
-                    <a:prstGeom prst="rect">
-                      <a:avLst/>
-                    </a:prstGeom>
-                  </pic:spPr>
-                </pic:pic>
-              </a:graphicData>
-            </a:graphic>
-          </wp:inline>
-        </w:drawing>
-      </w:r>
-    </w:p>
-    <w:p>
-      <w:pPr>
-        <w:spacing w:after="160"/>
-      </w:pPr>
-      <w:r>
-        <w:rPr>
-          <w:i/>
-          <w:color w:val="6B7770"/>
-          <w:sz w:val="17"/>
-          <w:szCs w:val="17"/>
-        </w:rPr>
-        <w:t xml:space="preserve">Figure 16 – Marge nette par exercice</w:t>
-      </w:r>
-    </w:p>
-    <w:p>
-      <w:r>
-        <w:t xml:space="preserve">Passe de </w:t>
-      </w:r>
-      <w:r>
-        <w:rPr>
-          <w:b/>
-        </w:rPr>
-        <w:t xml:space="preserve">18,50 %</w:t>
-      </w:r>
-      <w:r>
-        <w:t xml:space="preserve"> en 2021 à </w:t>
-      </w:r>
-      <w:r>
-        <w:rPr>
-          <w:b/>
-        </w:rPr>
-        <w:t xml:space="preserve">14,82 %</w:t>
-      </w:r>
-      <w:r>
-        <w:t xml:space="preserve"> en 2023 (−3,68 pt), avec une hausse en 2022 puis une baisse en 2023. Une part décroissante du PNB se transforme en bénéfice.</w:t>
-      </w:r>
     </w:p>
     <w:p>
       <w:pPr>
@@ -18077,7 +17761,7 @@
                 <w:rPr>
                   <w:rFonts w:ascii="Cambria Math" w:hAnsi="Cambria Math"/>
                 </w:rPr>
-                <m:t xml:space="preserve">12 000</m:t>
+                <m:t xml:space="preserve">?</m:t>
               </m:r>
             </m:num>
             <m:den>
@@ -18088,7 +17772,7 @@
                 <w:rPr>
                   <w:rFonts w:ascii="Cambria Math" w:hAnsi="Cambria Math"/>
                 </w:rPr>
-                <m:t xml:space="preserve">16 822</m:t>
+                <m:t xml:space="preserve">?</m:t>
               </m:r>
             </m:den>
           </m:f>
@@ -18099,7 +17783,7 @@
             <w:rPr>
               <w:rFonts w:ascii="Cambria Math" w:hAnsi="Cambria Math"/>
             </w:rPr>
-            <m:t xml:space="preserve"> = 71,34 %</m:t>
+            <m:t xml:space="preserve"> = —</m:t>
           </m:r>
         </m:oMath>
       </m:oMathPara>
@@ -18146,7 +17830,7 @@
                 <w:rPr>
                   <w:rFonts w:ascii="Cambria Math" w:hAnsi="Cambria Math"/>
                 </w:rPr>
-                <m:t xml:space="preserve">12 800</m:t>
+                <m:t xml:space="preserve">?</m:t>
               </m:r>
             </m:num>
             <m:den>
@@ -18157,7 +17841,7 @@
                 <w:rPr>
                   <w:rFonts w:ascii="Cambria Math" w:hAnsi="Cambria Math"/>
                 </w:rPr>
-                <m:t xml:space="preserve">17 469</m:t>
+                <m:t xml:space="preserve">?</m:t>
               </m:r>
             </m:den>
           </m:f>
@@ -18168,7 +17852,7 @@
             <w:rPr>
               <w:rFonts w:ascii="Cambria Math" w:hAnsi="Cambria Math"/>
             </w:rPr>
-            <m:t xml:space="preserve"> = 73,27 %</m:t>
+            <m:t xml:space="preserve"> = —</m:t>
           </m:r>
         </m:oMath>
       </m:oMathPara>
@@ -18215,7 +17899,7 @@
                 <w:rPr>
                   <w:rFonts w:ascii="Cambria Math" w:hAnsi="Cambria Math"/>
                 </w:rPr>
-                <m:t xml:space="preserve">14 000</m:t>
+                <m:t xml:space="preserve">?</m:t>
               </m:r>
             </m:num>
             <m:den>
@@ -18226,7 +17910,7 @@
                 <w:rPr>
                   <w:rFonts w:ascii="Cambria Math" w:hAnsi="Cambria Math"/>
                 </w:rPr>
-                <m:t xml:space="preserve">19 620</m:t>
+                <m:t xml:space="preserve">?</m:t>
               </m:r>
             </m:den>
           </m:f>
@@ -18237,10 +17921,24 @@
             <w:rPr>
               <w:rFonts w:ascii="Cambria Math" w:hAnsi="Cambria Math"/>
             </w:rPr>
-            <m:t xml:space="preserve"> = 71,36 %</m:t>
+            <m:t xml:space="preserve"> = —</m:t>
           </m:r>
         </m:oMath>
       </m:oMathPara>
+    </w:p>
+    <w:p>
+      <w:pPr>
+        <w:pStyle w:val="Note"/>
+      </w:pPr>
+      <w:r>
+        <w:rPr>
+          <w:i/>
+          <w:color w:val="6B7770"/>
+          <w:sz w:val="18"/>
+          <w:szCs w:val="18"/>
+        </w:rPr>
+        <w:t xml:space="preserve">Données manquantes pour 2023 : Intérêts et produits assimilés, Intérêts et charges assimilées, Revenus des titres à revenu variable, Commissions (charges), Gains ou pertes nets sur portefeuilles de négociation, Gains ou pertes nets sur portefeuilles de placement, Autres produits d'exploitation bancaire, Autres charges d'exploitation bancaire.</w:t>
+      </w:r>
     </w:p>
     <w:tbl>
       <w:tblPr>
@@ -18376,7 +18074,7 @@
                 <w:sz w:val="18"/>
                 <w:szCs w:val="18"/>
               </w:rPr>
-              <w:t xml:space="preserve">71,34 %</w:t>
+              <w:t xml:space="preserve">—</w:t>
             </w:r>
           </w:p>
         </w:tc>
@@ -18394,7 +18092,7 @@
                 <w:sz w:val="18"/>
                 <w:szCs w:val="18"/>
               </w:rPr>
-              <w:t xml:space="preserve">73,27 %</w:t>
+              <w:t xml:space="preserve">—</w:t>
             </w:r>
           </w:p>
         </w:tc>
@@ -18412,7 +18110,7 @@
                 <w:sz w:val="18"/>
                 <w:szCs w:val="18"/>
               </w:rPr>
-              <w:t xml:space="preserve">71,36 %</w:t>
+              <w:t xml:space="preserve">—</w:t>
             </w:r>
           </w:p>
         </w:tc>
@@ -18454,7 +18152,7 @@
                 <w:sz w:val="18"/>
                 <w:szCs w:val="18"/>
               </w:rPr>
-              <w:t xml:space="preserve"/>
+              <w:t xml:space="preserve">Non calculé</w:t>
             </w:r>
           </w:p>
         </w:tc>
@@ -18473,7 +18171,7 @@
                 <w:sz w:val="18"/>
                 <w:szCs w:val="18"/>
               </w:rPr>
-              <w:t xml:space="preserve"/>
+              <w:t xml:space="preserve">Non calculé</w:t>
             </w:r>
           </w:p>
         </w:tc>
@@ -18492,7 +18190,7 @@
                 <w:sz w:val="18"/>
                 <w:szCs w:val="18"/>
               </w:rPr>
-              <w:t xml:space="preserve"/>
+              <w:t xml:space="preserve">Non calculé</w:t>
             </w:r>
           </w:p>
         </w:tc>
@@ -18502,85 +18200,6 @@
       <w:pPr>
         <w:spacing w:after="60"/>
       </w:pPr>
-    </w:p>
-    <w:p>
-      <w:pPr>
-        <w:keepNext/>
-        <w:spacing w:after="0"/>
-      </w:pPr>
-      <w:r>
-        <w:drawing>
-          <wp:inline distT="0" distB="0" distL="0" distR="0">
-            <wp:extent cx="5400000" cy="2227500"/>
-            <wp:docPr id="17" name="Graphique 17"/>
-            <wp:cNvGraphicFramePr>
-              <a:graphicFrameLocks xmlns:a="http://schemas.openxmlformats.org/drawingml/2006/main" noChangeAspect="1"/>
-            </wp:cNvGraphicFramePr>
-            <a:graphic xmlns:a="http://schemas.openxmlformats.org/drawingml/2006/main">
-              <a:graphicData uri="http://schemas.openxmlformats.org/drawingml/2006/picture">
-                <pic:pic xmlns:pic="http://schemas.openxmlformats.org/drawingml/2006/picture">
-                  <pic:nvPicPr>
-                    <pic:cNvPr id="17" name="graphique17.png"/>
-                    <pic:cNvPicPr/>
-                  </pic:nvPicPr>
-                  <pic:blipFill>
-                    <a:blip r:embed="rIdImg17"/>
-                    <a:stretch>
-                      <a:fillRect/>
-                    </a:stretch>
-                  </pic:blipFill>
-                  <pic:spPr>
-                    <a:xfrm>
-                      <a:off x="0" y="0"/>
-                      <a:ext cx="5400000" cy="2227500"/>
-                    </a:xfrm>
-                    <a:prstGeom prst="rect">
-                      <a:avLst/>
-                    </a:prstGeom>
-                  </pic:spPr>
-                </pic:pic>
-              </a:graphicData>
-            </a:graphic>
-          </wp:inline>
-        </w:drawing>
-      </w:r>
-    </w:p>
-    <w:p>
-      <w:pPr>
-        <w:spacing w:after="160"/>
-      </w:pPr>
-      <w:r>
-        <w:rPr>
-          <w:i/>
-          <w:color w:val="6B7770"/>
-          <w:sz w:val="17"/>
-          <w:szCs w:val="17"/>
-        </w:rPr>
-        <w:t xml:space="preserve">Figure 17 – Marge d'intérêts / PNB par exercice</w:t>
-      </w:r>
-    </w:p>
-    <w:p>
-      <w:r>
-        <w:t xml:space="preserve">Passe de </w:t>
-      </w:r>
-      <w:r>
-        <w:rPr>
-          <w:b/>
-        </w:rPr>
-        <w:t xml:space="preserve">71,34 %</w:t>
-      </w:r>
-      <w:r>
-        <w:t xml:space="preserve"> en 2021 à </w:t>
-      </w:r>
-      <w:r>
-        <w:rPr>
-          <w:b/>
-        </w:rPr>
-        <w:t xml:space="preserve">71,36 %</w:t>
-      </w:r>
-      <w:r>
-        <w:t xml:space="preserve"> en 2023 (+0,02 pt), avec une hausse en 2022 puis une baisse en 2023.</w:t>
-      </w:r>
     </w:p>
     <w:p>
       <w:pPr>
@@ -18716,7 +18335,7 @@
                 <w:rPr>
                   <w:rFonts w:ascii="Cambria Math" w:hAnsi="Cambria Math"/>
                 </w:rPr>
-                <m:t xml:space="preserve">4 322</m:t>
+                <m:t xml:space="preserve">?</m:t>
               </m:r>
             </m:num>
             <m:den>
@@ -18727,7 +18346,7 @@
                 <w:rPr>
                   <w:rFonts w:ascii="Cambria Math" w:hAnsi="Cambria Math"/>
                 </w:rPr>
-                <m:t xml:space="preserve">16 822</m:t>
+                <m:t xml:space="preserve">?</m:t>
               </m:r>
             </m:den>
           </m:f>
@@ -18738,7 +18357,7 @@
             <w:rPr>
               <w:rFonts w:ascii="Cambria Math" w:hAnsi="Cambria Math"/>
             </w:rPr>
-            <m:t xml:space="preserve"> = 25,69 %</m:t>
+            <m:t xml:space="preserve"> = —</m:t>
           </m:r>
         </m:oMath>
       </m:oMathPara>
@@ -18785,7 +18404,7 @@
                 <w:rPr>
                   <w:rFonts w:ascii="Cambria Math" w:hAnsi="Cambria Math"/>
                 </w:rPr>
-                <m:t xml:space="preserve">4 369</m:t>
+                <m:t xml:space="preserve">?</m:t>
               </m:r>
             </m:num>
             <m:den>
@@ -18796,7 +18415,7 @@
                 <w:rPr>
                   <w:rFonts w:ascii="Cambria Math" w:hAnsi="Cambria Math"/>
                 </w:rPr>
-                <m:t xml:space="preserve">17 469</m:t>
+                <m:t xml:space="preserve">?</m:t>
               </m:r>
             </m:den>
           </m:f>
@@ -18807,7 +18426,7 @@
             <w:rPr>
               <w:rFonts w:ascii="Cambria Math" w:hAnsi="Cambria Math"/>
             </w:rPr>
-            <m:t xml:space="preserve"> = 25,01 %</m:t>
+            <m:t xml:space="preserve"> = —</m:t>
           </m:r>
         </m:oMath>
       </m:oMathPara>
@@ -18854,7 +18473,7 @@
                 <w:rPr>
                   <w:rFonts w:ascii="Cambria Math" w:hAnsi="Cambria Math"/>
                 </w:rPr>
-                <m:t xml:space="preserve">4 970</m:t>
+                <m:t xml:space="preserve">?</m:t>
               </m:r>
             </m:num>
             <m:den>
@@ -18865,7 +18484,7 @@
                 <w:rPr>
                   <w:rFonts w:ascii="Cambria Math" w:hAnsi="Cambria Math"/>
                 </w:rPr>
-                <m:t xml:space="preserve">19 620</m:t>
+                <m:t xml:space="preserve">?</m:t>
               </m:r>
             </m:den>
           </m:f>
@@ -18876,10 +18495,24 @@
             <w:rPr>
               <w:rFonts w:ascii="Cambria Math" w:hAnsi="Cambria Math"/>
             </w:rPr>
-            <m:t xml:space="preserve"> = 25,33 %</m:t>
+            <m:t xml:space="preserve"> = —</m:t>
           </m:r>
         </m:oMath>
       </m:oMathPara>
+    </w:p>
+    <w:p>
+      <w:pPr>
+        <w:pStyle w:val="Note"/>
+      </w:pPr>
+      <w:r>
+        <w:rPr>
+          <w:i/>
+          <w:color w:val="6B7770"/>
+          <w:sz w:val="18"/>
+          <w:szCs w:val="18"/>
+        </w:rPr>
+        <w:t xml:space="preserve">Données manquantes pour 2023 : Commissions (charges), Intérêts et produits assimilés, Intérêts et charges assimilées, Revenus des titres à revenu variable, Gains ou pertes nets sur portefeuilles de négociation, Gains ou pertes nets sur portefeuilles de placement, Autres produits d'exploitation bancaire, Autres charges d'exploitation bancaire.</w:t>
+      </w:r>
     </w:p>
     <w:tbl>
       <w:tblPr>
@@ -19015,7 +18648,7 @@
                 <w:sz w:val="18"/>
                 <w:szCs w:val="18"/>
               </w:rPr>
-              <w:t xml:space="preserve">25,69 %</w:t>
+              <w:t xml:space="preserve">—</w:t>
             </w:r>
           </w:p>
         </w:tc>
@@ -19033,7 +18666,7 @@
                 <w:sz w:val="18"/>
                 <w:szCs w:val="18"/>
               </w:rPr>
-              <w:t xml:space="preserve">25,01 %</w:t>
+              <w:t xml:space="preserve">—</w:t>
             </w:r>
           </w:p>
         </w:tc>
@@ -19051,7 +18684,7 @@
                 <w:sz w:val="18"/>
                 <w:szCs w:val="18"/>
               </w:rPr>
-              <w:t xml:space="preserve">25,33 %</w:t>
+              <w:t xml:space="preserve">—</w:t>
             </w:r>
           </w:p>
         </w:tc>
@@ -19093,7 +18726,7 @@
                 <w:sz w:val="18"/>
                 <w:szCs w:val="18"/>
               </w:rPr>
-              <w:t xml:space="preserve"/>
+              <w:t xml:space="preserve">Non calculé</w:t>
             </w:r>
           </w:p>
         </w:tc>
@@ -19112,7 +18745,7 @@
                 <w:sz w:val="18"/>
                 <w:szCs w:val="18"/>
               </w:rPr>
-              <w:t xml:space="preserve"/>
+              <w:t xml:space="preserve">Non calculé</w:t>
             </w:r>
           </w:p>
         </w:tc>
@@ -19131,7 +18764,7 @@
                 <w:sz w:val="18"/>
                 <w:szCs w:val="18"/>
               </w:rPr>
-              <w:t xml:space="preserve"/>
+              <w:t xml:space="preserve">Non calculé</w:t>
             </w:r>
           </w:p>
         </w:tc>
@@ -19141,85 +18774,6 @@
       <w:pPr>
         <w:spacing w:after="60"/>
       </w:pPr>
-    </w:p>
-    <w:p>
-      <w:pPr>
-        <w:keepNext/>
-        <w:spacing w:after="0"/>
-      </w:pPr>
-      <w:r>
-        <w:drawing>
-          <wp:inline distT="0" distB="0" distL="0" distR="0">
-            <wp:extent cx="5400000" cy="2227500"/>
-            <wp:docPr id="18" name="Graphique 18"/>
-            <wp:cNvGraphicFramePr>
-              <a:graphicFrameLocks xmlns:a="http://schemas.openxmlformats.org/drawingml/2006/main" noChangeAspect="1"/>
-            </wp:cNvGraphicFramePr>
-            <a:graphic xmlns:a="http://schemas.openxmlformats.org/drawingml/2006/main">
-              <a:graphicData uri="http://schemas.openxmlformats.org/drawingml/2006/picture">
-                <pic:pic xmlns:pic="http://schemas.openxmlformats.org/drawingml/2006/picture">
-                  <pic:nvPicPr>
-                    <pic:cNvPr id="18" name="graphique18.png"/>
-                    <pic:cNvPicPr/>
-                  </pic:nvPicPr>
-                  <pic:blipFill>
-                    <a:blip r:embed="rIdImg18"/>
-                    <a:stretch>
-                      <a:fillRect/>
-                    </a:stretch>
-                  </pic:blipFill>
-                  <pic:spPr>
-                    <a:xfrm>
-                      <a:off x="0" y="0"/>
-                      <a:ext cx="5400000" cy="2227500"/>
-                    </a:xfrm>
-                    <a:prstGeom prst="rect">
-                      <a:avLst/>
-                    </a:prstGeom>
-                  </pic:spPr>
-                </pic:pic>
-              </a:graphicData>
-            </a:graphic>
-          </wp:inline>
-        </w:drawing>
-      </w:r>
-    </w:p>
-    <w:p>
-      <w:pPr>
-        <w:spacing w:after="160"/>
-      </w:pPr>
-      <w:r>
-        <w:rPr>
-          <w:i/>
-          <w:color w:val="6B7770"/>
-          <w:sz w:val="17"/>
-          <w:szCs w:val="17"/>
-        </w:rPr>
-        <w:t xml:space="preserve">Figure 18 – Commissions nettes / PNB par exercice</w:t>
-      </w:r>
-    </w:p>
-    <w:p>
-      <w:r>
-        <w:t xml:space="preserve">Passe de </w:t>
-      </w:r>
-      <w:r>
-        <w:rPr>
-          <w:b/>
-        </w:rPr>
-        <w:t xml:space="preserve">25,69 %</w:t>
-      </w:r>
-      <w:r>
-        <w:t xml:space="preserve"> en 2021 à </w:t>
-      </w:r>
-      <w:r>
-        <w:rPr>
-          <w:b/>
-        </w:rPr>
-        <w:t xml:space="preserve">25,33 %</w:t>
-      </w:r>
-      <w:r>
-        <w:t xml:space="preserve"> en 2023 (−0,36 pt), avec une baisse en 2022 puis une hausse en 2023.</w:t>
-      </w:r>
     </w:p>
     <w:p>
       <w:pPr>
@@ -19355,7 +18909,7 @@
                 <w:rPr>
                   <w:rFonts w:ascii="Cambria Math" w:hAnsi="Cambria Math"/>
                 </w:rPr>
-                <m:t xml:space="preserve">16 822</m:t>
+                <m:t xml:space="preserve">?</m:t>
               </m:r>
             </m:num>
             <m:den>
@@ -19377,7 +18931,7 @@
             <w:rPr>
               <w:rFonts w:ascii="Cambria Math" w:hAnsi="Cambria Math"/>
             </w:rPr>
-            <m:t xml:space="preserve"> = 5,57 %</m:t>
+            <m:t xml:space="preserve"> = —</m:t>
           </m:r>
         </m:oMath>
       </m:oMathPara>
@@ -19424,7 +18978,7 @@
                 <w:rPr>
                   <w:rFonts w:ascii="Cambria Math" w:hAnsi="Cambria Math"/>
                 </w:rPr>
-                <m:t xml:space="preserve">17 469</m:t>
+                <m:t xml:space="preserve">?</m:t>
               </m:r>
             </m:num>
             <m:den>
@@ -19446,7 +19000,7 @@
             <w:rPr>
               <w:rFonts w:ascii="Cambria Math" w:hAnsi="Cambria Math"/>
             </w:rPr>
-            <m:t xml:space="preserve"> = 6,49 %</m:t>
+            <m:t xml:space="preserve"> = —</m:t>
           </m:r>
         </m:oMath>
       </m:oMathPara>
@@ -19493,7 +19047,7 @@
                 <w:rPr>
                   <w:rFonts w:ascii="Cambria Math" w:hAnsi="Cambria Math"/>
                 </w:rPr>
-                <m:t xml:space="preserve">19 620</m:t>
+                <m:t xml:space="preserve">?</m:t>
               </m:r>
             </m:num>
             <m:den>
@@ -19515,10 +19069,24 @@
             <w:rPr>
               <w:rFonts w:ascii="Cambria Math" w:hAnsi="Cambria Math"/>
             </w:rPr>
-            <m:t xml:space="preserve"> = 6,64 %</m:t>
+            <m:t xml:space="preserve"> = —</m:t>
           </m:r>
         </m:oMath>
       </m:oMathPara>
+    </w:p>
+    <w:p>
+      <w:pPr>
+        <w:pStyle w:val="Note"/>
+      </w:pPr>
+      <w:r>
+        <w:rPr>
+          <w:i/>
+          <w:color w:val="6B7770"/>
+          <w:sz w:val="18"/>
+          <w:szCs w:val="18"/>
+        </w:rPr>
+        <w:t xml:space="preserve">Données manquantes pour 2023 : Intérêts et produits assimilés, Intérêts et charges assimilées, Revenus des titres à revenu variable, Commissions (charges), Gains ou pertes nets sur portefeuilles de négociation, Gains ou pertes nets sur portefeuilles de placement, Autres produits d'exploitation bancaire, Autres charges d'exploitation bancaire.</w:t>
+      </w:r>
     </w:p>
     <w:tbl>
       <w:tblPr>
@@ -19654,7 +19222,7 @@
                 <w:sz w:val="18"/>
                 <w:szCs w:val="18"/>
               </w:rPr>
-              <w:t xml:space="preserve">5,57 %</w:t>
+              <w:t xml:space="preserve">—</w:t>
             </w:r>
           </w:p>
         </w:tc>
@@ -19672,7 +19240,7 @@
                 <w:sz w:val="18"/>
                 <w:szCs w:val="18"/>
               </w:rPr>
-              <w:t xml:space="preserve">6,49 %</w:t>
+              <w:t xml:space="preserve">—</w:t>
             </w:r>
           </w:p>
         </w:tc>
@@ -19690,7 +19258,7 @@
                 <w:sz w:val="18"/>
                 <w:szCs w:val="18"/>
               </w:rPr>
-              <w:t xml:space="preserve">6,64 %</w:t>
+              <w:t xml:space="preserve">—</w:t>
             </w:r>
           </w:p>
         </w:tc>
@@ -19732,7 +19300,7 @@
                 <w:sz w:val="18"/>
                 <w:szCs w:val="18"/>
               </w:rPr>
-              <w:t xml:space="preserve"/>
+              <w:t xml:space="preserve">Non calculé</w:t>
             </w:r>
           </w:p>
         </w:tc>
@@ -19751,7 +19319,7 @@
                 <w:sz w:val="18"/>
                 <w:szCs w:val="18"/>
               </w:rPr>
-              <w:t xml:space="preserve"/>
+              <w:t xml:space="preserve">Non calculé</w:t>
             </w:r>
           </w:p>
         </w:tc>
@@ -19770,7 +19338,7 @@
                 <w:sz w:val="18"/>
                 <w:szCs w:val="18"/>
               </w:rPr>
-              <w:t xml:space="preserve"/>
+              <w:t xml:space="preserve">Non calculé</w:t>
             </w:r>
           </w:p>
         </w:tc>
@@ -19780,85 +19348,6 @@
       <w:pPr>
         <w:spacing w:after="60"/>
       </w:pPr>
-    </w:p>
-    <w:p>
-      <w:pPr>
-        <w:keepNext/>
-        <w:spacing w:after="0"/>
-      </w:pPr>
-      <w:r>
-        <w:drawing>
-          <wp:inline distT="0" distB="0" distL="0" distR="0">
-            <wp:extent cx="5400000" cy="2227500"/>
-            <wp:docPr id="19" name="Graphique 19"/>
-            <wp:cNvGraphicFramePr>
-              <a:graphicFrameLocks xmlns:a="http://schemas.openxmlformats.org/drawingml/2006/main" noChangeAspect="1"/>
-            </wp:cNvGraphicFramePr>
-            <a:graphic xmlns:a="http://schemas.openxmlformats.org/drawingml/2006/main">
-              <a:graphicData uri="http://schemas.openxmlformats.org/drawingml/2006/picture">
-                <pic:pic xmlns:pic="http://schemas.openxmlformats.org/drawingml/2006/picture">
-                  <pic:nvPicPr>
-                    <pic:cNvPr id="19" name="graphique19.png"/>
-                    <pic:cNvPicPr/>
-                  </pic:nvPicPr>
-                  <pic:blipFill>
-                    <a:blip r:embed="rIdImg19"/>
-                    <a:stretch>
-                      <a:fillRect/>
-                    </a:stretch>
-                  </pic:blipFill>
-                  <pic:spPr>
-                    <a:xfrm>
-                      <a:off x="0" y="0"/>
-                      <a:ext cx="5400000" cy="2227500"/>
-                    </a:xfrm>
-                    <a:prstGeom prst="rect">
-                      <a:avLst/>
-                    </a:prstGeom>
-                  </pic:spPr>
-                </pic:pic>
-              </a:graphicData>
-            </a:graphic>
-          </wp:inline>
-        </w:drawing>
-      </w:r>
-    </w:p>
-    <w:p>
-      <w:pPr>
-        <w:spacing w:after="160"/>
-      </w:pPr>
-      <w:r>
-        <w:rPr>
-          <w:i/>
-          <w:color w:val="6B7770"/>
-          <w:sz w:val="17"/>
-          <w:szCs w:val="17"/>
-        </w:rPr>
-        <w:t xml:space="preserve">Figure 19 – PNB / Total actif par exercice</w:t>
-      </w:r>
-    </w:p>
-    <w:p>
-      <w:r>
-        <w:t xml:space="preserve">Passe de </w:t>
-      </w:r>
-      <w:r>
-        <w:rPr>
-          <w:b/>
-        </w:rPr>
-        <w:t xml:space="preserve">5,57 %</w:t>
-      </w:r>
-      <w:r>
-        <w:t xml:space="preserve"> en 2021 à </w:t>
-      </w:r>
-      <w:r>
-        <w:rPr>
-          <w:b/>
-        </w:rPr>
-        <w:t xml:space="preserve">6,64 %</w:t>
-      </w:r>
-      <w:r>
-        <w:t xml:space="preserve"> en 2023 (+1,06 pt), hausse continue sur la période. Les actifs génèrent plus de revenus.</w:t>
-      </w:r>
     </w:p>
     <w:p>
       <w:pPr>
@@ -19891,7 +19380,34 @@
             <w:rPr>
               <w:rFonts w:ascii="Cambria Math" w:hAnsi="Cambria Math"/>
             </w:rPr>
-            <m:t xml:space="preserve">RN* = − Capitaux propres</m:t>
+            <m:t xml:space="preserve">RN∗</m:t>
+          </m:r>
+          <m:r>
+            <m:rPr>
+              <m:sty m:val="p"/>
+            </m:rPr>
+            <w:rPr>
+              <w:rFonts w:ascii="Cambria Math" w:hAnsi="Cambria Math"/>
+            </w:rPr>
+            <m:t xml:space="preserve"> = </m:t>
+          </m:r>
+          <m:r>
+            <m:rPr>
+              <m:sty m:val="p"/>
+            </m:rPr>
+            <w:rPr>
+              <w:rFonts w:ascii="Cambria Math" w:hAnsi="Cambria Math"/>
+            </w:rPr>
+            <m:t xml:space="preserve">−</m:t>
+          </m:r>
+          <m:r>
+            <m:rPr>
+              <m:sty m:val="p"/>
+            </m:rPr>
+            <w:rPr>
+              <w:rFonts w:ascii="Cambria Math" w:hAnsi="Cambria Math"/>
+            </w:rPr>
+            <m:t xml:space="preserve">Capitaux propres</m:t>
           </m:r>
         </m:oMath>
       </m:oMathPara>
@@ -19912,7 +19428,157 @@
             <w:rPr>
               <w:rFonts w:ascii="Cambria Math" w:hAnsi="Cambria Math"/>
             </w:rPr>
-            <m:t xml:space="preserve">PNB* = − Capitaux propres − Subventions + Charges générales + Dotations + Coût du risque − Gains sur actifs immobilisés</m:t>
+            <m:t xml:space="preserve">PNB∗ = </m:t>
+          </m:r>
+          <m:r>
+            <m:rPr>
+              <m:sty m:val="p"/>
+            </m:rPr>
+            <w:rPr>
+              <w:rFonts w:ascii="Cambria Math" w:hAnsi="Cambria Math"/>
+            </w:rPr>
+            <m:t xml:space="preserve">−</m:t>
+          </m:r>
+          <m:r>
+            <m:rPr>
+              <m:sty m:val="p"/>
+            </m:rPr>
+            <w:rPr>
+              <w:rFonts w:ascii="Cambria Math" w:hAnsi="Cambria Math"/>
+            </w:rPr>
+            <m:t xml:space="preserve">Capitaux propres</m:t>
+          </m:r>
+          <m:r>
+            <m:rPr>
+              <m:sty m:val="p"/>
+            </m:rPr>
+            <w:rPr>
+              <w:rFonts w:ascii="Cambria Math" w:hAnsi="Cambria Math"/>
+            </w:rPr>
+            <m:t xml:space="preserve"> − </m:t>
+          </m:r>
+          <m:r>
+            <m:rPr>
+              <m:sty m:val="p"/>
+            </m:rPr>
+            <w:rPr>
+              <w:rFonts w:ascii="Cambria Math" w:hAnsi="Cambria Math"/>
+            </w:rPr>
+            <m:t xml:space="preserve">Subventions</m:t>
+          </m:r>
+          <m:r>
+            <m:rPr>
+              <m:sty m:val="p"/>
+            </m:rPr>
+            <w:rPr>
+              <w:rFonts w:ascii="Cambria Math" w:hAnsi="Cambria Math"/>
+            </w:rPr>
+            <m:t xml:space="preserve"> + </m:t>
+          </m:r>
+          <m:r>
+            <m:rPr>
+              <m:sty m:val="p"/>
+            </m:rPr>
+            <w:rPr>
+              <w:rFonts w:ascii="Cambria Math" w:hAnsi="Cambria Math"/>
+            </w:rPr>
+            <m:t xml:space="preserve">Charges générales</m:t>
+          </m:r>
+        </m:oMath>
+      </m:oMathPara>
+    </w:p>
+    <w:p>
+      <w:pPr>
+        <w:spacing w:after="80"/>
+      </w:pPr>
+      <m:oMathPara>
+        <m:oMathParaPr>
+          <m:jc m:val="left"/>
+        </m:oMathParaPr>
+        <m:oMath>
+          <m:r>
+            <m:rPr>
+              <m:sty m:val="p"/>
+            </m:rPr>
+            <w:rPr>
+              <w:rFonts w:ascii="Cambria Math" w:hAnsi="Cambria Math"/>
+            </w:rPr>
+            <m:t xml:space="preserve">      </m:t>
+          </m:r>
+          <m:r>
+            <m:rPr>
+              <m:sty m:val="p"/>
+            </m:rPr>
+            <w:rPr>
+              <w:rFonts w:ascii="Cambria Math" w:hAnsi="Cambria Math"/>
+            </w:rPr>
+            <m:t xml:space="preserve"> + </m:t>
+          </m:r>
+          <m:r>
+            <m:rPr>
+              <m:sty m:val="p"/>
+            </m:rPr>
+            <w:rPr>
+              <w:rFonts w:ascii="Cambria Math" w:hAnsi="Cambria Math"/>
+            </w:rPr>
+            <m:t xml:space="preserve">Dotations amortissements</m:t>
+          </m:r>
+          <m:r>
+            <m:rPr>
+              <m:sty m:val="p"/>
+            </m:rPr>
+            <w:rPr>
+              <w:rFonts w:ascii="Cambria Math" w:hAnsi="Cambria Math"/>
+            </w:rPr>
+            <m:t xml:space="preserve"> + </m:t>
+          </m:r>
+          <m:r>
+            <m:rPr>
+              <m:sty m:val="p"/>
+            </m:rPr>
+            <w:rPr>
+              <w:rFonts w:ascii="Cambria Math" w:hAnsi="Cambria Math"/>
+            </w:rPr>
+            <m:t xml:space="preserve">Coût du risque</m:t>
+          </m:r>
+        </m:oMath>
+      </m:oMathPara>
+    </w:p>
+    <w:p>
+      <w:pPr>
+        <w:spacing w:after="80"/>
+      </w:pPr>
+      <m:oMathPara>
+        <m:oMathParaPr>
+          <m:jc m:val="left"/>
+        </m:oMathParaPr>
+        <m:oMath>
+          <m:r>
+            <m:rPr>
+              <m:sty m:val="p"/>
+            </m:rPr>
+            <w:rPr>
+              <w:rFonts w:ascii="Cambria Math" w:hAnsi="Cambria Math"/>
+            </w:rPr>
+            <m:t xml:space="preserve">      </m:t>
+          </m:r>
+          <m:r>
+            <m:rPr>
+              <m:sty m:val="p"/>
+            </m:rPr>
+            <w:rPr>
+              <w:rFonts w:ascii="Cambria Math" w:hAnsi="Cambria Math"/>
+            </w:rPr>
+            <m:t xml:space="preserve"> − </m:t>
+          </m:r>
+          <m:r>
+            <m:rPr>
+              <m:sty m:val="p"/>
+            </m:rPr>
+            <w:rPr>
+              <w:rFonts w:ascii="Cambria Math" w:hAnsi="Cambria Math"/>
+            </w:rPr>
+            <m:t xml:space="preserve">Gains sur actifs immobilisés</m:t>
           </m:r>
         </m:oMath>
       </m:oMathPara>
@@ -20213,7 +19879,7 @@
                 <w:sz w:val="18"/>
                 <w:szCs w:val="18"/>
               </w:rPr>
-              <w:t xml:space="preserve">16 822</w:t>
+              <w:t xml:space="preserve">—</w:t>
             </w:r>
           </w:p>
         </w:tc>
@@ -20231,7 +19897,7 @@
                 <w:sz w:val="18"/>
                 <w:szCs w:val="18"/>
               </w:rPr>
-              <w:t xml:space="preserve">17 469</w:t>
+              <w:t xml:space="preserve">—</w:t>
             </w:r>
           </w:p>
         </w:tc>
@@ -20249,7 +19915,7 @@
                 <w:sz w:val="18"/>
                 <w:szCs w:val="18"/>
               </w:rPr>
-              <w:t xml:space="preserve">19 620</w:t>
+              <w:t xml:space="preserve">—</w:t>
             </w:r>
           </w:p>
         </w:tc>
@@ -20294,7 +19960,7 @@
                 <w:sz w:val="18"/>
                 <w:szCs w:val="18"/>
               </w:rPr>
-              <w:t xml:space="preserve">−9 097</w:t>
+              <w:t xml:space="preserve">—</w:t>
             </w:r>
           </w:p>
         </w:tc>
@@ -20314,7 +19980,7 @@
                 <w:sz w:val="18"/>
                 <w:szCs w:val="18"/>
               </w:rPr>
-              <w:t xml:space="preserve">−12 581</w:t>
+              <w:t xml:space="preserve">—</w:t>
             </w:r>
           </w:p>
         </w:tc>
@@ -20334,7 +20000,7 @@
                 <w:sz w:val="18"/>
                 <w:szCs w:val="18"/>
               </w:rPr>
-              <w:t xml:space="preserve">−13 669</w:t>
+              <w:t xml:space="preserve">—</w:t>
             </w:r>
           </w:p>
         </w:tc>
@@ -20375,7 +20041,7 @@
                 <w:sz w:val="18"/>
                 <w:szCs w:val="18"/>
               </w:rPr>
-              <w:t xml:space="preserve">25 919</w:t>
+              <w:t xml:space="preserve">—</w:t>
             </w:r>
           </w:p>
         </w:tc>
@@ -20393,7 +20059,7 @@
                 <w:sz w:val="18"/>
                 <w:szCs w:val="18"/>
               </w:rPr>
-              <w:t xml:space="preserve">30 050</w:t>
+              <w:t xml:space="preserve">—</w:t>
             </w:r>
           </w:p>
         </w:tc>
@@ -20411,7 +20077,7 @@
                 <w:sz w:val="18"/>
                 <w:szCs w:val="18"/>
               </w:rPr>
-              <w:t xml:space="preserve">33 289</w:t>
+              <w:t xml:space="preserve">—</w:t>
             </w:r>
           </w:p>
         </w:tc>
@@ -20456,7 +20122,7 @@
                 <w:sz w:val="18"/>
                 <w:szCs w:val="18"/>
               </w:rPr>
-              <w:t xml:space="preserve">154,1 %</w:t>
+              <w:t xml:space="preserve">—</w:t>
             </w:r>
           </w:p>
         </w:tc>
@@ -20476,7 +20142,7 @@
                 <w:sz w:val="18"/>
                 <w:szCs w:val="18"/>
               </w:rPr>
-              <w:t xml:space="preserve">172,0 %</w:t>
+              <w:t xml:space="preserve">—</w:t>
             </w:r>
           </w:p>
         </w:tc>
@@ -20496,7 +20162,7 @@
                 <w:sz w:val="18"/>
                 <w:szCs w:val="18"/>
               </w:rPr>
-              <w:t xml:space="preserve">169,7 %</w:t>
+              <w:t xml:space="preserve">—</w:t>
             </w:r>
           </w:p>
         </w:tc>
@@ -20570,7 +20236,7 @@
             <w:rPr>
               <w:rFonts w:ascii="Cambria Math" w:hAnsi="Cambria Math"/>
             </w:rPr>
-            <m:t xml:space="preserve">PNB critique (PNB*) = </m:t>
+            <m:t xml:space="preserve">PNB critique (PNB∗) = </m:t>
           </m:r>
           <m:r>
             <m:rPr>
@@ -20608,6 +20274,27 @@
             </w:rPr>
             <m:t xml:space="preserve">Subventions</m:t>
           </m:r>
+        </m:oMath>
+      </m:oMathPara>
+    </w:p>
+    <w:p>
+      <w:pPr>
+        <w:spacing w:after="80"/>
+      </w:pPr>
+      <m:oMathPara>
+        <m:oMathParaPr>
+          <m:jc m:val="left"/>
+        </m:oMathParaPr>
+        <m:oMath>
+          <m:r>
+            <m:rPr>
+              <m:sty m:val="p"/>
+            </m:rPr>
+            <w:rPr>
+              <w:rFonts w:ascii="Cambria Math" w:hAnsi="Cambria Math"/>
+            </w:rPr>
+            <m:t xml:space="preserve">      </m:t>
+          </m:r>
           <m:r>
             <m:rPr>
               <m:sty m:val="p"/>
@@ -20661,6 +20348,27 @@
               <w:rFonts w:ascii="Cambria Math" w:hAnsi="Cambria Math"/>
             </w:rPr>
             <m:t xml:space="preserve">Coût du risque</m:t>
+          </m:r>
+        </m:oMath>
+      </m:oMathPara>
+    </w:p>
+    <w:p>
+      <w:pPr>
+        <w:spacing w:after="80"/>
+      </w:pPr>
+      <m:oMathPara>
+        <m:oMathParaPr>
+          <m:jc m:val="left"/>
+        </m:oMathParaPr>
+        <m:oMath>
+          <m:r>
+            <m:rPr>
+              <m:sty m:val="p"/>
+            </m:rPr>
+            <w:rPr>
+              <w:rFonts w:ascii="Cambria Math" w:hAnsi="Cambria Math"/>
+            </w:rPr>
+            <m:t xml:space="preserve">      </m:t>
           </m:r>
           <m:r>
             <m:rPr>
@@ -20714,7 +20422,7 @@
             <w:rPr>
               <w:rFonts w:ascii="Cambria Math" w:hAnsi="Cambria Math"/>
             </w:rPr>
-            <m:t xml:space="preserve">PNB critique (PNB*) = </m:t>
+            <m:t xml:space="preserve">PNB critique (PNB∗) = </m:t>
           </m:r>
           <m:r>
             <m:rPr>
@@ -20750,7 +20458,7 @@
             <w:rPr>
               <w:rFonts w:ascii="Cambria Math" w:hAnsi="Cambria Math"/>
             </w:rPr>
-            <m:t xml:space="preserve">0</m:t>
+            <m:t xml:space="preserve">?</m:t>
           </m:r>
           <m:r>
             <m:rPr>
@@ -20768,7 +20476,7 @@
             <w:rPr>
               <w:rFonts w:ascii="Cambria Math" w:hAnsi="Cambria Math"/>
             </w:rPr>
-            <m:t xml:space="preserve">9 000</m:t>
+            <m:t xml:space="preserve">?</m:t>
           </m:r>
           <m:r>
             <m:rPr>
@@ -20786,7 +20494,7 @@
             <w:rPr>
               <w:rFonts w:ascii="Cambria Math" w:hAnsi="Cambria Math"/>
             </w:rPr>
-            <m:t xml:space="preserve">1 500</m:t>
+            <m:t xml:space="preserve">?</m:t>
           </m:r>
           <m:r>
             <m:rPr>
@@ -20804,7 +20512,7 @@
             <w:rPr>
               <w:rFonts w:ascii="Cambria Math" w:hAnsi="Cambria Math"/>
             </w:rPr>
-            <m:t xml:space="preserve">1 200</m:t>
+            <m:t xml:space="preserve">?</m:t>
           </m:r>
           <m:r>
             <m:rPr>
@@ -20822,16 +20530,16 @@
             <w:rPr>
               <w:rFonts w:ascii="Cambria Math" w:hAnsi="Cambria Math"/>
             </w:rPr>
-            <m:t xml:space="preserve">10</m:t>
-          </m:r>
-          <m:r>
-            <m:rPr>
-              <m:sty m:val="p"/>
-            </m:rPr>
-            <w:rPr>
-              <w:rFonts w:ascii="Cambria Math" w:hAnsi="Cambria Math"/>
-            </w:rPr>
-            <m:t xml:space="preserve"> = −9 097</m:t>
+            <m:t xml:space="preserve">?</m:t>
+          </m:r>
+          <m:r>
+            <m:rPr>
+              <m:sty m:val="p"/>
+            </m:rPr>
+            <w:rPr>
+              <w:rFonts w:ascii="Cambria Math" w:hAnsi="Cambria Math"/>
+            </w:rPr>
+            <m:t xml:space="preserve"> = —</m:t>
           </m:r>
         </m:oMath>
       </m:oMathPara>
@@ -20867,7 +20575,7 @@
             <w:rPr>
               <w:rFonts w:ascii="Cambria Math" w:hAnsi="Cambria Math"/>
             </w:rPr>
-            <m:t xml:space="preserve">PNB critique (PNB*) = </m:t>
+            <m:t xml:space="preserve">PNB critique (PNB∗) = </m:t>
           </m:r>
           <m:r>
             <m:rPr>
@@ -20903,7 +20611,7 @@
             <w:rPr>
               <w:rFonts w:ascii="Cambria Math" w:hAnsi="Cambria Math"/>
             </w:rPr>
-            <m:t xml:space="preserve">0</m:t>
+            <m:t xml:space="preserve">?</m:t>
           </m:r>
           <m:r>
             <m:rPr>
@@ -20921,7 +20629,7 @@
             <w:rPr>
               <w:rFonts w:ascii="Cambria Math" w:hAnsi="Cambria Math"/>
             </w:rPr>
-            <m:t xml:space="preserve">9 300</m:t>
+            <m:t xml:space="preserve">?</m:t>
           </m:r>
           <m:r>
             <m:rPr>
@@ -20939,7 +20647,7 @@
             <w:rPr>
               <w:rFonts w:ascii="Cambria Math" w:hAnsi="Cambria Math"/>
             </w:rPr>
-            <m:t xml:space="preserve">1 600</m:t>
+            <m:t xml:space="preserve">?</m:t>
           </m:r>
           <m:r>
             <m:rPr>
@@ -20957,7 +20665,7 @@
             <w:rPr>
               <w:rFonts w:ascii="Cambria Math" w:hAnsi="Cambria Math"/>
             </w:rPr>
-            <m:t xml:space="preserve">900</m:t>
+            <m:t xml:space="preserve">?</m:t>
           </m:r>
           <m:r>
             <m:rPr>
@@ -20975,16 +20683,16 @@
             <w:rPr>
               <w:rFonts w:ascii="Cambria Math" w:hAnsi="Cambria Math"/>
             </w:rPr>
-            <m:t xml:space="preserve">0</m:t>
-          </m:r>
-          <m:r>
-            <m:rPr>
-              <m:sty m:val="p"/>
-            </m:rPr>
-            <w:rPr>
-              <w:rFonts w:ascii="Cambria Math" w:hAnsi="Cambria Math"/>
-            </w:rPr>
-            <m:t xml:space="preserve"> = −12 581</m:t>
+            <m:t xml:space="preserve">?</m:t>
+          </m:r>
+          <m:r>
+            <m:rPr>
+              <m:sty m:val="p"/>
+            </m:rPr>
+            <w:rPr>
+              <w:rFonts w:ascii="Cambria Math" w:hAnsi="Cambria Math"/>
+            </w:rPr>
+            <m:t xml:space="preserve"> = —</m:t>
           </m:r>
         </m:oMath>
       </m:oMathPara>
@@ -21020,7 +20728,7 @@
             <w:rPr>
               <w:rFonts w:ascii="Cambria Math" w:hAnsi="Cambria Math"/>
             </w:rPr>
-            <m:t xml:space="preserve">PNB critique (PNB*) = </m:t>
+            <m:t xml:space="preserve">PNB critique (PNB∗) = </m:t>
           </m:r>
           <m:r>
             <m:rPr>
@@ -21056,7 +20764,7 @@
             <w:rPr>
               <w:rFonts w:ascii="Cambria Math" w:hAnsi="Cambria Math"/>
             </w:rPr>
-            <m:t xml:space="preserve">0</m:t>
+            <m:t xml:space="preserve">?</m:t>
           </m:r>
           <m:r>
             <m:rPr>
@@ -21074,7 +20782,7 @@
             <w:rPr>
               <w:rFonts w:ascii="Cambria Math" w:hAnsi="Cambria Math"/>
             </w:rPr>
-            <m:t xml:space="preserve">9 800</m:t>
+            <m:t xml:space="preserve">?</m:t>
           </m:r>
           <m:r>
             <m:rPr>
@@ -21092,7 +20800,7 @@
             <w:rPr>
               <w:rFonts w:ascii="Cambria Math" w:hAnsi="Cambria Math"/>
             </w:rPr>
-            <m:t xml:space="preserve">1 700</m:t>
+            <m:t xml:space="preserve">?</m:t>
           </m:r>
           <m:r>
             <m:rPr>
@@ -21110,7 +20818,7 @@
             <w:rPr>
               <w:rFonts w:ascii="Cambria Math" w:hAnsi="Cambria Math"/>
             </w:rPr>
-            <m:t xml:space="preserve">2 100</m:t>
+            <m:t xml:space="preserve">?</m:t>
           </m:r>
           <m:r>
             <m:rPr>
@@ -21128,19 +20836,33 @@
             <w:rPr>
               <w:rFonts w:ascii="Cambria Math" w:hAnsi="Cambria Math"/>
             </w:rPr>
-            <m:t xml:space="preserve">(−20)</m:t>
-          </m:r>
-          <m:r>
-            <m:rPr>
-              <m:sty m:val="p"/>
-            </m:rPr>
-            <w:rPr>
-              <w:rFonts w:ascii="Cambria Math" w:hAnsi="Cambria Math"/>
-            </w:rPr>
-            <m:t xml:space="preserve"> = −13 669</m:t>
+            <m:t xml:space="preserve">?</m:t>
+          </m:r>
+          <m:r>
+            <m:rPr>
+              <m:sty m:val="p"/>
+            </m:rPr>
+            <w:rPr>
+              <w:rFonts w:ascii="Cambria Math" w:hAnsi="Cambria Math"/>
+            </w:rPr>
+            <m:t xml:space="preserve"> = —</m:t>
           </m:r>
         </m:oMath>
       </m:oMathPara>
+    </w:p>
+    <w:p>
+      <w:pPr>
+        <w:pStyle w:val="Note"/>
+      </w:pPr>
+      <w:r>
+        <w:rPr>
+          <w:i/>
+          <w:color w:val="6B7770"/>
+          <w:sz w:val="18"/>
+          <w:szCs w:val="18"/>
+        </w:rPr>
+        <w:t xml:space="preserve">Données manquantes pour 2023 : Subventions d'investissement, Charges générales d'exploitation, Dotations aux amortissements et dépréciations des immobilisations, Coût du risque (charge nette, + = charge), Gains ou pertes nets sur actifs immobilisés.</w:t>
+      </w:r>
     </w:p>
     <w:tbl>
       <w:tblPr>
@@ -21276,7 +20998,7 @@
                 <w:sz w:val="18"/>
                 <w:szCs w:val="18"/>
               </w:rPr>
-              <w:t xml:space="preserve">−9 097</w:t>
+              <w:t xml:space="preserve">—</w:t>
             </w:r>
           </w:p>
         </w:tc>
@@ -21294,7 +21016,7 @@
                 <w:sz w:val="18"/>
                 <w:szCs w:val="18"/>
               </w:rPr>
-              <w:t xml:space="preserve">−12 581</w:t>
+              <w:t xml:space="preserve">—</w:t>
             </w:r>
           </w:p>
         </w:tc>
@@ -21312,7 +21034,7 @@
                 <w:sz w:val="18"/>
                 <w:szCs w:val="18"/>
               </w:rPr>
-              <w:t xml:space="preserve">−13 669</w:t>
+              <w:t xml:space="preserve">—</w:t>
             </w:r>
           </w:p>
         </w:tc>
@@ -21354,7 +21076,7 @@
                 <w:sz w:val="18"/>
                 <w:szCs w:val="18"/>
               </w:rPr>
-              <w:t xml:space="preserve"/>
+              <w:t xml:space="preserve">Non calculé</w:t>
             </w:r>
           </w:p>
         </w:tc>
@@ -21373,7 +21095,7 @@
                 <w:sz w:val="18"/>
                 <w:szCs w:val="18"/>
               </w:rPr>
-              <w:t xml:space="preserve"/>
+              <w:t xml:space="preserve">Non calculé</w:t>
             </w:r>
           </w:p>
         </w:tc>
@@ -21392,7 +21114,7 @@
                 <w:sz w:val="18"/>
                 <w:szCs w:val="18"/>
               </w:rPr>
-              <w:t xml:space="preserve"/>
+              <w:t xml:space="preserve">Non calculé</w:t>
             </w:r>
           </w:p>
         </w:tc>
@@ -21402,85 +21124,6 @@
       <w:pPr>
         <w:spacing w:after="60"/>
       </w:pPr>
-    </w:p>
-    <w:p>
-      <w:pPr>
-        <w:keepNext/>
-        <w:spacing w:after="0"/>
-      </w:pPr>
-      <w:r>
-        <w:drawing>
-          <wp:inline distT="0" distB="0" distL="0" distR="0">
-            <wp:extent cx="5400000" cy="2227500"/>
-            <wp:docPr id="20" name="Graphique 20"/>
-            <wp:cNvGraphicFramePr>
-              <a:graphicFrameLocks xmlns:a="http://schemas.openxmlformats.org/drawingml/2006/main" noChangeAspect="1"/>
-            </wp:cNvGraphicFramePr>
-            <a:graphic xmlns:a="http://schemas.openxmlformats.org/drawingml/2006/main">
-              <a:graphicData uri="http://schemas.openxmlformats.org/drawingml/2006/picture">
-                <pic:pic xmlns:pic="http://schemas.openxmlformats.org/drawingml/2006/picture">
-                  <pic:nvPicPr>
-                    <pic:cNvPr id="20" name="graphique20.png"/>
-                    <pic:cNvPicPr/>
-                  </pic:nvPicPr>
-                  <pic:blipFill>
-                    <a:blip r:embed="rIdImg20"/>
-                    <a:stretch>
-                      <a:fillRect/>
-                    </a:stretch>
-                  </pic:blipFill>
-                  <pic:spPr>
-                    <a:xfrm>
-                      <a:off x="0" y="0"/>
-                      <a:ext cx="5400000" cy="2227500"/>
-                    </a:xfrm>
-                    <a:prstGeom prst="rect">
-                      <a:avLst/>
-                    </a:prstGeom>
-                  </pic:spPr>
-                </pic:pic>
-              </a:graphicData>
-            </a:graphic>
-          </wp:inline>
-        </w:drawing>
-      </w:r>
-    </w:p>
-    <w:p>
-      <w:pPr>
-        <w:spacing w:after="160"/>
-      </w:pPr>
-      <w:r>
-        <w:rPr>
-          <w:i/>
-          <w:color w:val="6B7770"/>
-          <w:sz w:val="17"/>
-          <w:szCs w:val="17"/>
-        </w:rPr>
-        <w:t xml:space="preserve">Figure 20 – PNB critique (PNB*) par exercice</w:t>
-      </w:r>
-    </w:p>
-    <w:p>
-      <w:r>
-        <w:t xml:space="preserve">Passe de </w:t>
-      </w:r>
-      <w:r>
-        <w:rPr>
-          <w:b/>
-        </w:rPr>
-        <w:t xml:space="preserve">−9 097</w:t>
-      </w:r>
-      <w:r>
-        <w:t xml:space="preserve"> en 2021 à </w:t>
-      </w:r>
-      <w:r>
-        <w:rPr>
-          <w:b/>
-        </w:rPr>
-        <w:t xml:space="preserve">−13 669</w:t>
-      </w:r>
-      <w:r>
-        <w:t xml:space="preserve"> en 2023 (−4 572 M), baisse continue sur la période. Même avec un PNB nul, les charges ne suffiraient pas à effacer les capitaux propres en un exercice : la banque encaisserait la disparition totale de ses revenus pendant un an.</w:t>
-      </w:r>
     </w:p>
     <w:p>
       <w:pPr>
@@ -21583,7 +21226,7 @@
                 <w:rPr>
                   <w:rFonts w:ascii="Cambria Math" w:hAnsi="Cambria Math"/>
                 </w:rPr>
-                <m:t xml:space="preserve">PNB*</m:t>
+                <m:t xml:space="preserve">PNB∗</m:t>
               </m:r>
             </m:num>
             <m:den>
@@ -21652,7 +21295,7 @@
                 <w:rPr>
                   <w:rFonts w:ascii="Cambria Math" w:hAnsi="Cambria Math"/>
                 </w:rPr>
-                <m:t xml:space="preserve">16 822</m:t>
+                <m:t xml:space="preserve">?</m:t>
               </m:r>
               <m:r>
                 <m:rPr>
@@ -21670,7 +21313,7 @@
                 <w:rPr>
                   <w:rFonts w:ascii="Cambria Math" w:hAnsi="Cambria Math"/>
                 </w:rPr>
-                <m:t xml:space="preserve">(−9 097)</m:t>
+                <m:t xml:space="preserve">?</m:t>
               </m:r>
             </m:num>
             <m:den>
@@ -21681,7 +21324,7 @@
                 <w:rPr>
                   <w:rFonts w:ascii="Cambria Math" w:hAnsi="Cambria Math"/>
                 </w:rPr>
-                <m:t xml:space="preserve">16 822</m:t>
+                <m:t xml:space="preserve">?</m:t>
               </m:r>
             </m:den>
           </m:f>
@@ -21692,7 +21335,7 @@
             <w:rPr>
               <w:rFonts w:ascii="Cambria Math" w:hAnsi="Cambria Math"/>
             </w:rPr>
-            <m:t xml:space="preserve"> = 154,08 %</m:t>
+            <m:t xml:space="preserve"> = —</m:t>
           </m:r>
         </m:oMath>
       </m:oMathPara>
@@ -21748,7 +21391,7 @@
                 <w:rPr>
                   <w:rFonts w:ascii="Cambria Math" w:hAnsi="Cambria Math"/>
                 </w:rPr>
-                <m:t xml:space="preserve">17 469</m:t>
+                <m:t xml:space="preserve">?</m:t>
               </m:r>
               <m:r>
                 <m:rPr>
@@ -21766,7 +21409,7 @@
                 <w:rPr>
                   <w:rFonts w:ascii="Cambria Math" w:hAnsi="Cambria Math"/>
                 </w:rPr>
-                <m:t xml:space="preserve">(−12 581)</m:t>
+                <m:t xml:space="preserve">?</m:t>
               </m:r>
             </m:num>
             <m:den>
@@ -21777,7 +21420,7 @@
                 <w:rPr>
                   <w:rFonts w:ascii="Cambria Math" w:hAnsi="Cambria Math"/>
                 </w:rPr>
-                <m:t xml:space="preserve">17 469</m:t>
+                <m:t xml:space="preserve">?</m:t>
               </m:r>
             </m:den>
           </m:f>
@@ -21788,7 +21431,7 @@
             <w:rPr>
               <w:rFonts w:ascii="Cambria Math" w:hAnsi="Cambria Math"/>
             </w:rPr>
-            <m:t xml:space="preserve"> = 172,02 %</m:t>
+            <m:t xml:space="preserve"> = —</m:t>
           </m:r>
         </m:oMath>
       </m:oMathPara>
@@ -21844,7 +21487,7 @@
                 <w:rPr>
                   <w:rFonts w:ascii="Cambria Math" w:hAnsi="Cambria Math"/>
                 </w:rPr>
-                <m:t xml:space="preserve">19 620</m:t>
+                <m:t xml:space="preserve">?</m:t>
               </m:r>
               <m:r>
                 <m:rPr>
@@ -21862,7 +21505,7 @@
                 <w:rPr>
                   <w:rFonts w:ascii="Cambria Math" w:hAnsi="Cambria Math"/>
                 </w:rPr>
-                <m:t xml:space="preserve">(−13 669)</m:t>
+                <m:t xml:space="preserve">?</m:t>
               </m:r>
             </m:num>
             <m:den>
@@ -21873,7 +21516,7 @@
                 <w:rPr>
                   <w:rFonts w:ascii="Cambria Math" w:hAnsi="Cambria Math"/>
                 </w:rPr>
-                <m:t xml:space="preserve">19 620</m:t>
+                <m:t xml:space="preserve">?</m:t>
               </m:r>
             </m:den>
           </m:f>
@@ -21884,10 +21527,24 @@
             <w:rPr>
               <w:rFonts w:ascii="Cambria Math" w:hAnsi="Cambria Math"/>
             </w:rPr>
-            <m:t xml:space="preserve"> = 169,67 %</m:t>
+            <m:t xml:space="preserve"> = —</m:t>
           </m:r>
         </m:oMath>
       </m:oMathPara>
+    </w:p>
+    <w:p>
+      <w:pPr>
+        <w:pStyle w:val="Note"/>
+      </w:pPr>
+      <w:r>
+        <w:rPr>
+          <w:i/>
+          <w:color w:val="6B7770"/>
+          <w:sz w:val="18"/>
+          <w:szCs w:val="18"/>
+        </w:rPr>
+        <w:t xml:space="preserve">Données manquantes pour 2023 : Intérêts et produits assimilés, Intérêts et charges assimilées, Revenus des titres à revenu variable, Commissions (charges), Gains ou pertes nets sur portefeuilles de négociation, Gains ou pertes nets sur portefeuilles de placement, Autres produits d'exploitation bancaire, Autres charges d'exploitation bancaire, Subventions d'investissement, Charges générales d'exploitation, Dotations aux amortissements et dépréciations des immobilisations, Coût du risque (charge nette, + = charge), Gains ou pertes nets sur actifs immobilisés.</w:t>
+      </w:r>
     </w:p>
     <w:tbl>
       <w:tblPr>
@@ -22023,7 +21680,7 @@
                 <w:sz w:val="18"/>
                 <w:szCs w:val="18"/>
               </w:rPr>
-              <w:t xml:space="preserve">154,08 %</w:t>
+              <w:t xml:space="preserve">—</w:t>
             </w:r>
           </w:p>
         </w:tc>
@@ -22041,7 +21698,7 @@
                 <w:sz w:val="18"/>
                 <w:szCs w:val="18"/>
               </w:rPr>
-              <w:t xml:space="preserve">172,02 %</w:t>
+              <w:t xml:space="preserve">—</w:t>
             </w:r>
           </w:p>
         </w:tc>
@@ -22059,7 +21716,7 @@
                 <w:sz w:val="18"/>
                 <w:szCs w:val="18"/>
               </w:rPr>
-              <w:t xml:space="preserve">169,67 %</w:t>
+              <w:t xml:space="preserve">—</w:t>
             </w:r>
           </w:p>
         </w:tc>
@@ -22101,7 +21758,7 @@
                 <w:sz w:val="18"/>
                 <w:szCs w:val="18"/>
               </w:rPr>
-              <w:t xml:space="preserve"/>
+              <w:t xml:space="preserve">Non calculé</w:t>
             </w:r>
           </w:p>
         </w:tc>
@@ -22120,7 +21777,7 @@
                 <w:sz w:val="18"/>
                 <w:szCs w:val="18"/>
               </w:rPr>
-              <w:t xml:space="preserve"/>
+              <w:t xml:space="preserve">Non calculé</w:t>
             </w:r>
           </w:p>
         </w:tc>
@@ -22139,7 +21796,7 @@
                 <w:sz w:val="18"/>
                 <w:szCs w:val="18"/>
               </w:rPr>
-              <w:t xml:space="preserve"/>
+              <w:t xml:space="preserve">Non calculé</w:t>
             </w:r>
           </w:p>
         </w:tc>
@@ -22149,85 +21806,6 @@
       <w:pPr>
         <w:spacing w:after="60"/>
       </w:pPr>
-    </w:p>
-    <w:p>
-      <w:pPr>
-        <w:keepNext/>
-        <w:spacing w:after="0"/>
-      </w:pPr>
-      <w:r>
-        <w:drawing>
-          <wp:inline distT="0" distB="0" distL="0" distR="0">
-            <wp:extent cx="5400000" cy="2227500"/>
-            <wp:docPr id="21" name="Graphique 21"/>
-            <wp:cNvGraphicFramePr>
-              <a:graphicFrameLocks xmlns:a="http://schemas.openxmlformats.org/drawingml/2006/main" noChangeAspect="1"/>
-            </wp:cNvGraphicFramePr>
-            <a:graphic xmlns:a="http://schemas.openxmlformats.org/drawingml/2006/main">
-              <a:graphicData uri="http://schemas.openxmlformats.org/drawingml/2006/picture">
-                <pic:pic xmlns:pic="http://schemas.openxmlformats.org/drawingml/2006/picture">
-                  <pic:nvPicPr>
-                    <pic:cNvPr id="21" name="graphique21.png"/>
-                    <pic:cNvPicPr/>
-                  </pic:nvPicPr>
-                  <pic:blipFill>
-                    <a:blip r:embed="rIdImg21"/>
-                    <a:stretch>
-                      <a:fillRect/>
-                    </a:stretch>
-                  </pic:blipFill>
-                  <pic:spPr>
-                    <a:xfrm>
-                      <a:off x="0" y="0"/>
-                      <a:ext cx="5400000" cy="2227500"/>
-                    </a:xfrm>
-                    <a:prstGeom prst="rect">
-                      <a:avLst/>
-                    </a:prstGeom>
-                  </pic:spPr>
-                </pic:pic>
-              </a:graphicData>
-            </a:graphic>
-          </wp:inline>
-        </w:drawing>
-      </w:r>
-    </w:p>
-    <w:p>
-      <w:pPr>
-        <w:spacing w:after="160"/>
-      </w:pPr>
-      <w:r>
-        <w:rPr>
-          <w:i/>
-          <w:color w:val="6B7770"/>
-          <w:sz w:val="17"/>
-          <w:szCs w:val="17"/>
-        </w:rPr>
-        <w:t xml:space="preserve">Figure 21 – Baisse de PNB menant à la faillite par exercice</w:t>
-      </w:r>
-    </w:p>
-    <w:p>
-      <w:r>
-        <w:t xml:space="preserve">Passe de </w:t>
-      </w:r>
-      <w:r>
-        <w:rPr>
-          <w:b/>
-        </w:rPr>
-        <w:t xml:space="preserve">154,08 %</w:t>
-      </w:r>
-      <w:r>
-        <w:t xml:space="preserve"> en 2021 à </w:t>
-      </w:r>
-      <w:r>
-        <w:rPr>
-          <w:b/>
-        </w:rPr>
-        <w:t xml:space="preserve">169,67 %</w:t>
-      </w:r>
-      <w:r>
-        <w:t xml:space="preserve"> en 2023 (+15,59 pt), avec une hausse en 2022 puis une baisse en 2023. Le PNB pourrait disparaître entièrement sans que la banque fasse faillite sur un exercice.</w:t>
-      </w:r>
     </w:p>
     <w:p>
       <w:pPr>
@@ -22348,6 +21926,27 @@
             </w:rPr>
             <m:t xml:space="preserve">Charges générales</m:t>
           </m:r>
+        </m:oMath>
+      </m:oMathPara>
+    </w:p>
+    <w:p>
+      <w:pPr>
+        <w:spacing w:after="80"/>
+      </w:pPr>
+      <m:oMathPara>
+        <m:oMathParaPr>
+          <m:jc m:val="left"/>
+        </m:oMathParaPr>
+        <m:oMath>
+          <m:r>
+            <m:rPr>
+              <m:sty m:val="p"/>
+            </m:rPr>
+            <w:rPr>
+              <w:rFonts w:ascii="Cambria Math" w:hAnsi="Cambria Math"/>
+            </w:rPr>
+            <m:t xml:space="preserve">      </m:t>
+          </m:r>
           <m:r>
             <m:rPr>
               <m:sty m:val="p"/>
@@ -22383,6 +21982,27 @@
               <w:rFonts w:ascii="Cambria Math" w:hAnsi="Cambria Math"/>
             </w:rPr>
             <m:t xml:space="preserve">Gains sur actifs immobilisés</m:t>
+          </m:r>
+        </m:oMath>
+      </m:oMathPara>
+    </w:p>
+    <w:p>
+      <w:pPr>
+        <w:spacing w:after="80"/>
+      </w:pPr>
+      <m:oMathPara>
+        <m:oMathParaPr>
+          <m:jc m:val="left"/>
+        </m:oMathParaPr>
+        <m:oMath>
+          <m:r>
+            <m:rPr>
+              <m:sty m:val="p"/>
+            </m:rPr>
+            <w:rPr>
+              <w:rFonts w:ascii="Cambria Math" w:hAnsi="Cambria Math"/>
+            </w:rPr>
+            <m:t xml:space="preserve">      </m:t>
           </m:r>
           <m:r>
             <m:rPr>
@@ -22454,7 +22074,7 @@
             <w:rPr>
               <w:rFonts w:ascii="Cambria Math" w:hAnsi="Cambria Math"/>
             </w:rPr>
-            <m:t xml:space="preserve">16 822</m:t>
+            <m:t xml:space="preserve">?</m:t>
           </m:r>
           <m:r>
             <m:rPr>
@@ -22472,7 +22092,7 @@
             <w:rPr>
               <w:rFonts w:ascii="Cambria Math" w:hAnsi="Cambria Math"/>
             </w:rPr>
-            <m:t xml:space="preserve">0</m:t>
+            <m:t xml:space="preserve">?</m:t>
           </m:r>
           <m:r>
             <m:rPr>
@@ -22490,7 +22110,7 @@
             <w:rPr>
               <w:rFonts w:ascii="Cambria Math" w:hAnsi="Cambria Math"/>
             </w:rPr>
-            <m:t xml:space="preserve">9 000</m:t>
+            <m:t xml:space="preserve">?</m:t>
           </m:r>
           <m:r>
             <m:rPr>
@@ -22508,7 +22128,7 @@
             <w:rPr>
               <w:rFonts w:ascii="Cambria Math" w:hAnsi="Cambria Math"/>
             </w:rPr>
-            <m:t xml:space="preserve">1 500</m:t>
+            <m:t xml:space="preserve">?</m:t>
           </m:r>
           <m:r>
             <m:rPr>
@@ -22526,7 +22146,7 @@
             <w:rPr>
               <w:rFonts w:ascii="Cambria Math" w:hAnsi="Cambria Math"/>
             </w:rPr>
-            <m:t xml:space="preserve">10</m:t>
+            <m:t xml:space="preserve">?</m:t>
           </m:r>
           <m:r>
             <m:rPr>
@@ -22553,7 +22173,7 @@
             <w:rPr>
               <w:rFonts w:ascii="Cambria Math" w:hAnsi="Cambria Math"/>
             </w:rPr>
-            <m:t xml:space="preserve"> = 27 119</m:t>
+            <m:t xml:space="preserve"> = —</m:t>
           </m:r>
         </m:oMath>
       </m:oMathPara>
@@ -22607,7 +22227,7 @@
             <w:rPr>
               <w:rFonts w:ascii="Cambria Math" w:hAnsi="Cambria Math"/>
             </w:rPr>
-            <m:t xml:space="preserve">17 469</m:t>
+            <m:t xml:space="preserve">?</m:t>
           </m:r>
           <m:r>
             <m:rPr>
@@ -22625,7 +22245,7 @@
             <w:rPr>
               <w:rFonts w:ascii="Cambria Math" w:hAnsi="Cambria Math"/>
             </w:rPr>
-            <m:t xml:space="preserve">0</m:t>
+            <m:t xml:space="preserve">?</m:t>
           </m:r>
           <m:r>
             <m:rPr>
@@ -22643,7 +22263,7 @@
             <w:rPr>
               <w:rFonts w:ascii="Cambria Math" w:hAnsi="Cambria Math"/>
             </w:rPr>
-            <m:t xml:space="preserve">9 300</m:t>
+            <m:t xml:space="preserve">?</m:t>
           </m:r>
           <m:r>
             <m:rPr>
@@ -22661,7 +22281,7 @@
             <w:rPr>
               <w:rFonts w:ascii="Cambria Math" w:hAnsi="Cambria Math"/>
             </w:rPr>
-            <m:t xml:space="preserve">1 600</m:t>
+            <m:t xml:space="preserve">?</m:t>
           </m:r>
           <m:r>
             <m:rPr>
@@ -22679,7 +22299,7 @@
             <w:rPr>
               <w:rFonts w:ascii="Cambria Math" w:hAnsi="Cambria Math"/>
             </w:rPr>
-            <m:t xml:space="preserve">0</m:t>
+            <m:t xml:space="preserve">?</m:t>
           </m:r>
           <m:r>
             <m:rPr>
@@ -22706,7 +22326,7 @@
             <w:rPr>
               <w:rFonts w:ascii="Cambria Math" w:hAnsi="Cambria Math"/>
             </w:rPr>
-            <m:t xml:space="preserve"> = 30 950</m:t>
+            <m:t xml:space="preserve"> = —</m:t>
           </m:r>
         </m:oMath>
       </m:oMathPara>
@@ -22760,7 +22380,7 @@
             <w:rPr>
               <w:rFonts w:ascii="Cambria Math" w:hAnsi="Cambria Math"/>
             </w:rPr>
-            <m:t xml:space="preserve">19 620</m:t>
+            <m:t xml:space="preserve">?</m:t>
           </m:r>
           <m:r>
             <m:rPr>
@@ -22778,7 +22398,7 @@
             <w:rPr>
               <w:rFonts w:ascii="Cambria Math" w:hAnsi="Cambria Math"/>
             </w:rPr>
-            <m:t xml:space="preserve">0</m:t>
+            <m:t xml:space="preserve">?</m:t>
           </m:r>
           <m:r>
             <m:rPr>
@@ -22796,7 +22416,7 @@
             <w:rPr>
               <w:rFonts w:ascii="Cambria Math" w:hAnsi="Cambria Math"/>
             </w:rPr>
-            <m:t xml:space="preserve">9 800</m:t>
+            <m:t xml:space="preserve">?</m:t>
           </m:r>
           <m:r>
             <m:rPr>
@@ -22814,7 +22434,7 @@
             <w:rPr>
               <w:rFonts w:ascii="Cambria Math" w:hAnsi="Cambria Math"/>
             </w:rPr>
-            <m:t xml:space="preserve">1 700</m:t>
+            <m:t xml:space="preserve">?</m:t>
           </m:r>
           <m:r>
             <m:rPr>
@@ -22832,7 +22452,7 @@
             <w:rPr>
               <w:rFonts w:ascii="Cambria Math" w:hAnsi="Cambria Math"/>
             </w:rPr>
-            <m:t xml:space="preserve">(−20)</m:t>
+            <m:t xml:space="preserve">?</m:t>
           </m:r>
           <m:r>
             <m:rPr>
@@ -22859,10 +22479,24 @@
             <w:rPr>
               <w:rFonts w:ascii="Cambria Math" w:hAnsi="Cambria Math"/>
             </w:rPr>
-            <m:t xml:space="preserve"> = 35 389</m:t>
+            <m:t xml:space="preserve"> = —</m:t>
           </m:r>
         </m:oMath>
       </m:oMathPara>
+    </w:p>
+    <w:p>
+      <w:pPr>
+        <w:pStyle w:val="Note"/>
+      </w:pPr>
+      <w:r>
+        <w:rPr>
+          <w:i/>
+          <w:color w:val="6B7770"/>
+          <w:sz w:val="18"/>
+          <w:szCs w:val="18"/>
+        </w:rPr>
+        <w:t xml:space="preserve">Données manquantes pour 2023 : Intérêts et produits assimilés, Intérêts et charges assimilées, Revenus des titres à revenu variable, Commissions (charges), Gains ou pertes nets sur portefeuilles de négociation, Gains ou pertes nets sur portefeuilles de placement, Autres produits d'exploitation bancaire, Autres charges d'exploitation bancaire, Subventions d'investissement, Charges générales d'exploitation, Dotations aux amortissements et dépréciations des immobilisations, Gains ou pertes nets sur actifs immobilisés.</w:t>
+      </w:r>
     </w:p>
     <w:tbl>
       <w:tblPr>
@@ -22998,7 +22632,7 @@
                 <w:sz w:val="18"/>
                 <w:szCs w:val="18"/>
               </w:rPr>
-              <w:t xml:space="preserve">27 119</w:t>
+              <w:t xml:space="preserve">—</w:t>
             </w:r>
           </w:p>
         </w:tc>
@@ -23016,7 +22650,7 @@
                 <w:sz w:val="18"/>
                 <w:szCs w:val="18"/>
               </w:rPr>
-              <w:t xml:space="preserve">30 950</w:t>
+              <w:t xml:space="preserve">—</w:t>
             </w:r>
           </w:p>
         </w:tc>
@@ -23034,7 +22668,7 @@
                 <w:sz w:val="18"/>
                 <w:szCs w:val="18"/>
               </w:rPr>
-              <w:t xml:space="preserve">35 389</w:t>
+              <w:t xml:space="preserve">—</w:t>
             </w:r>
           </w:p>
         </w:tc>
@@ -23076,7 +22710,7 @@
                 <w:sz w:val="18"/>
                 <w:szCs w:val="18"/>
               </w:rPr>
-              <w:t xml:space="preserve"/>
+              <w:t xml:space="preserve">Non calculé</w:t>
             </w:r>
           </w:p>
         </w:tc>
@@ -23095,7 +22729,7 @@
                 <w:sz w:val="18"/>
                 <w:szCs w:val="18"/>
               </w:rPr>
-              <w:t xml:space="preserve"/>
+              <w:t xml:space="preserve">Non calculé</w:t>
             </w:r>
           </w:p>
         </w:tc>
@@ -23114,7 +22748,7 @@
                 <w:sz w:val="18"/>
                 <w:szCs w:val="18"/>
               </w:rPr>
-              <w:t xml:space="preserve"/>
+              <w:t xml:space="preserve">Non calculé</w:t>
             </w:r>
           </w:p>
         </w:tc>
@@ -23124,85 +22758,6 @@
       <w:pPr>
         <w:spacing w:after="60"/>
       </w:pPr>
-    </w:p>
-    <w:p>
-      <w:pPr>
-        <w:keepNext/>
-        <w:spacing w:after="0"/>
-      </w:pPr>
-      <w:r>
-        <w:drawing>
-          <wp:inline distT="0" distB="0" distL="0" distR="0">
-            <wp:extent cx="5400000" cy="2227500"/>
-            <wp:docPr id="22" name="Graphique 22"/>
-            <wp:cNvGraphicFramePr>
-              <a:graphicFrameLocks xmlns:a="http://schemas.openxmlformats.org/drawingml/2006/main" noChangeAspect="1"/>
-            </wp:cNvGraphicFramePr>
-            <a:graphic xmlns:a="http://schemas.openxmlformats.org/drawingml/2006/main">
-              <a:graphicData uri="http://schemas.openxmlformats.org/drawingml/2006/picture">
-                <pic:pic xmlns:pic="http://schemas.openxmlformats.org/drawingml/2006/picture">
-                  <pic:nvPicPr>
-                    <pic:cNvPr id="22" name="graphique22.png"/>
-                    <pic:cNvPicPr/>
-                  </pic:nvPicPr>
-                  <pic:blipFill>
-                    <a:blip r:embed="rIdImg22"/>
-                    <a:stretch>
-                      <a:fillRect/>
-                    </a:stretch>
-                  </pic:blipFill>
-                  <pic:spPr>
-                    <a:xfrm>
-                      <a:off x="0" y="0"/>
-                      <a:ext cx="5400000" cy="2227500"/>
-                    </a:xfrm>
-                    <a:prstGeom prst="rect">
-                      <a:avLst/>
-                    </a:prstGeom>
-                  </pic:spPr>
-                </pic:pic>
-              </a:graphicData>
-            </a:graphic>
-          </wp:inline>
-        </w:drawing>
-      </w:r>
-    </w:p>
-    <w:p>
-      <w:pPr>
-        <w:spacing w:after="160"/>
-      </w:pPr>
-      <w:r>
-        <w:rPr>
-          <w:i/>
-          <w:color w:val="6B7770"/>
-          <w:sz w:val="17"/>
-          <w:szCs w:val="17"/>
-        </w:rPr>
-        <w:t xml:space="preserve">Figure 22 – Coût du risque critique par exercice</w:t>
-      </w:r>
-    </w:p>
-    <w:p>
-      <w:r>
-        <w:t xml:space="preserve">Passe de </w:t>
-      </w:r>
-      <w:r>
-        <w:rPr>
-          <w:b/>
-        </w:rPr>
-        <w:t xml:space="preserve">27 119</w:t>
-      </w:r>
-      <w:r>
-        <w:t xml:space="preserve"> en 2021 à </w:t>
-      </w:r>
-      <w:r>
-        <w:rPr>
-          <w:b/>
-        </w:rPr>
-        <w:t xml:space="preserve">35 389</w:t>
-      </w:r>
-      <w:r>
-        <w:t xml:space="preserve"> en 2023 (+8 270 M), hausse continue sur la période.</w:t>
-      </w:r>
     </w:p>
     <w:p>
       <w:pPr>
@@ -23773,7 +23328,7 @@
         <w:drawing>
           <wp:inline distT="0" distB="0" distL="0" distR="0">
             <wp:extent cx="5400000" cy="2227500"/>
-            <wp:docPr id="23" name="Graphique 23"/>
+            <wp:docPr id="14" name="Graphique 14"/>
             <wp:cNvGraphicFramePr>
               <a:graphicFrameLocks xmlns:a="http://schemas.openxmlformats.org/drawingml/2006/main" noChangeAspect="1"/>
             </wp:cNvGraphicFramePr>
@@ -23781,11 +23336,11 @@
               <a:graphicData uri="http://schemas.openxmlformats.org/drawingml/2006/picture">
                 <pic:pic xmlns:pic="http://schemas.openxmlformats.org/drawingml/2006/picture">
                   <pic:nvPicPr>
-                    <pic:cNvPr id="23" name="graphique23.png"/>
+                    <pic:cNvPr id="14" name="graphique14.png"/>
                     <pic:cNvPicPr/>
                   </pic:nvPicPr>
                   <pic:blipFill>
-                    <a:blip r:embed="rIdImg23"/>
+                    <a:blip r:embed="rIdImg14"/>
                     <a:stretch>
                       <a:fillRect/>
                     </a:stretch>
@@ -23817,7 +23372,7 @@
           <w:sz w:val="17"/>
           <w:szCs w:val="17"/>
         </w:rPr>
-        <w:t xml:space="preserve">Figure 23 – Perte d’actifs absorbable par exercice</w:t>
+        <w:t xml:space="preserve">Figure 14 – Perte d’actifs absorbable par exercice</w:t>
       </w:r>
     </w:p>
     <w:p>
@@ -24412,7 +23967,7 @@
         <w:drawing>
           <wp:inline distT="0" distB="0" distL="0" distR="0">
             <wp:extent cx="5400000" cy="2227500"/>
-            <wp:docPr id="24" name="Graphique 24"/>
+            <wp:docPr id="15" name="Graphique 15"/>
             <wp:cNvGraphicFramePr>
               <a:graphicFrameLocks xmlns:a="http://schemas.openxmlformats.org/drawingml/2006/main" noChangeAspect="1"/>
             </wp:cNvGraphicFramePr>
@@ -24420,11 +23975,11 @@
               <a:graphicData uri="http://schemas.openxmlformats.org/drawingml/2006/picture">
                 <pic:pic xmlns:pic="http://schemas.openxmlformats.org/drawingml/2006/picture">
                   <pic:nvPicPr>
-                    <pic:cNvPr id="24" name="graphique24.png"/>
+                    <pic:cNvPr id="15" name="graphique15.png"/>
                     <pic:cNvPicPr/>
                   </pic:nvPicPr>
                   <pic:blipFill>
-                    <a:blip r:embed="rIdImg24"/>
+                    <a:blip r:embed="rIdImg15"/>
                     <a:stretch>
                       <a:fillRect/>
                     </a:stretch>
@@ -24456,7 +24011,7 @@
           <w:sz w:val="17"/>
           <w:szCs w:val="17"/>
         </w:rPr>
-        <w:t xml:space="preserve">Figure 24 – Défauts de crédits absorbables par exercice</w:t>
+        <w:t xml:space="preserve">Figure 15 – Défauts de crédits absorbables par exercice</w:t>
       </w:r>
     </w:p>
     <w:p>
@@ -24733,7 +24288,7 @@
                 <w:rPr>
                   <w:rFonts w:ascii="Cambria Math" w:hAnsi="Cambria Math"/>
                 </w:rPr>
-                <m:t xml:space="preserve">232 664</m:t>
+                <m:t xml:space="preserve">201 123</m:t>
               </m:r>
             </m:num>
             <m:den>
@@ -24782,7 +24337,7 @@
             <w:rPr>
               <w:rFonts w:ascii="Cambria Math" w:hAnsi="Cambria Math"/>
             </w:rPr>
-            <m:t xml:space="preserve"> = −4 959</m:t>
+            <m:t xml:space="preserve"> = −860</m:t>
           </m:r>
         </m:oMath>
       </m:oMathPara>
@@ -24874,7 +24429,7 @@
                 <w:rPr>
                   <w:rFonts w:ascii="Cambria Math" w:hAnsi="Cambria Math"/>
                 </w:rPr>
-                <m:t xml:space="preserve">226 068</m:t>
+                <m:t xml:space="preserve">193 920</m:t>
               </m:r>
             </m:num>
             <m:den>
@@ -24923,7 +24478,7 @@
             <w:rPr>
               <w:rFonts w:ascii="Cambria Math" w:hAnsi="Cambria Math"/>
             </w:rPr>
-            <m:t xml:space="preserve"> = −105</m:t>
+            <m:t xml:space="preserve"> = 4 073</m:t>
           </m:r>
         </m:oMath>
       </m:oMathPara>
@@ -25015,7 +24570,7 @@
                 <w:rPr>
                   <w:rFonts w:ascii="Cambria Math" w:hAnsi="Cambria Math"/>
                 </w:rPr>
-                <m:t xml:space="preserve">237 172</m:t>
+                <m:t xml:space="preserve">203 478</m:t>
               </m:r>
             </m:num>
             <m:den>
@@ -25064,7 +24619,7 @@
             <w:rPr>
               <w:rFonts w:ascii="Cambria Math" w:hAnsi="Cambria Math"/>
             </w:rPr>
-            <m:t xml:space="preserve"> = 1 737</m:t>
+            <m:t xml:space="preserve"> = 6 115</m:t>
           </m:r>
         </m:oMath>
       </m:oMathPara>
@@ -25203,7 +24758,7 @@
                 <w:sz w:val="18"/>
                 <w:szCs w:val="18"/>
               </w:rPr>
-              <w:t xml:space="preserve">−4 959</w:t>
+              <w:t xml:space="preserve">−860</w:t>
             </w:r>
           </w:p>
         </w:tc>
@@ -25221,7 +24776,7 @@
                 <w:sz w:val="18"/>
                 <w:szCs w:val="18"/>
               </w:rPr>
-              <w:t xml:space="preserve">−105</w:t>
+              <w:t xml:space="preserve">4 073</w:t>
             </w:r>
           </w:p>
         </w:tc>
@@ -25239,7 +24794,7 @@
                 <w:sz w:val="18"/>
                 <w:szCs w:val="18"/>
               </w:rPr>
-              <w:t xml:space="preserve">1 737</w:t>
+              <w:t xml:space="preserve">6 115</w:t>
             </w:r>
           </w:p>
         </w:tc>
@@ -25339,7 +24894,7 @@
         <w:drawing>
           <wp:inline distT="0" distB="0" distL="0" distR="0">
             <wp:extent cx="5400000" cy="2227500"/>
-            <wp:docPr id="25" name="Graphique 25"/>
+            <wp:docPr id="16" name="Graphique 16"/>
             <wp:cNvGraphicFramePr>
               <a:graphicFrameLocks xmlns:a="http://schemas.openxmlformats.org/drawingml/2006/main" noChangeAspect="1"/>
             </wp:cNvGraphicFramePr>
@@ -25347,11 +24902,11 @@
               <a:graphicData uri="http://schemas.openxmlformats.org/drawingml/2006/picture">
                 <pic:pic xmlns:pic="http://schemas.openxmlformats.org/drawingml/2006/picture">
                   <pic:nvPicPr>
-                    <pic:cNvPr id="25" name="graphique25.png"/>
+                    <pic:cNvPr id="16" name="graphique16.png"/>
                     <pic:cNvPicPr/>
                   </pic:nvPicPr>
                   <pic:blipFill>
-                    <a:blip r:embed="rIdImg25"/>
+                    <a:blip r:embed="rIdImg16"/>
                     <a:stretch>
                       <a:fillRect/>
                     </a:stretch>
@@ -25383,7 +24938,7 @@
           <w:sz w:val="17"/>
           <w:szCs w:val="17"/>
         </w:rPr>
-        <w:t xml:space="preserve">Figure 25 – Perte avant passage sous le seuil de solvabilité par exercice</w:t>
+        <w:t xml:space="preserve">Figure 16 – Perte avant passage sous le seuil de solvabilité par exercice</w:t>
       </w:r>
     </w:p>
     <w:p>
@@ -25394,7 +24949,7 @@
         <w:rPr>
           <w:b/>
         </w:rPr>
-        <w:t xml:space="preserve">−4 959</w:t>
+        <w:t xml:space="preserve">−860</w:t>
       </w:r>
       <w:r>
         <w:t xml:space="preserve"> en 2021 à </w:t>
@@ -25403,10 +24958,10 @@
         <w:rPr>
           <w:b/>
         </w:rPr>
-        <w:t xml:space="preserve">1 737</w:t>
-      </w:r>
-      <w:r>
-        <w:t xml:space="preserve"> en 2023 (+6 696 M), hausse continue sur la période. Au-delà de 1 737 M de pertes, la banque passe sous le minimum de solvabilité UMOA.</w:t>
+        <w:t xml:space="preserve">6 115</w:t>
+      </w:r>
+      <w:r>
+        <w:t xml:space="preserve"> en 2023 (+6 975 M), hausse continue sur la période. Au-delà de 6 115 M de pertes, la banque passe sous le minimum de solvabilité UMOA.</w:t>
       </w:r>
     </w:p>
     <w:p>
@@ -26543,7 +26098,7 @@
                 <w:sz w:val="18"/>
                 <w:szCs w:val="18"/>
               </w:rPr>
-              <w:t xml:space="preserve">31 541</w:t>
+              <w:t xml:space="preserve">—</w:t>
             </w:r>
           </w:p>
         </w:tc>
@@ -26561,7 +26116,7 @@
                 <w:sz w:val="18"/>
                 <w:szCs w:val="18"/>
               </w:rPr>
-              <w:t xml:space="preserve">32 148</w:t>
+              <w:t xml:space="preserve">—</w:t>
             </w:r>
           </w:p>
         </w:tc>
@@ -26579,7 +26134,7 @@
                 <w:sz w:val="18"/>
                 <w:szCs w:val="18"/>
               </w:rPr>
-              <w:t xml:space="preserve">33 694</w:t>
+              <w:t xml:space="preserve">—</w:t>
             </w:r>
           </w:p>
         </w:tc>
@@ -26624,7 +26179,7 @@
                 <w:sz w:val="18"/>
                 <w:szCs w:val="18"/>
               </w:rPr>
-              <w:t xml:space="preserve">232 664</w:t>
+              <w:t xml:space="preserve">201 123</w:t>
             </w:r>
           </w:p>
         </w:tc>
@@ -26644,7 +26199,7 @@
                 <w:sz w:val="18"/>
                 <w:szCs w:val="18"/>
               </w:rPr>
-              <w:t xml:space="preserve">226 068</w:t>
+              <w:t xml:space="preserve">193 920</w:t>
             </w:r>
           </w:p>
         </w:tc>
@@ -26664,7 +26219,7 @@
                 <w:sz w:val="18"/>
                 <w:szCs w:val="18"/>
               </w:rPr>
-              <w:t xml:space="preserve">237 172</w:t>
+              <w:t xml:space="preserve">203 478</w:t>
             </w:r>
           </w:p>
         </w:tc>
@@ -26705,7 +26260,7 @@
                 <w:sz w:val="18"/>
                 <w:szCs w:val="18"/>
               </w:rPr>
-              <w:t xml:space="preserve">77,1 %</w:t>
+              <w:t xml:space="preserve">66,6 %</w:t>
             </w:r>
           </w:p>
         </w:tc>
@@ -26723,7 +26278,7 @@
                 <w:sz w:val="18"/>
                 <w:szCs w:val="18"/>
               </w:rPr>
-              <w:t xml:space="preserve">84,0 %</w:t>
+              <w:t xml:space="preserve">72,1 %</w:t>
             </w:r>
           </w:p>
         </w:tc>
@@ -26741,7 +26296,7 @@
                 <w:sz w:val="18"/>
                 <w:szCs w:val="18"/>
               </w:rPr>
-              <w:t xml:space="preserve">80,2 %</w:t>
+              <w:t xml:space="preserve">68,8 %</w:t>
             </w:r>
           </w:p>
         </w:tc>
@@ -26897,7 +26452,7 @@
                 <w:rPr>
                   <w:rFonts w:ascii="Cambria Math" w:hAnsi="Cambria Math"/>
                 </w:rPr>
-                <m:t xml:space="preserve">232 664</m:t>
+                <m:t xml:space="preserve">201 123</m:t>
               </m:r>
             </m:den>
           </m:f>
@@ -26908,7 +26463,7 @@
             <w:rPr>
               <w:rFonts w:ascii="Cambria Math" w:hAnsi="Cambria Math"/>
             </w:rPr>
-            <m:t xml:space="preserve"> = 9,61 %</m:t>
+            <m:t xml:space="preserve"> = 11,12 %</m:t>
           </m:r>
         </m:oMath>
       </m:oMathPara>
@@ -26966,7 +26521,7 @@
                 <w:rPr>
                   <w:rFonts w:ascii="Cambria Math" w:hAnsi="Cambria Math"/>
                 </w:rPr>
-                <m:t xml:space="preserve">226 068</m:t>
+                <m:t xml:space="preserve">193 920</m:t>
               </m:r>
             </m:den>
           </m:f>
@@ -26977,7 +26532,7 @@
             <w:rPr>
               <w:rFonts w:ascii="Cambria Math" w:hAnsi="Cambria Math"/>
             </w:rPr>
-            <m:t xml:space="preserve"> = 11,46 %</m:t>
+            <m:t xml:space="preserve"> = 13,36 %</m:t>
           </m:r>
         </m:oMath>
       </m:oMathPara>
@@ -27035,7 +26590,7 @@
                 <w:rPr>
                   <w:rFonts w:ascii="Cambria Math" w:hAnsi="Cambria Math"/>
                 </w:rPr>
-                <m:t xml:space="preserve">237 172</m:t>
+                <m:t xml:space="preserve">203 478</m:t>
               </m:r>
             </m:den>
           </m:f>
@@ -27046,7 +26601,7 @@
             <w:rPr>
               <w:rFonts w:ascii="Cambria Math" w:hAnsi="Cambria Math"/>
             </w:rPr>
-            <m:t xml:space="preserve"> = 12,15 %</m:t>
+            <m:t xml:space="preserve"> = 14,16 %</m:t>
           </m:r>
         </m:oMath>
       </m:oMathPara>
@@ -27185,7 +26740,7 @@
                 <w:sz w:val="18"/>
                 <w:szCs w:val="18"/>
               </w:rPr>
-              <w:t xml:space="preserve">9,61 %</w:t>
+              <w:t xml:space="preserve">11,12 %</w:t>
             </w:r>
           </w:p>
         </w:tc>
@@ -27203,7 +26758,7 @@
                 <w:sz w:val="18"/>
                 <w:szCs w:val="18"/>
               </w:rPr>
-              <w:t xml:space="preserve">11,46 %</w:t>
+              <w:t xml:space="preserve">13,36 %</w:t>
             </w:r>
           </w:p>
         </w:tc>
@@ -27221,7 +26776,7 @@
                 <w:sz w:val="18"/>
                 <w:szCs w:val="18"/>
               </w:rPr>
-              <w:t xml:space="preserve">12,15 %</w:t>
+              <w:t xml:space="preserve">14,16 %</w:t>
             </w:r>
           </w:p>
         </w:tc>
@@ -27278,11 +26833,11 @@
             </w:pPr>
             <w:r>
               <w:rPr>
-                <w:color w:val="B3302A"/>
-                <w:sz w:val="18"/>
-                <w:szCs w:val="18"/>
-              </w:rPr>
-              <w:t xml:space="preserve">✕ Non conforme</w:t>
+                <w:color w:val="1A7642"/>
+                <w:sz w:val="18"/>
+                <w:szCs w:val="18"/>
+              </w:rPr>
+              <w:t xml:space="preserve">✓ Conforme</w:t>
             </w:r>
           </w:p>
         </w:tc>
@@ -27297,11 +26852,11 @@
             </w:pPr>
             <w:r>
               <w:rPr>
-                <w:color w:val="8F5500"/>
-                <w:sz w:val="18"/>
-                <w:szCs w:val="18"/>
-              </w:rPr>
-              <w:t xml:space="preserve">! Marge faible</w:t>
+                <w:color w:val="1A7642"/>
+                <w:sz w:val="18"/>
+                <w:szCs w:val="18"/>
+              </w:rPr>
+              <w:t xml:space="preserve">✓ Conforme</w:t>
             </w:r>
           </w:p>
         </w:tc>
@@ -27321,7 +26876,7 @@
         <w:drawing>
           <wp:inline distT="0" distB="0" distL="0" distR="0">
             <wp:extent cx="5400000" cy="2227500"/>
-            <wp:docPr id="26" name="Graphique 26"/>
+            <wp:docPr id="17" name="Graphique 17"/>
             <wp:cNvGraphicFramePr>
               <a:graphicFrameLocks xmlns:a="http://schemas.openxmlformats.org/drawingml/2006/main" noChangeAspect="1"/>
             </wp:cNvGraphicFramePr>
@@ -27329,11 +26884,11 @@
               <a:graphicData uri="http://schemas.openxmlformats.org/drawingml/2006/picture">
                 <pic:pic xmlns:pic="http://schemas.openxmlformats.org/drawingml/2006/picture">
                   <pic:nvPicPr>
-                    <pic:cNvPr id="26" name="graphique26.png"/>
+                    <pic:cNvPr id="17" name="graphique17.png"/>
                     <pic:cNvPicPr/>
                   </pic:nvPicPr>
                   <pic:blipFill>
-                    <a:blip r:embed="rIdImg26"/>
+                    <a:blip r:embed="rIdImg17"/>
                     <a:stretch>
                       <a:fillRect/>
                     </a:stretch>
@@ -27365,7 +26920,7 @@
           <w:sz w:val="17"/>
           <w:szCs w:val="17"/>
         </w:rPr>
-        <w:t xml:space="preserve">Figure 26 – Ratio de solvabilité global par exercice</w:t>
+        <w:t xml:space="preserve">Figure 17 – Ratio de solvabilité global par exercice</w:t>
       </w:r>
     </w:p>
     <w:p>
@@ -27376,7 +26931,7 @@
         <w:rPr>
           <w:b/>
         </w:rPr>
-        <w:t xml:space="preserve">9,61 %</w:t>
+        <w:t xml:space="preserve">11,12 %</w:t>
       </w:r>
       <w:r>
         <w:t xml:space="preserve"> en 2021 à </w:t>
@@ -27385,10 +26940,10 @@
         <w:rPr>
           <w:b/>
         </w:rPr>
-        <w:t xml:space="preserve">12,15 %</w:t>
-      </w:r>
-      <w:r>
-        <w:t xml:space="preserve"> en 2023 (+2,53 pt), hausse continue sur la période. La solvabilité réglementaire s’améliore. Au-dessus de le minimum réglementaire de 11,5 % mais avec une marge faible (+0,65 pt).</w:t>
+        <w:t xml:space="preserve">14,16 %</w:t>
+      </w:r>
+      <w:r>
+        <w:t xml:space="preserve"> en 2023 (+3,04 pt), hausse continue sur la période. La solvabilité réglementaire s’améliore. Confortablement au-dessus de le minimum réglementaire de 11,5 % (marge +2,66 pt).</w:t>
       </w:r>
     </w:p>
     <w:p>
@@ -27536,7 +27091,7 @@
                 <w:rPr>
                   <w:rFonts w:ascii="Cambria Math" w:hAnsi="Cambria Math"/>
                 </w:rPr>
-                <m:t xml:space="preserve">232 664</m:t>
+                <m:t xml:space="preserve">201 123</m:t>
               </m:r>
             </m:den>
           </m:f>
@@ -27547,7 +27102,7 @@
             <w:rPr>
               <w:rFonts w:ascii="Cambria Math" w:hAnsi="Cambria Math"/>
             </w:rPr>
-            <m:t xml:space="preserve"> = 8,93 %</m:t>
+            <m:t xml:space="preserve"> = 10,33 %</m:t>
           </m:r>
         </m:oMath>
       </m:oMathPara>
@@ -27605,7 +27160,7 @@
                 <w:rPr>
                   <w:rFonts w:ascii="Cambria Math" w:hAnsi="Cambria Math"/>
                 </w:rPr>
-                <m:t xml:space="preserve">226 068</m:t>
+                <m:t xml:space="preserve">193 920</m:t>
               </m:r>
             </m:den>
           </m:f>
@@ -27616,7 +27171,7 @@
             <w:rPr>
               <w:rFonts w:ascii="Cambria Math" w:hAnsi="Cambria Math"/>
             </w:rPr>
-            <m:t xml:space="preserve"> = 10,76 %</m:t>
+            <m:t xml:space="preserve"> = 12,54 %</m:t>
           </m:r>
         </m:oMath>
       </m:oMathPara>
@@ -27674,7 +27229,7 @@
                 <w:rPr>
                   <w:rFonts w:ascii="Cambria Math" w:hAnsi="Cambria Math"/>
                 </w:rPr>
-                <m:t xml:space="preserve">237 172</m:t>
+                <m:t xml:space="preserve">203 478</m:t>
               </m:r>
             </m:den>
           </m:f>
@@ -27685,7 +27240,7 @@
             <w:rPr>
               <w:rFonts w:ascii="Cambria Math" w:hAnsi="Cambria Math"/>
             </w:rPr>
-            <m:t xml:space="preserve"> = 11,48 %</m:t>
+            <m:t xml:space="preserve"> = 13,38 %</m:t>
           </m:r>
         </m:oMath>
       </m:oMathPara>
@@ -27824,7 +27379,7 @@
                 <w:sz w:val="18"/>
                 <w:szCs w:val="18"/>
               </w:rPr>
-              <w:t xml:space="preserve">8,93 %</w:t>
+              <w:t xml:space="preserve">10,33 %</w:t>
             </w:r>
           </w:p>
         </w:tc>
@@ -27842,7 +27397,7 @@
                 <w:sz w:val="18"/>
                 <w:szCs w:val="18"/>
               </w:rPr>
-              <w:t xml:space="preserve">10,76 %</w:t>
+              <w:t xml:space="preserve">12,54 %</w:t>
             </w:r>
           </w:p>
         </w:tc>
@@ -27860,7 +27415,7 @@
                 <w:sz w:val="18"/>
                 <w:szCs w:val="18"/>
               </w:rPr>
-              <w:t xml:space="preserve">11,48 %</w:t>
+              <w:t xml:space="preserve">13,38 %</w:t>
             </w:r>
           </w:p>
         </w:tc>
@@ -27960,7 +27515,7 @@
         <w:drawing>
           <wp:inline distT="0" distB="0" distL="0" distR="0">
             <wp:extent cx="5400000" cy="2227500"/>
-            <wp:docPr id="27" name="Graphique 27"/>
+            <wp:docPr id="18" name="Graphique 18"/>
             <wp:cNvGraphicFramePr>
               <a:graphicFrameLocks xmlns:a="http://schemas.openxmlformats.org/drawingml/2006/main" noChangeAspect="1"/>
             </wp:cNvGraphicFramePr>
@@ -27968,11 +27523,11 @@
               <a:graphicData uri="http://schemas.openxmlformats.org/drawingml/2006/picture">
                 <pic:pic xmlns:pic="http://schemas.openxmlformats.org/drawingml/2006/picture">
                   <pic:nvPicPr>
-                    <pic:cNvPr id="27" name="graphique27.png"/>
+                    <pic:cNvPr id="18" name="graphique18.png"/>
                     <pic:cNvPicPr/>
                   </pic:nvPicPr>
                   <pic:blipFill>
-                    <a:blip r:embed="rIdImg27"/>
+                    <a:blip r:embed="rIdImg18"/>
                     <a:stretch>
                       <a:fillRect/>
                     </a:stretch>
@@ -28004,7 +27559,7 @@
           <w:sz w:val="17"/>
           <w:szCs w:val="17"/>
         </w:rPr>
-        <w:t xml:space="preserve">Figure 27 – Ratio CET1 par exercice</w:t>
+        <w:t xml:space="preserve">Figure 18 – Ratio CET1 par exercice</w:t>
       </w:r>
     </w:p>
     <w:p>
@@ -28015,7 +27570,7 @@
         <w:rPr>
           <w:b/>
         </w:rPr>
-        <w:t xml:space="preserve">8,93 %</w:t>
+        <w:t xml:space="preserve">10,33 %</w:t>
       </w:r>
       <w:r>
         <w:t xml:space="preserve"> en 2021 à </w:t>
@@ -28024,10 +27579,10 @@
         <w:rPr>
           <w:b/>
         </w:rPr>
-        <w:t xml:space="preserve">11,48 %</w:t>
-      </w:r>
-      <w:r>
-        <w:t xml:space="preserve"> en 2023 (+2,55 pt), hausse continue sur la période. Le noyau dur de solvabilité se renforce. Confortablement au-dessus de le minimum réglementaire de 7,5 % (marge +3,98 pt).</w:t>
+        <w:t xml:space="preserve">13,38 %</w:t>
+      </w:r>
+      <w:r>
+        <w:t xml:space="preserve"> en 2023 (+3,05 pt), hausse continue sur la période. Le noyau dur de solvabilité se renforce. Confortablement au-dessus de le minimum réglementaire de 7,5 % (marge +5,88 pt).</w:t>
       </w:r>
     </w:p>
     <w:p>
@@ -28599,7 +28154,7 @@
         <w:drawing>
           <wp:inline distT="0" distB="0" distL="0" distR="0">
             <wp:extent cx="5400000" cy="2227500"/>
-            <wp:docPr id="28" name="Graphique 28"/>
+            <wp:docPr id="19" name="Graphique 19"/>
             <wp:cNvGraphicFramePr>
               <a:graphicFrameLocks xmlns:a="http://schemas.openxmlformats.org/drawingml/2006/main" noChangeAspect="1"/>
             </wp:cNvGraphicFramePr>
@@ -28607,11 +28162,11 @@
               <a:graphicData uri="http://schemas.openxmlformats.org/drawingml/2006/picture">
                 <pic:pic xmlns:pic="http://schemas.openxmlformats.org/drawingml/2006/picture">
                   <pic:nvPicPr>
-                    <pic:cNvPr id="28" name="graphique28.png"/>
+                    <pic:cNvPr id="19" name="graphique19.png"/>
                     <pic:cNvPicPr/>
                   </pic:nvPicPr>
                   <pic:blipFill>
-                    <a:blip r:embed="rIdImg28"/>
+                    <a:blip r:embed="rIdImg19"/>
                     <a:stretch>
                       <a:fillRect/>
                     </a:stretch>
@@ -28643,7 +28198,7 @@
           <w:sz w:val="17"/>
           <w:szCs w:val="17"/>
         </w:rPr>
-        <w:t xml:space="preserve">Figure 28 – Ratio de levier Bâle III par exercice</w:t>
+        <w:t xml:space="preserve">Figure 19 – Ratio de levier Bâle III par exercice</w:t>
       </w:r>
     </w:p>
     <w:p>
@@ -29722,7 +29277,7 @@
     </w:p>
     <w:p>
       <w:r>
-        <w:t xml:space="preserve">Toutes les données utilisées par les indicateurs sont renseignées.</w:t>
+        <w:t xml:space="preserve">Les postes suivants ne sont pas saisis pour au moins un exercice ; les indicateurs qui en dépendent sont marqués « Non calculé » : Charges générales d'exploitation, Dotations aux amortissements et dépréciations des immobilisations, Intérêts et produits assimilés, Intérêts et charges assimilées, Revenus des titres à revenu variable, Commissions (charges), Gains ou pertes nets sur portefeuilles de négociation, Gains ou pertes nets sur portefeuilles de placement, Autres produits d'exploitation bancaire, Autres charges d'exploitation bancaire, Coût du risque (charge nette, + = charge), Subventions d'investissement, Gains ou pertes nets sur actifs immobilisés.</w:t>
       </w:r>
     </w:p>
     <w:sectPr>

</xml_diff>

<commit_message>
Graphiques clairs dans le rapport Word et 14 graphiques R
- Rapport Word : graphiques refaits pour l'impression (titre, axe gradué,
  valeurs sur les barres, seuil en légende, exercices hors seuil en rouge,
  légende des structures), plus trois graphiques (bilan, PNB/RBE/RN,
  test de faillite), images en haute définition
- Script R : 14 graphiques en R de base (structures, montants, ratios avec
  seuils, ROE/ROA, faillite), affichés puis enregistrés en PNG et en PDF,
  document Word des graphiques si officer est installé
- Script R entièrement ASCII : corrige les accents illisibles (« rC)sultat »)
  à l'ouverture sous Windows
- Correctifs : graduation qui ne couvrait pas la plus grande valeur, script R
  avec un seul exercice ; 17 nouveaux tests (667)

Co-Authored-By: Claude Opus 5.5 <noreply@anthropic.com>
Claude-Session: https://claude.ai/code/session_01SWrbG3FCmCSmsWcz6vtx2N
</commit_message>
<xml_diff>
--- a/donnees/Exemple_rapport_BAB.docx
+++ b/donnees/Exemple_rapport_BAB.docx
@@ -26,7 +26,7 @@
           <w:sz w:val="18"/>
           <w:szCs w:val="18"/>
         </w:rPr>
-        <w:t xml:space="preserve">Document généré le 9 octobre 2026 avec Analyste Bancaire UMOA (référentiel PCB révisé, dispositif prudentiel BCEAO).</w:t>
+        <w:t xml:space="preserve">Document généré le 10 octobre 2026 avec Analyste Bancaire UMOA (référentiel PCB révisé, dispositif prudentiel BCEAO).</w:t>
       </w:r>
     </w:p>
     <w:p>
@@ -3183,7 +3183,7 @@
       <w:r>
         <w:drawing>
           <wp:inline distT="0" distB="0" distL="0" distR="0">
-            <wp:extent cx="5400000" cy="1873125"/>
+            <wp:extent cx="5400000" cy="2311875"/>
             <wp:docPr id="1" name="Graphique 1"/>
             <wp:cNvGraphicFramePr>
               <a:graphicFrameLocks xmlns:a="http://schemas.openxmlformats.org/drawingml/2006/main" noChangeAspect="1"/>
@@ -3204,7 +3204,7 @@
                   <pic:spPr>
                     <a:xfrm>
                       <a:off x="0" y="0"/>
-                      <a:ext cx="5400000" cy="1873125"/>
+                      <a:ext cx="5400000" cy="2311875"/>
                     </a:xfrm>
                     <a:prstGeom prst="rect">
                       <a:avLst/>
@@ -3228,7 +3228,7 @@
           <w:sz w:val="17"/>
           <w:szCs w:val="17"/>
         </w:rPr>
-        <w:t xml:space="preserve">Figure 1 – Structure du actif par exercice (Trésorerie &amp; interbancaire, Titres, Crédits clientèle, Immobilisations &amp; participations, Autres)</w:t>
+        <w:t xml:space="preserve">Figure 1 – Structure du actif par exercice</w:t>
       </w:r>
     </w:p>
     <w:p>
@@ -5421,7 +5421,7 @@
       <w:r>
         <w:drawing>
           <wp:inline distT="0" distB="0" distL="0" distR="0">
-            <wp:extent cx="5400000" cy="1873125"/>
+            <wp:extent cx="5400000" cy="2311875"/>
             <wp:docPr id="2" name="Graphique 2"/>
             <wp:cNvGraphicFramePr>
               <a:graphicFrameLocks xmlns:a="http://schemas.openxmlformats.org/drawingml/2006/main" noChangeAspect="1"/>
@@ -5442,7 +5442,7 @@
                   <pic:spPr>
                     <a:xfrm>
                       <a:off x="0" y="0"/>
-                      <a:ext cx="5400000" cy="1873125"/>
+                      <a:ext cx="5400000" cy="2311875"/>
                     </a:xfrm>
                     <a:prstGeom prst="rect">
                       <a:avLst/>
@@ -5466,7 +5466,63 @@
           <w:sz w:val="17"/>
           <w:szCs w:val="17"/>
         </w:rPr>
-        <w:t xml:space="preserve">Figure 2 – Structure du passif par exercice (Interbancaire &amp; BCEAO, Dépôts clientèle, Autres dettes &amp; provisions, Subordonnés, Capitaux propres)</w:t>
+        <w:t xml:space="preserve">Figure 2 – Structure du passif par exercice</w:t>
+      </w:r>
+    </w:p>
+    <w:p>
+      <w:pPr>
+        <w:keepNext/>
+        <w:spacing w:after="0"/>
+      </w:pPr>
+      <w:r>
+        <w:drawing>
+          <wp:inline distT="0" distB="0" distL="0" distR="0">
+            <wp:extent cx="5400000" cy="2784375"/>
+            <wp:docPr id="3" name="Graphique 3"/>
+            <wp:cNvGraphicFramePr>
+              <a:graphicFrameLocks xmlns:a="http://schemas.openxmlformats.org/drawingml/2006/main" noChangeAspect="1"/>
+            </wp:cNvGraphicFramePr>
+            <a:graphic xmlns:a="http://schemas.openxmlformats.org/drawingml/2006/main">
+              <a:graphicData uri="http://schemas.openxmlformats.org/drawingml/2006/picture">
+                <pic:pic xmlns:pic="http://schemas.openxmlformats.org/drawingml/2006/picture">
+                  <pic:nvPicPr>
+                    <pic:cNvPr id="3" name="graphique3.png"/>
+                    <pic:cNvPicPr/>
+                  </pic:nvPicPr>
+                  <pic:blipFill>
+                    <a:blip r:embed="rIdImg3"/>
+                    <a:stretch>
+                      <a:fillRect/>
+                    </a:stretch>
+                  </pic:blipFill>
+                  <pic:spPr>
+                    <a:xfrm>
+                      <a:off x="0" y="0"/>
+                      <a:ext cx="5400000" cy="2784375"/>
+                    </a:xfrm>
+                    <a:prstGeom prst="rect">
+                      <a:avLst/>
+                    </a:prstGeom>
+                  </pic:spPr>
+                </pic:pic>
+              </a:graphicData>
+            </a:graphic>
+          </wp:inline>
+        </w:drawing>
+      </w:r>
+    </w:p>
+    <w:p>
+      <w:pPr>
+        <w:spacing w:after="160"/>
+      </w:pPr>
+      <w:r>
+        <w:rPr>
+          <w:i/>
+          <w:color w:val="6B7770"/>
+          <w:sz w:val="17"/>
+          <w:szCs w:val="17"/>
+        </w:rPr>
+        <w:t xml:space="preserve">Figure 3 – Total du bilan, crédits et dépôts</w:t>
       </w:r>
     </w:p>
     <w:p>
@@ -8089,6 +8145,62 @@
       </w:r>
       <w:r>
         <w:t xml:space="preserve"> : +681 M (+13,9 %)</w:t>
+      </w:r>
+    </w:p>
+    <w:p>
+      <w:pPr>
+        <w:keepNext/>
+        <w:spacing w:after="0"/>
+      </w:pPr>
+      <w:r>
+        <w:drawing>
+          <wp:inline distT="0" distB="0" distL="0" distR="0">
+            <wp:extent cx="5400000" cy="2784375"/>
+            <wp:docPr id="4" name="Graphique 4"/>
+            <wp:cNvGraphicFramePr>
+              <a:graphicFrameLocks xmlns:a="http://schemas.openxmlformats.org/drawingml/2006/main" noChangeAspect="1"/>
+            </wp:cNvGraphicFramePr>
+            <a:graphic xmlns:a="http://schemas.openxmlformats.org/drawingml/2006/main">
+              <a:graphicData uri="http://schemas.openxmlformats.org/drawingml/2006/picture">
+                <pic:pic xmlns:pic="http://schemas.openxmlformats.org/drawingml/2006/picture">
+                  <pic:nvPicPr>
+                    <pic:cNvPr id="4" name="graphique4.png"/>
+                    <pic:cNvPicPr/>
+                  </pic:nvPicPr>
+                  <pic:blipFill>
+                    <a:blip r:embed="rIdImg4"/>
+                    <a:stretch>
+                      <a:fillRect/>
+                    </a:stretch>
+                  </pic:blipFill>
+                  <pic:spPr>
+                    <a:xfrm>
+                      <a:off x="0" y="0"/>
+                      <a:ext cx="5400000" cy="2784375"/>
+                    </a:xfrm>
+                    <a:prstGeom prst="rect">
+                      <a:avLst/>
+                    </a:prstGeom>
+                  </pic:spPr>
+                </pic:pic>
+              </a:graphicData>
+            </a:graphic>
+          </wp:inline>
+        </w:drawing>
+      </w:r>
+    </w:p>
+    <w:p>
+      <w:pPr>
+        <w:spacing w:after="160"/>
+      </w:pPr>
+      <w:r>
+        <w:rPr>
+          <w:i/>
+          <w:color w:val="6B7770"/>
+          <w:sz w:val="17"/>
+          <w:szCs w:val="17"/>
+        </w:rPr>
+        <w:t xml:space="preserve">Figure 4 – PNB, RBE et résultat net</w:t>
       </w:r>
     </w:p>
     <w:p>
@@ -8678,8 +8790,8 @@
       <w:r>
         <w:drawing>
           <wp:inline distT="0" distB="0" distL="0" distR="0">
-            <wp:extent cx="5400000" cy="2227500"/>
-            <wp:docPr id="3" name="Graphique 3"/>
+            <wp:extent cx="5400000" cy="2784375"/>
+            <wp:docPr id="5" name="Graphique 5"/>
             <wp:cNvGraphicFramePr>
               <a:graphicFrameLocks xmlns:a="http://schemas.openxmlformats.org/drawingml/2006/main" noChangeAspect="1"/>
             </wp:cNvGraphicFramePr>
@@ -8687,11 +8799,11 @@
               <a:graphicData uri="http://schemas.openxmlformats.org/drawingml/2006/picture">
                 <pic:pic xmlns:pic="http://schemas.openxmlformats.org/drawingml/2006/picture">
                   <pic:nvPicPr>
-                    <pic:cNvPr id="3" name="graphique3.png"/>
+                    <pic:cNvPr id="5" name="graphique5.png"/>
                     <pic:cNvPicPr/>
                   </pic:nvPicPr>
                   <pic:blipFill>
-                    <a:blip r:embed="rIdImg3"/>
+                    <a:blip r:embed="rIdImg5"/>
                     <a:stretch>
                       <a:fillRect/>
                     </a:stretch>
@@ -8699,7 +8811,7 @@
                   <pic:spPr>
                     <a:xfrm>
                       <a:off x="0" y="0"/>
-                      <a:ext cx="5400000" cy="2227500"/>
+                      <a:ext cx="5400000" cy="2784375"/>
                     </a:xfrm>
                     <a:prstGeom prst="rect">
                       <a:avLst/>
@@ -8723,7 +8835,7 @@
           <w:sz w:val="17"/>
           <w:szCs w:val="17"/>
         </w:rPr>
-        <w:t xml:space="preserve">Figure 3 – Ratio de transformation par exercice</w:t>
+        <w:t xml:space="preserve">Figure 5 – Ratio de transformation par exercice</w:t>
       </w:r>
     </w:p>
     <w:p>
@@ -9363,8 +9475,8 @@
       <w:r>
         <w:drawing>
           <wp:inline distT="0" distB="0" distL="0" distR="0">
-            <wp:extent cx="5400000" cy="2227500"/>
-            <wp:docPr id="4" name="Graphique 4"/>
+            <wp:extent cx="5400000" cy="2784375"/>
+            <wp:docPr id="6" name="Graphique 6"/>
             <wp:cNvGraphicFramePr>
               <a:graphicFrameLocks xmlns:a="http://schemas.openxmlformats.org/drawingml/2006/main" noChangeAspect="1"/>
             </wp:cNvGraphicFramePr>
@@ -9372,11 +9484,11 @@
               <a:graphicData uri="http://schemas.openxmlformats.org/drawingml/2006/picture">
                 <pic:pic xmlns:pic="http://schemas.openxmlformats.org/drawingml/2006/picture">
                   <pic:nvPicPr>
-                    <pic:cNvPr id="4" name="graphique4.png"/>
+                    <pic:cNvPr id="6" name="graphique6.png"/>
                     <pic:cNvPicPr/>
                   </pic:nvPicPr>
                   <pic:blipFill>
-                    <a:blip r:embed="rIdImg4"/>
+                    <a:blip r:embed="rIdImg6"/>
                     <a:stretch>
                       <a:fillRect/>
                     </a:stretch>
@@ -9384,7 +9496,7 @@
                   <pic:spPr>
                     <a:xfrm>
                       <a:off x="0" y="0"/>
-                      <a:ext cx="5400000" cy="2227500"/>
+                      <a:ext cx="5400000" cy="2784375"/>
                     </a:xfrm>
                     <a:prstGeom prst="rect">
                       <a:avLst/>
@@ -9408,7 +9520,7 @@
           <w:sz w:val="17"/>
           <w:szCs w:val="17"/>
         </w:rPr>
-        <w:t xml:space="preserve">Figure 4 – Ratio de liquidité (bilan) par exercice</w:t>
+        <w:t xml:space="preserve">Figure 6 – Ratio de liquidité (bilan) par exercice</w:t>
       </w:r>
     </w:p>
     <w:p>
@@ -10085,8 +10197,8 @@
       <w:r>
         <w:drawing>
           <wp:inline distT="0" distB="0" distL="0" distR="0">
-            <wp:extent cx="5400000" cy="2227500"/>
-            <wp:docPr id="5" name="Graphique 5"/>
+            <wp:extent cx="5400000" cy="2784375"/>
+            <wp:docPr id="7" name="Graphique 7"/>
             <wp:cNvGraphicFramePr>
               <a:graphicFrameLocks xmlns:a="http://schemas.openxmlformats.org/drawingml/2006/main" noChangeAspect="1"/>
             </wp:cNvGraphicFramePr>
@@ -10094,11 +10206,11 @@
               <a:graphicData uri="http://schemas.openxmlformats.org/drawingml/2006/picture">
                 <pic:pic xmlns:pic="http://schemas.openxmlformats.org/drawingml/2006/picture">
                   <pic:nvPicPr>
-                    <pic:cNvPr id="5" name="graphique5.png"/>
+                    <pic:cNvPr id="7" name="graphique7.png"/>
                     <pic:cNvPicPr/>
                   </pic:nvPicPr>
                   <pic:blipFill>
-                    <a:blip r:embed="rIdImg5"/>
+                    <a:blip r:embed="rIdImg7"/>
                     <a:stretch>
                       <a:fillRect/>
                     </a:stretch>
@@ -10106,7 +10218,7 @@
                   <pic:spPr>
                     <a:xfrm>
                       <a:off x="0" y="0"/>
-                      <a:ext cx="5400000" cy="2227500"/>
+                      <a:ext cx="5400000" cy="2784375"/>
                     </a:xfrm>
                     <a:prstGeom prst="rect">
                       <a:avLst/>
@@ -10130,7 +10242,7 @@
           <w:sz w:val="17"/>
           <w:szCs w:val="17"/>
         </w:rPr>
-        <w:t xml:space="preserve">Figure 5 – Ratio de levier (bilan) par exercice</w:t>
+        <w:t xml:space="preserve">Figure 7 – Ratio de levier (bilan) par exercice</w:t>
       </w:r>
     </w:p>
     <w:p>
@@ -10724,8 +10836,8 @@
       <w:r>
         <w:drawing>
           <wp:inline distT="0" distB="0" distL="0" distR="0">
-            <wp:extent cx="5400000" cy="2227500"/>
-            <wp:docPr id="6" name="Graphique 6"/>
+            <wp:extent cx="5400000" cy="2784375"/>
+            <wp:docPr id="8" name="Graphique 8"/>
             <wp:cNvGraphicFramePr>
               <a:graphicFrameLocks xmlns:a="http://schemas.openxmlformats.org/drawingml/2006/main" noChangeAspect="1"/>
             </wp:cNvGraphicFramePr>
@@ -10733,11 +10845,11 @@
               <a:graphicData uri="http://schemas.openxmlformats.org/drawingml/2006/picture">
                 <pic:pic xmlns:pic="http://schemas.openxmlformats.org/drawingml/2006/picture">
                   <pic:nvPicPr>
-                    <pic:cNvPr id="6" name="graphique6.png"/>
+                    <pic:cNvPr id="8" name="graphique8.png"/>
                     <pic:cNvPicPr/>
                   </pic:nvPicPr>
                   <pic:blipFill>
-                    <a:blip r:embed="rIdImg6"/>
+                    <a:blip r:embed="rIdImg8"/>
                     <a:stretch>
                       <a:fillRect/>
                     </a:stretch>
@@ -10745,7 +10857,7 @@
                   <pic:spPr>
                     <a:xfrm>
                       <a:off x="0" y="0"/>
-                      <a:ext cx="5400000" cy="2227500"/>
+                      <a:ext cx="5400000" cy="2784375"/>
                     </a:xfrm>
                     <a:prstGeom prst="rect">
                       <a:avLst/>
@@ -10769,7 +10881,7 @@
           <w:sz w:val="17"/>
           <w:szCs w:val="17"/>
         </w:rPr>
-        <w:t xml:space="preserve">Figure 6 – Ratio de levier Bâle III par exercice</w:t>
+        <w:t xml:space="preserve">Figure 8 – Ratio de levier Bâle III par exercice</w:t>
       </w:r>
     </w:p>
     <w:p>
@@ -11363,8 +11475,8 @@
       <w:r>
         <w:drawing>
           <wp:inline distT="0" distB="0" distL="0" distR="0">
-            <wp:extent cx="5400000" cy="2227500"/>
-            <wp:docPr id="7" name="Graphique 7"/>
+            <wp:extent cx="5400000" cy="2784375"/>
+            <wp:docPr id="9" name="Graphique 9"/>
             <wp:cNvGraphicFramePr>
               <a:graphicFrameLocks xmlns:a="http://schemas.openxmlformats.org/drawingml/2006/main" noChangeAspect="1"/>
             </wp:cNvGraphicFramePr>
@@ -11372,11 +11484,11 @@
               <a:graphicData uri="http://schemas.openxmlformats.org/drawingml/2006/picture">
                 <pic:pic xmlns:pic="http://schemas.openxmlformats.org/drawingml/2006/picture">
                   <pic:nvPicPr>
-                    <pic:cNvPr id="7" name="graphique7.png"/>
+                    <pic:cNvPr id="9" name="graphique9.png"/>
                     <pic:cNvPicPr/>
                   </pic:nvPicPr>
                   <pic:blipFill>
-                    <a:blip r:embed="rIdImg7"/>
+                    <a:blip r:embed="rIdImg9"/>
                     <a:stretch>
                       <a:fillRect/>
                     </a:stretch>
@@ -11384,7 +11496,7 @@
                   <pic:spPr>
                     <a:xfrm>
                       <a:off x="0" y="0"/>
-                      <a:ext cx="5400000" cy="2227500"/>
+                      <a:ext cx="5400000" cy="2784375"/>
                     </a:xfrm>
                     <a:prstGeom prst="rect">
                       <a:avLst/>
@@ -11408,7 +11520,7 @@
           <w:sz w:val="17"/>
           <w:szCs w:val="17"/>
         </w:rPr>
-        <w:t xml:space="preserve">Figure 7 – Multiplicateur de fonds propres par exercice</w:t>
+        <w:t xml:space="preserve">Figure 9 – Multiplicateur de fonds propres par exercice</w:t>
       </w:r>
     </w:p>
     <w:p>
@@ -12011,8 +12123,8 @@
       <w:r>
         <w:drawing>
           <wp:inline distT="0" distB="0" distL="0" distR="0">
-            <wp:extent cx="5400000" cy="2227500"/>
-            <wp:docPr id="8" name="Graphique 8"/>
+            <wp:extent cx="5400000" cy="2784375"/>
+            <wp:docPr id="10" name="Graphique 10"/>
             <wp:cNvGraphicFramePr>
               <a:graphicFrameLocks xmlns:a="http://schemas.openxmlformats.org/drawingml/2006/main" noChangeAspect="1"/>
             </wp:cNvGraphicFramePr>
@@ -12020,11 +12132,11 @@
               <a:graphicData uri="http://schemas.openxmlformats.org/drawingml/2006/picture">
                 <pic:pic xmlns:pic="http://schemas.openxmlformats.org/drawingml/2006/picture">
                   <pic:nvPicPr>
-                    <pic:cNvPr id="8" name="graphique8.png"/>
+                    <pic:cNvPr id="10" name="graphique10.png"/>
                     <pic:cNvPicPr/>
                   </pic:nvPicPr>
                   <pic:blipFill>
-                    <a:blip r:embed="rIdImg8"/>
+                    <a:blip r:embed="rIdImg10"/>
                     <a:stretch>
                       <a:fillRect/>
                     </a:stretch>
@@ -12032,7 +12144,7 @@
                   <pic:spPr>
                     <a:xfrm>
                       <a:off x="0" y="0"/>
-                      <a:ext cx="5400000" cy="2227500"/>
+                      <a:ext cx="5400000" cy="2784375"/>
                     </a:xfrm>
                     <a:prstGeom prst="rect">
                       <a:avLst/>
@@ -12056,7 +12168,7 @@
           <w:sz w:val="17"/>
           <w:szCs w:val="17"/>
         </w:rPr>
-        <w:t xml:space="preserve">Figure 8 – Solvabilité (bilan) par exercice</w:t>
+        <w:t xml:space="preserve">Figure 10 – Solvabilité (bilan) par exercice</w:t>
       </w:r>
     </w:p>
     <w:p>
@@ -12650,8 +12762,8 @@
       <w:r>
         <w:drawing>
           <wp:inline distT="0" distB="0" distL="0" distR="0">
-            <wp:extent cx="5400000" cy="2227500"/>
-            <wp:docPr id="9" name="Graphique 9"/>
+            <wp:extent cx="5400000" cy="2784375"/>
+            <wp:docPr id="11" name="Graphique 11"/>
             <wp:cNvGraphicFramePr>
               <a:graphicFrameLocks xmlns:a="http://schemas.openxmlformats.org/drawingml/2006/main" noChangeAspect="1"/>
             </wp:cNvGraphicFramePr>
@@ -12659,11 +12771,11 @@
               <a:graphicData uri="http://schemas.openxmlformats.org/drawingml/2006/picture">
                 <pic:pic xmlns:pic="http://schemas.openxmlformats.org/drawingml/2006/picture">
                   <pic:nvPicPr>
-                    <pic:cNvPr id="9" name="graphique9.png"/>
+                    <pic:cNvPr id="11" name="graphique11.png"/>
                     <pic:cNvPicPr/>
                   </pic:nvPicPr>
                   <pic:blipFill>
-                    <a:blip r:embed="rIdImg9"/>
+                    <a:blip r:embed="rIdImg11"/>
                     <a:stretch>
                       <a:fillRect/>
                     </a:stretch>
@@ -12671,7 +12783,7 @@
                   <pic:spPr>
                     <a:xfrm>
                       <a:off x="0" y="0"/>
-                      <a:ext cx="5400000" cy="2227500"/>
+                      <a:ext cx="5400000" cy="2784375"/>
                     </a:xfrm>
                     <a:prstGeom prst="rect">
                       <a:avLst/>
@@ -12695,7 +12807,7 @@
           <w:sz w:val="17"/>
           <w:szCs w:val="17"/>
         </w:rPr>
-        <w:t xml:space="preserve">Figure 9 – Ratio de solvabilité global par exercice</w:t>
+        <w:t xml:space="preserve">Figure 11 – Ratio de solvabilité global par exercice</w:t>
       </w:r>
     </w:p>
     <w:p>
@@ -13289,8 +13401,8 @@
       <w:r>
         <w:drawing>
           <wp:inline distT="0" distB="0" distL="0" distR="0">
-            <wp:extent cx="5400000" cy="2227500"/>
-            <wp:docPr id="10" name="Graphique 10"/>
+            <wp:extent cx="5400000" cy="2784375"/>
+            <wp:docPr id="12" name="Graphique 12"/>
             <wp:cNvGraphicFramePr>
               <a:graphicFrameLocks xmlns:a="http://schemas.openxmlformats.org/drawingml/2006/main" noChangeAspect="1"/>
             </wp:cNvGraphicFramePr>
@@ -13298,11 +13410,11 @@
               <a:graphicData uri="http://schemas.openxmlformats.org/drawingml/2006/picture">
                 <pic:pic xmlns:pic="http://schemas.openxmlformats.org/drawingml/2006/picture">
                   <pic:nvPicPr>
-                    <pic:cNvPr id="10" name="graphique10.png"/>
+                    <pic:cNvPr id="12" name="graphique12.png"/>
                     <pic:cNvPicPr/>
                   </pic:nvPicPr>
                   <pic:blipFill>
-                    <a:blip r:embed="rIdImg10"/>
+                    <a:blip r:embed="rIdImg12"/>
                     <a:stretch>
                       <a:fillRect/>
                     </a:stretch>
@@ -13310,7 +13422,7 @@
                   <pic:spPr>
                     <a:xfrm>
                       <a:off x="0" y="0"/>
-                      <a:ext cx="5400000" cy="2227500"/>
+                      <a:ext cx="5400000" cy="2784375"/>
                     </a:xfrm>
                     <a:prstGeom prst="rect">
                       <a:avLst/>
@@ -13334,7 +13446,7 @@
           <w:sz w:val="17"/>
           <w:szCs w:val="17"/>
         </w:rPr>
-        <w:t xml:space="preserve">Figure 10 – Ratio CET1 par exercice</w:t>
+        <w:t xml:space="preserve">Figure 12 – Ratio CET1 par exercice</w:t>
       </w:r>
     </w:p>
     <w:p>
@@ -13928,8 +14040,8 @@
       <w:r>
         <w:drawing>
           <wp:inline distT="0" distB="0" distL="0" distR="0">
-            <wp:extent cx="5400000" cy="2227500"/>
-            <wp:docPr id="11" name="Graphique 11"/>
+            <wp:extent cx="5400000" cy="2784375"/>
+            <wp:docPr id="13" name="Graphique 13"/>
             <wp:cNvGraphicFramePr>
               <a:graphicFrameLocks xmlns:a="http://schemas.openxmlformats.org/drawingml/2006/main" noChangeAspect="1"/>
             </wp:cNvGraphicFramePr>
@@ -13937,11 +14049,11 @@
               <a:graphicData uri="http://schemas.openxmlformats.org/drawingml/2006/picture">
                 <pic:pic xmlns:pic="http://schemas.openxmlformats.org/drawingml/2006/picture">
                   <pic:nvPicPr>
-                    <pic:cNvPr id="11" name="graphique11.png"/>
+                    <pic:cNvPr id="13" name="graphique13.png"/>
                     <pic:cNvPicPr/>
                   </pic:nvPicPr>
                   <pic:blipFill>
-                    <a:blip r:embed="rIdImg11"/>
+                    <a:blip r:embed="rIdImg13"/>
                     <a:stretch>
                       <a:fillRect/>
                     </a:stretch>
@@ -13949,7 +14061,7 @@
                   <pic:spPr>
                     <a:xfrm>
                       <a:off x="0" y="0"/>
-                      <a:ext cx="5400000" cy="2227500"/>
+                      <a:ext cx="5400000" cy="2784375"/>
                     </a:xfrm>
                     <a:prstGeom prst="rect">
                       <a:avLst/>
@@ -13973,7 +14085,7 @@
           <w:sz w:val="17"/>
           <w:szCs w:val="17"/>
         </w:rPr>
-        <w:t xml:space="preserve">Figure 11 – Ratio Tier 1 par exercice</w:t>
+        <w:t xml:space="preserve">Figure 13 – Ratio Tier 1 par exercice</w:t>
       </w:r>
     </w:p>
     <w:p>
@@ -14591,8 +14703,8 @@
       <w:r>
         <w:drawing>
           <wp:inline distT="0" distB="0" distL="0" distR="0">
-            <wp:extent cx="5400000" cy="2227500"/>
-            <wp:docPr id="12" name="Graphique 12"/>
+            <wp:extent cx="5400000" cy="2784375"/>
+            <wp:docPr id="14" name="Graphique 14"/>
             <wp:cNvGraphicFramePr>
               <a:graphicFrameLocks xmlns:a="http://schemas.openxmlformats.org/drawingml/2006/main" noChangeAspect="1"/>
             </wp:cNvGraphicFramePr>
@@ -14600,11 +14712,11 @@
               <a:graphicData uri="http://schemas.openxmlformats.org/drawingml/2006/picture">
                 <pic:pic xmlns:pic="http://schemas.openxmlformats.org/drawingml/2006/picture">
                   <pic:nvPicPr>
-                    <pic:cNvPr id="12" name="graphique12.png"/>
+                    <pic:cNvPr id="14" name="graphique14.png"/>
                     <pic:cNvPicPr/>
                   </pic:nvPicPr>
                   <pic:blipFill>
-                    <a:blip r:embed="rIdImg12"/>
+                    <a:blip r:embed="rIdImg14"/>
                     <a:stretch>
                       <a:fillRect/>
                     </a:stretch>
@@ -14612,7 +14724,7 @@
                   <pic:spPr>
                     <a:xfrm>
                       <a:off x="0" y="0"/>
-                      <a:ext cx="5400000" cy="2227500"/>
+                      <a:ext cx="5400000" cy="2784375"/>
                     </a:xfrm>
                     <a:prstGeom prst="rect">
                       <a:avLst/>
@@ -14636,7 +14748,7 @@
           <w:sz w:val="17"/>
           <w:szCs w:val="17"/>
         </w:rPr>
-        <w:t xml:space="preserve">Figure 12 – ROA par exercice</w:t>
+        <w:t xml:space="preserve">Figure 14 – ROA par exercice</w:t>
       </w:r>
     </w:p>
     <w:p>
@@ -15239,8 +15351,8 @@
       <w:r>
         <w:drawing>
           <wp:inline distT="0" distB="0" distL="0" distR="0">
-            <wp:extent cx="5400000" cy="2227500"/>
-            <wp:docPr id="13" name="Graphique 13"/>
+            <wp:extent cx="5400000" cy="2784375"/>
+            <wp:docPr id="15" name="Graphique 15"/>
             <wp:cNvGraphicFramePr>
               <a:graphicFrameLocks xmlns:a="http://schemas.openxmlformats.org/drawingml/2006/main" noChangeAspect="1"/>
             </wp:cNvGraphicFramePr>
@@ -15248,11 +15360,11 @@
               <a:graphicData uri="http://schemas.openxmlformats.org/drawingml/2006/picture">
                 <pic:pic xmlns:pic="http://schemas.openxmlformats.org/drawingml/2006/picture">
                   <pic:nvPicPr>
-                    <pic:cNvPr id="13" name="graphique13.png"/>
+                    <pic:cNvPr id="15" name="graphique15.png"/>
                     <pic:cNvPicPr/>
                   </pic:nvPicPr>
                   <pic:blipFill>
-                    <a:blip r:embed="rIdImg13"/>
+                    <a:blip r:embed="rIdImg15"/>
                     <a:stretch>
                       <a:fillRect/>
                     </a:stretch>
@@ -15260,7 +15372,7 @@
                   <pic:spPr>
                     <a:xfrm>
                       <a:off x="0" y="0"/>
-                      <a:ext cx="5400000" cy="2227500"/>
+                      <a:ext cx="5400000" cy="2784375"/>
                     </a:xfrm>
                     <a:prstGeom prst="rect">
                       <a:avLst/>
@@ -15284,7 +15396,7 @@
           <w:sz w:val="17"/>
           <w:szCs w:val="17"/>
         </w:rPr>
-        <w:t xml:space="preserve">Figure 13 – ROE par exercice</w:t>
+        <w:t xml:space="preserve">Figure 15 – ROE par exercice</w:t>
       </w:r>
     </w:p>
     <w:p>
@@ -19582,6 +19694,62 @@
           </m:r>
         </m:oMath>
       </m:oMathPara>
+    </w:p>
+    <w:p>
+      <w:pPr>
+        <w:keepNext/>
+        <w:spacing w:after="0"/>
+      </w:pPr>
+      <w:r>
+        <w:drawing>
+          <wp:inline distT="0" distB="0" distL="0" distR="0">
+            <wp:extent cx="5400000" cy="2784375"/>
+            <wp:docPr id="16" name="Graphique 16"/>
+            <wp:cNvGraphicFramePr>
+              <a:graphicFrameLocks xmlns:a="http://schemas.openxmlformats.org/drawingml/2006/main" noChangeAspect="1"/>
+            </wp:cNvGraphicFramePr>
+            <a:graphic xmlns:a="http://schemas.openxmlformats.org/drawingml/2006/main">
+              <a:graphicData uri="http://schemas.openxmlformats.org/drawingml/2006/picture">
+                <pic:pic xmlns:pic="http://schemas.openxmlformats.org/drawingml/2006/picture">
+                  <pic:nvPicPr>
+                    <pic:cNvPr id="16" name="graphique16.png"/>
+                    <pic:cNvPicPr/>
+                  </pic:nvPicPr>
+                  <pic:blipFill>
+                    <a:blip r:embed="rIdImg16"/>
+                    <a:stretch>
+                      <a:fillRect/>
+                    </a:stretch>
+                  </pic:blipFill>
+                  <pic:spPr>
+                    <a:xfrm>
+                      <a:off x="0" y="0"/>
+                      <a:ext cx="5400000" cy="2784375"/>
+                    </a:xfrm>
+                    <a:prstGeom prst="rect">
+                      <a:avLst/>
+                    </a:prstGeom>
+                  </pic:spPr>
+                </pic:pic>
+              </a:graphicData>
+            </a:graphic>
+          </wp:inline>
+        </w:drawing>
+      </w:r>
+    </w:p>
+    <w:p>
+      <w:pPr>
+        <w:spacing w:after="160"/>
+      </w:pPr>
+      <w:r>
+        <w:rPr>
+          <w:i/>
+          <w:color w:val="6B7770"/>
+          <w:sz w:val="17"/>
+          <w:szCs w:val="17"/>
+        </w:rPr>
+        <w:t xml:space="preserve">Figure 16 – PNB réel et PNB critique</w:t>
+      </w:r>
     </w:p>
     <w:tbl>
       <w:tblPr>
@@ -23327,8 +23495,8 @@
       <w:r>
         <w:drawing>
           <wp:inline distT="0" distB="0" distL="0" distR="0">
-            <wp:extent cx="5400000" cy="2227500"/>
-            <wp:docPr id="14" name="Graphique 14"/>
+            <wp:extent cx="5400000" cy="2784375"/>
+            <wp:docPr id="17" name="Graphique 17"/>
             <wp:cNvGraphicFramePr>
               <a:graphicFrameLocks xmlns:a="http://schemas.openxmlformats.org/drawingml/2006/main" noChangeAspect="1"/>
             </wp:cNvGraphicFramePr>
@@ -23336,11 +23504,11 @@
               <a:graphicData uri="http://schemas.openxmlformats.org/drawingml/2006/picture">
                 <pic:pic xmlns:pic="http://schemas.openxmlformats.org/drawingml/2006/picture">
                   <pic:nvPicPr>
-                    <pic:cNvPr id="14" name="graphique14.png"/>
+                    <pic:cNvPr id="17" name="graphique17.png"/>
                     <pic:cNvPicPr/>
                   </pic:nvPicPr>
                   <pic:blipFill>
-                    <a:blip r:embed="rIdImg14"/>
+                    <a:blip r:embed="rIdImg17"/>
                     <a:stretch>
                       <a:fillRect/>
                     </a:stretch>
@@ -23348,7 +23516,7 @@
                   <pic:spPr>
                     <a:xfrm>
                       <a:off x="0" y="0"/>
-                      <a:ext cx="5400000" cy="2227500"/>
+                      <a:ext cx="5400000" cy="2784375"/>
                     </a:xfrm>
                     <a:prstGeom prst="rect">
                       <a:avLst/>
@@ -23372,7 +23540,7 @@
           <w:sz w:val="17"/>
           <w:szCs w:val="17"/>
         </w:rPr>
-        <w:t xml:space="preserve">Figure 14 – Perte d’actifs absorbable par exercice</w:t>
+        <w:t xml:space="preserve">Figure 17 – Perte d’actifs absorbable par exercice</w:t>
       </w:r>
     </w:p>
     <w:p>
@@ -23966,8 +24134,8 @@
       <w:r>
         <w:drawing>
           <wp:inline distT="0" distB="0" distL="0" distR="0">
-            <wp:extent cx="5400000" cy="2227500"/>
-            <wp:docPr id="15" name="Graphique 15"/>
+            <wp:extent cx="5400000" cy="2784375"/>
+            <wp:docPr id="18" name="Graphique 18"/>
             <wp:cNvGraphicFramePr>
               <a:graphicFrameLocks xmlns:a="http://schemas.openxmlformats.org/drawingml/2006/main" noChangeAspect="1"/>
             </wp:cNvGraphicFramePr>
@@ -23975,11 +24143,11 @@
               <a:graphicData uri="http://schemas.openxmlformats.org/drawingml/2006/picture">
                 <pic:pic xmlns:pic="http://schemas.openxmlformats.org/drawingml/2006/picture">
                   <pic:nvPicPr>
-                    <pic:cNvPr id="15" name="graphique15.png"/>
+                    <pic:cNvPr id="18" name="graphique18.png"/>
                     <pic:cNvPicPr/>
                   </pic:nvPicPr>
                   <pic:blipFill>
-                    <a:blip r:embed="rIdImg15"/>
+                    <a:blip r:embed="rIdImg18"/>
                     <a:stretch>
                       <a:fillRect/>
                     </a:stretch>
@@ -23987,7 +24155,7 @@
                   <pic:spPr>
                     <a:xfrm>
                       <a:off x="0" y="0"/>
-                      <a:ext cx="5400000" cy="2227500"/>
+                      <a:ext cx="5400000" cy="2784375"/>
                     </a:xfrm>
                     <a:prstGeom prst="rect">
                       <a:avLst/>
@@ -24011,7 +24179,7 @@
           <w:sz w:val="17"/>
           <w:szCs w:val="17"/>
         </w:rPr>
-        <w:t xml:space="preserve">Figure 15 – Défauts de crédits absorbables par exercice</w:t>
+        <w:t xml:space="preserve">Figure 18 – Défauts de crédits absorbables par exercice</w:t>
       </w:r>
     </w:p>
     <w:p>
@@ -24893,8 +25061,8 @@
       <w:r>
         <w:drawing>
           <wp:inline distT="0" distB="0" distL="0" distR="0">
-            <wp:extent cx="5400000" cy="2227500"/>
-            <wp:docPr id="16" name="Graphique 16"/>
+            <wp:extent cx="5400000" cy="2784375"/>
+            <wp:docPr id="19" name="Graphique 19"/>
             <wp:cNvGraphicFramePr>
               <a:graphicFrameLocks xmlns:a="http://schemas.openxmlformats.org/drawingml/2006/main" noChangeAspect="1"/>
             </wp:cNvGraphicFramePr>
@@ -24902,11 +25070,11 @@
               <a:graphicData uri="http://schemas.openxmlformats.org/drawingml/2006/picture">
                 <pic:pic xmlns:pic="http://schemas.openxmlformats.org/drawingml/2006/picture">
                   <pic:nvPicPr>
-                    <pic:cNvPr id="16" name="graphique16.png"/>
+                    <pic:cNvPr id="19" name="graphique19.png"/>
                     <pic:cNvPicPr/>
                   </pic:nvPicPr>
                   <pic:blipFill>
-                    <a:blip r:embed="rIdImg16"/>
+                    <a:blip r:embed="rIdImg19"/>
                     <a:stretch>
                       <a:fillRect/>
                     </a:stretch>
@@ -24914,7 +25082,7 @@
                   <pic:spPr>
                     <a:xfrm>
                       <a:off x="0" y="0"/>
-                      <a:ext cx="5400000" cy="2227500"/>
+                      <a:ext cx="5400000" cy="2784375"/>
                     </a:xfrm>
                     <a:prstGeom prst="rect">
                       <a:avLst/>
@@ -24938,7 +25106,7 @@
           <w:sz w:val="17"/>
           <w:szCs w:val="17"/>
         </w:rPr>
-        <w:t xml:space="preserve">Figure 16 – Perte avant passage sous le seuil de solvabilité par exercice</w:t>
+        <w:t xml:space="preserve">Figure 19 – Perte avant passage sous le seuil de solvabilité par exercice</w:t>
       </w:r>
     </w:p>
     <w:p>
@@ -26875,8 +27043,8 @@
       <w:r>
         <w:drawing>
           <wp:inline distT="0" distB="0" distL="0" distR="0">
-            <wp:extent cx="5400000" cy="2227500"/>
-            <wp:docPr id="17" name="Graphique 17"/>
+            <wp:extent cx="5400000" cy="2784375"/>
+            <wp:docPr id="20" name="Graphique 20"/>
             <wp:cNvGraphicFramePr>
               <a:graphicFrameLocks xmlns:a="http://schemas.openxmlformats.org/drawingml/2006/main" noChangeAspect="1"/>
             </wp:cNvGraphicFramePr>
@@ -26884,11 +27052,11 @@
               <a:graphicData uri="http://schemas.openxmlformats.org/drawingml/2006/picture">
                 <pic:pic xmlns:pic="http://schemas.openxmlformats.org/drawingml/2006/picture">
                   <pic:nvPicPr>
-                    <pic:cNvPr id="17" name="graphique17.png"/>
+                    <pic:cNvPr id="20" name="graphique20.png"/>
                     <pic:cNvPicPr/>
                   </pic:nvPicPr>
                   <pic:blipFill>
-                    <a:blip r:embed="rIdImg17"/>
+                    <a:blip r:embed="rIdImg20"/>
                     <a:stretch>
                       <a:fillRect/>
                     </a:stretch>
@@ -26896,7 +27064,7 @@
                   <pic:spPr>
                     <a:xfrm>
                       <a:off x="0" y="0"/>
-                      <a:ext cx="5400000" cy="2227500"/>
+                      <a:ext cx="5400000" cy="2784375"/>
                     </a:xfrm>
                     <a:prstGeom prst="rect">
                       <a:avLst/>
@@ -26920,7 +27088,7 @@
           <w:sz w:val="17"/>
           <w:szCs w:val="17"/>
         </w:rPr>
-        <w:t xml:space="preserve">Figure 17 – Ratio de solvabilité global par exercice</w:t>
+        <w:t xml:space="preserve">Figure 20 – Ratio de solvabilité global par exercice</w:t>
       </w:r>
     </w:p>
     <w:p>
@@ -27514,8 +27682,8 @@
       <w:r>
         <w:drawing>
           <wp:inline distT="0" distB="0" distL="0" distR="0">
-            <wp:extent cx="5400000" cy="2227500"/>
-            <wp:docPr id="18" name="Graphique 18"/>
+            <wp:extent cx="5400000" cy="2784375"/>
+            <wp:docPr id="21" name="Graphique 21"/>
             <wp:cNvGraphicFramePr>
               <a:graphicFrameLocks xmlns:a="http://schemas.openxmlformats.org/drawingml/2006/main" noChangeAspect="1"/>
             </wp:cNvGraphicFramePr>
@@ -27523,11 +27691,11 @@
               <a:graphicData uri="http://schemas.openxmlformats.org/drawingml/2006/picture">
                 <pic:pic xmlns:pic="http://schemas.openxmlformats.org/drawingml/2006/picture">
                   <pic:nvPicPr>
-                    <pic:cNvPr id="18" name="graphique18.png"/>
+                    <pic:cNvPr id="21" name="graphique21.png"/>
                     <pic:cNvPicPr/>
                   </pic:nvPicPr>
                   <pic:blipFill>
-                    <a:blip r:embed="rIdImg18"/>
+                    <a:blip r:embed="rIdImg21"/>
                     <a:stretch>
                       <a:fillRect/>
                     </a:stretch>
@@ -27535,7 +27703,7 @@
                   <pic:spPr>
                     <a:xfrm>
                       <a:off x="0" y="0"/>
-                      <a:ext cx="5400000" cy="2227500"/>
+                      <a:ext cx="5400000" cy="2784375"/>
                     </a:xfrm>
                     <a:prstGeom prst="rect">
                       <a:avLst/>
@@ -27559,7 +27727,7 @@
           <w:sz w:val="17"/>
           <w:szCs w:val="17"/>
         </w:rPr>
-        <w:t xml:space="preserve">Figure 18 – Ratio CET1 par exercice</w:t>
+        <w:t xml:space="preserve">Figure 21 – Ratio CET1 par exercice</w:t>
       </w:r>
     </w:p>
     <w:p>
@@ -28153,8 +28321,8 @@
       <w:r>
         <w:drawing>
           <wp:inline distT="0" distB="0" distL="0" distR="0">
-            <wp:extent cx="5400000" cy="2227500"/>
-            <wp:docPr id="19" name="Graphique 19"/>
+            <wp:extent cx="5400000" cy="2784375"/>
+            <wp:docPr id="22" name="Graphique 22"/>
             <wp:cNvGraphicFramePr>
               <a:graphicFrameLocks xmlns:a="http://schemas.openxmlformats.org/drawingml/2006/main" noChangeAspect="1"/>
             </wp:cNvGraphicFramePr>
@@ -28162,11 +28330,11 @@
               <a:graphicData uri="http://schemas.openxmlformats.org/drawingml/2006/picture">
                 <pic:pic xmlns:pic="http://schemas.openxmlformats.org/drawingml/2006/picture">
                   <pic:nvPicPr>
-                    <pic:cNvPr id="19" name="graphique19.png"/>
+                    <pic:cNvPr id="22" name="graphique22.png"/>
                     <pic:cNvPicPr/>
                   </pic:nvPicPr>
                   <pic:blipFill>
-                    <a:blip r:embed="rIdImg19"/>
+                    <a:blip r:embed="rIdImg22"/>
                     <a:stretch>
                       <a:fillRect/>
                     </a:stretch>
@@ -28174,7 +28342,7 @@
                   <pic:spPr>
                     <a:xfrm>
                       <a:off x="0" y="0"/>
-                      <a:ext cx="5400000" cy="2227500"/>
+                      <a:ext cx="5400000" cy="2784375"/>
                     </a:xfrm>
                     <a:prstGeom prst="rect">
                       <a:avLst/>
@@ -28198,7 +28366,7 @@
           <w:sz w:val="17"/>
           <w:szCs w:val="17"/>
         </w:rPr>
-        <w:t xml:space="preserve">Figure 19 – Ratio de levier Bâle III par exercice</w:t>
+        <w:t xml:space="preserve">Figure 22 – Ratio de levier Bâle III par exercice</w:t>
       </w:r>
     </w:p>
     <w:p>

</xml_diff>